<commit_message>
Documentación: agrega capturas reales del sistema
Co-Authored-By: Claude Sonnet 5.5 <noreply@anthropic.com>
Claude-Session: https://claude.ai/code/session_01RcPjtfzT8BCifCewpErVnb
</commit_message>
<xml_diff>
--- a/Documentacion/Documentacion.docx
+++ b/Documentacion/Documentacion.docx
@@ -288,6 +288,25 @@
         </w:rPr>
         <w:tab/>
         <w:t>12</w:t>
+      </w:r>
+    </w:p>
+    <w:p>
+      <w:pPr>
+        <w:pStyle w:val="IndicePlaceholder"/>
+        <w:tabs>
+          <w:tab w:pos="8784" w:val="right" w:leader="dot"/>
+        </w:tabs>
+        <w:spacing w:after="160"/>
+      </w:pPr>
+      <w:r>
+        <w:t>10. Capturas del sistema</w:t>
+      </w:r>
+      <w:r>
+        <w:rPr>
+          <w:sz w:val="24"/>
+        </w:rPr>
+        <w:tab/>
+        <w:t>13</w:t>
       </w:r>
     </w:p>
     <w:p>
@@ -11772,6 +11791,199 @@
       </w:r>
       <w:r>
         <w:t xml:space="preserve">Usuarios (crear personal y asignar rol), Roles y permisos, Bitácora y todos los módulos.</w:t>
+      </w:r>
+    </w:p>
+    <w:p>
+      <w:pPr>
+        <w:pStyle w:val="Heading1"/>
+      </w:pPr>
+      <w:r>
+        <w:t xml:space="preserve">10. Capturas del sistema</w:t>
+      </w:r>
+    </w:p>
+    <w:p>
+      <w:pPr>
+        <w:pStyle w:val="FirstParagraph"/>
+      </w:pPr>
+      <w:r>
+        <w:rPr>
+          <w:b/>
+          <w:bCs/>
+        </w:rPr>
+        <w:t xml:space="preserve">Roles y permisos (rol Administrador).</w:t>
+      </w:r>
+      <w:r>
+        <w:t xml:space="preserve"> </w:t>
+      </w:r>
+      <w:r>
+        <w:t xml:space="preserve">Desde esta pantalla el administrador asigna los permisos a cada rol; los cambios se guardan en las tablas</w:t>
+      </w:r>
+      <w:r>
+        <w:t xml:space="preserve"> </w:t>
+      </w:r>
+      <w:r>
+        <w:rPr>
+          <w:rStyle w:val="VerbatimChar"/>
+        </w:rPr>
+        <w:t xml:space="preserve">rol</w:t>
+      </w:r>
+      <w:r>
+        <w:t xml:space="preserve">,</w:t>
+      </w:r>
+      <w:r>
+        <w:t xml:space="preserve"> </w:t>
+      </w:r>
+      <w:r>
+        <w:rPr>
+          <w:rStyle w:val="VerbatimChar"/>
+        </w:rPr>
+        <w:t xml:space="preserve">permiso</w:t>
+      </w:r>
+      <w:r>
+        <w:t xml:space="preserve"> </w:t>
+      </w:r>
+      <w:r>
+        <w:t xml:space="preserve">y</w:t>
+      </w:r>
+      <w:r>
+        <w:t xml:space="preserve"> </w:t>
+      </w:r>
+      <w:r>
+        <w:rPr>
+          <w:rStyle w:val="VerbatimChar"/>
+        </w:rPr>
+        <w:t xml:space="preserve">rolPermiso</w:t>
+      </w:r>
+      <w:r>
+        <w:t xml:space="preserve">.</w:t>
+      </w:r>
+    </w:p>
+    <w:p>
+      <w:pPr>
+        <w:pStyle w:val="CaptionedFigure"/>
+      </w:pPr>
+      <w:r>
+        <w:drawing>
+          <wp:inline>
+            <wp:extent cx="5334000" cy="3619767"/>
+            <wp:effectExtent b="0" l="0" r="0" t="0"/>
+            <wp:docPr descr="Pantalla de roles y permisos" title="" id="19" name="Picture"/>
+            <a:graphic>
+              <a:graphicData uri="http://schemas.openxmlformats.org/drawingml/2006/picture">
+                <pic:pic>
+                  <pic:nvPicPr>
+                    <pic:cNvPr descr="capturas/roles_y_permisos.png" id="20" name="Picture"/>
+                    <pic:cNvPicPr>
+                      <a:picLocks noChangeArrowheads="1" noChangeAspect="1"/>
+                    </pic:cNvPicPr>
+                  </pic:nvPicPr>
+                  <pic:blipFill>
+                    <a:blip r:embed="rId18"/>
+                    <a:stretch>
+                      <a:fillRect/>
+                    </a:stretch>
+                  </pic:blipFill>
+                  <pic:spPr bwMode="auto">
+                    <a:xfrm>
+                      <a:off x="0" y="0"/>
+                      <a:ext cx="5334000" cy="3619767"/>
+                    </a:xfrm>
+                    <a:prstGeom prst="rect">
+                      <a:avLst/>
+                    </a:prstGeom>
+                    <a:noFill/>
+                    <a:ln w="9525">
+                      <a:noFill/>
+                      <a:headEnd/>
+                      <a:tailEnd/>
+                    </a:ln>
+                  </pic:spPr>
+                </pic:pic>
+              </a:graphicData>
+            </a:graphic>
+          </wp:inline>
+        </w:drawing>
+      </w:r>
+    </w:p>
+    <w:p>
+      <w:pPr>
+        <w:pStyle w:val="ImageCaption"/>
+      </w:pPr>
+      <w:r>
+        <w:t xml:space="preserve">Pantalla de roles y permisos</w:t>
+      </w:r>
+    </w:p>
+    <w:p>
+      <w:pPr>
+        <w:pStyle w:val="BodyText"/>
+      </w:pPr>
+      <w:r>
+        <w:rPr>
+          <w:b/>
+          <w:bCs/>
+        </w:rPr>
+        <w:t xml:space="preserve">Control de permisos por rol (usuario Veterinario).</w:t>
+      </w:r>
+      <w:r>
+        <w:t xml:space="preserve"> </w:t>
+      </w:r>
+      <w:r>
+        <w:t xml:space="preserve">El menú solo muestra los módulos permitidos y, en Mascotas, el veterinario tiene permiso de consulta pero no de gestión, por lo que el formulario y los botones aparecen deshabilitados.</w:t>
+      </w:r>
+    </w:p>
+    <w:p>
+      <w:pPr>
+        <w:pStyle w:val="CaptionedFigure"/>
+      </w:pPr>
+      <w:r>
+        <w:drawing>
+          <wp:inline>
+            <wp:extent cx="5334000" cy="1479550"/>
+            <wp:effectExtent b="0" l="0" r="0" t="0"/>
+            <wp:docPr descr="Mascotas con el rol Veterinario (solo lectura)" title="" id="22" name="Picture"/>
+            <a:graphic>
+              <a:graphicData uri="http://schemas.openxmlformats.org/drawingml/2006/picture">
+                <pic:pic>
+                  <pic:nvPicPr>
+                    <pic:cNvPr descr="capturas/mascotas_veterinario.png" id="23" name="Picture"/>
+                    <pic:cNvPicPr>
+                      <a:picLocks noChangeArrowheads="1" noChangeAspect="1"/>
+                    </pic:cNvPicPr>
+                  </pic:nvPicPr>
+                  <pic:blipFill>
+                    <a:blip r:embed="rId21"/>
+                    <a:stretch>
+                      <a:fillRect/>
+                    </a:stretch>
+                  </pic:blipFill>
+                  <pic:spPr bwMode="auto">
+                    <a:xfrm>
+                      <a:off x="0" y="0"/>
+                      <a:ext cx="5334000" cy="1479550"/>
+                    </a:xfrm>
+                    <a:prstGeom prst="rect">
+                      <a:avLst/>
+                    </a:prstGeom>
+                    <a:noFill/>
+                    <a:ln w="9525">
+                      <a:noFill/>
+                      <a:headEnd/>
+                      <a:tailEnd/>
+                    </a:ln>
+                  </pic:spPr>
+                </pic:pic>
+              </a:graphicData>
+            </a:graphic>
+          </wp:inline>
+        </w:drawing>
+      </w:r>
+    </w:p>
+    <w:p>
+      <w:pPr>
+        <w:pStyle w:val="ImageCaption"/>
+      </w:pPr>
+      <w:r>
+        <w:t xml:space="preserve">Mascotas con el rol Veterinario (solo lectura)</w:t>
       </w:r>
     </w:p>
     <w:sectPr>

</xml_diff>

<commit_message>
Documentación: capturas integradas en sus secciones (seguridad y manual de uso)
Co-Authored-By: Claude Sonnet 5.5 <noreply@anthropic.com>
Claude-Session: https://claude.ai/code/session_01RcPjtfzT8BCifCewpErVnb
</commit_message>
<xml_diff>
--- a/Documentacion/Documentacion.docx
+++ b/Documentacion/Documentacion.docx
@@ -268,7 +268,7 @@
           <w:sz w:val="24"/>
         </w:rPr>
         <w:tab/>
-        <w:t>12</w:t>
+        <w:t>13</w:t>
       </w:r>
     </w:p>
     <w:p>
@@ -281,25 +281,6 @@
       </w:pPr>
       <w:r>
         <w:t>9. Manual rápido de uso</w:t>
-      </w:r>
-      <w:r>
-        <w:rPr>
-          <w:sz w:val="24"/>
-        </w:rPr>
-        <w:tab/>
-        <w:t>12</w:t>
-      </w:r>
-    </w:p>
-    <w:p>
-      <w:pPr>
-        <w:pStyle w:val="IndicePlaceholder"/>
-        <w:tabs>
-          <w:tab w:pos="8784" w:val="right" w:leader="dot"/>
-        </w:tabs>
-        <w:spacing w:after="160"/>
-      </w:pPr>
-      <w:r>
-        <w:t>10. Capturas del sistema</w:t>
       </w:r>
       <w:r>
         <w:rPr>
@@ -10652,1153 +10633,10 @@
     </w:p>
     <w:p>
       <w:pPr>
-        <w:pStyle w:val="Heading1"/>
+        <w:pStyle w:val="Heading2"/>
       </w:pPr>
       <w:r>
-        <w:t xml:space="preserve">8. Cumplimiento de la rúbrica</w:t>
-      </w:r>
-    </w:p>
-    <w:tbl>
-      <w:tblPr>
-        <w:tblStyle w:val="Table"/>
-        <w:tblW w:type="pct" w:w="5000"/>
-        <w:tblLayout w:type="fixed"/>
-        <w:tblLook w:firstRow="1" w:lastRow="0" w:firstColumn="0" w:lastColumn="0" w:noHBand="0" w:noVBand="0" w:val="0020"/>
-        <w:tblBorders>
-          <w:top w:val="single" w:sz="4" w:space="0" w:color="CBD5E1"/>
-          <w:left w:val="single" w:sz="4" w:space="0" w:color="CBD5E1"/>
-          <w:bottom w:val="single" w:sz="4" w:space="0" w:color="CBD5E1"/>
-          <w:right w:val="single" w:sz="4" w:space="0" w:color="CBD5E1"/>
-          <w:insideH w:val="single" w:sz="4" w:space="0" w:color="CBD5E1"/>
-          <w:insideV w:val="single" w:sz="4" w:space="0" w:color="CBD5E1"/>
-        </w:tblBorders>
-        <w:tblCellMar>
-          <w:top w:w="50" w:type="dxa"/>
-          <w:left w:w="100" w:type="dxa"/>
-          <w:bottom w:w="50" w:type="dxa"/>
-          <w:right w:w="100" w:type="dxa"/>
-        </w:tblCellMar>
-      </w:tblPr>
-      <w:tblGrid>
-        <w:gridCol w:w="792"/>
-        <w:gridCol w:w="2640"/>
-        <w:gridCol w:w="4488"/>
-      </w:tblGrid>
-      <w:tr>
-        <w:trPr>
-          <w:tblHeader w:val="on"/>
-        </w:trPr>
-        <w:tc>
-          <w:tcPr>
-            <w:shd w:val="clear" w:color="auto" w:fill="0F766E"/>
-          </w:tcPr>
-          <w:p>
-            <w:pPr>
-              <w:pStyle w:val="Compact"/>
-              <w:spacing w:after="0" w:before="0"/>
-            </w:pPr>
-            <w:r>
-              <w:rPr>
-                <w:b/>
-                <w:color w:val="FFFFFF"/>
-                <w:sz w:val="19"/>
-              </w:rPr>
-              <w:t xml:space="preserve">#</w:t>
-            </w:r>
-          </w:p>
-        </w:tc>
-        <w:tc>
-          <w:tcPr>
-            <w:shd w:val="clear" w:color="auto" w:fill="0F766E"/>
-          </w:tcPr>
-          <w:p>
-            <w:pPr>
-              <w:pStyle w:val="Compact"/>
-              <w:spacing w:after="0" w:before="0"/>
-            </w:pPr>
-            <w:r>
-              <w:rPr>
-                <w:b/>
-                <w:color w:val="FFFFFF"/>
-                <w:sz w:val="19"/>
-              </w:rPr>
-              <w:t xml:space="preserve">Criterio</w:t>
-            </w:r>
-          </w:p>
-        </w:tc>
-        <w:tc>
-          <w:tcPr>
-            <w:shd w:val="clear" w:color="auto" w:fill="0F766E"/>
-          </w:tcPr>
-          <w:p>
-            <w:pPr>
-              <w:pStyle w:val="Compact"/>
-              <w:spacing w:after="0" w:before="0"/>
-            </w:pPr>
-            <w:r>
-              <w:rPr>
-                <w:b/>
-                <w:color w:val="FFFFFF"/>
-                <w:sz w:val="19"/>
-              </w:rPr>
-              <w:t xml:space="preserve">Dónde se cumple</w:t>
-            </w:r>
-          </w:p>
-        </w:tc>
-      </w:tr>
-      <w:tr>
-        <w:tc>
-          <w:tcPr/>
-          <w:p>
-            <w:pPr>
-              <w:pStyle w:val="Compact"/>
-              <w:spacing w:after="0" w:before="0"/>
-            </w:pPr>
-            <w:r>
-              <w:rPr>
-                <w:sz w:val="19"/>
-              </w:rPr>
-              <w:t xml:space="preserve">1</w:t>
-            </w:r>
-          </w:p>
-        </w:tc>
-        <w:tc>
-          <w:tcPr/>
-          <w:p>
-            <w:pPr>
-              <w:pStyle w:val="Compact"/>
-              <w:spacing w:after="0" w:before="0"/>
-            </w:pPr>
-            <w:r>
-              <w:rPr>
-                <w:sz w:val="19"/>
-              </w:rPr>
-              <w:t xml:space="preserve">Arquitectura MV</w:t>
-            </w:r>
-          </w:p>
-        </w:tc>
-        <w:tc>
-          <w:tcPr/>
-          <w:p>
-            <w:pPr>
-              <w:pStyle w:val="Compact"/>
-              <w:spacing w:after="0" w:before="0"/>
-            </w:pPr>
-            <w:r>
-              <w:rPr>
-                <w:sz w:val="19"/>
-              </w:rPr>
-              <w:t xml:space="preserve">Proyectos</w:t>
-            </w:r>
-            <w:r>
-              <w:rPr>
-                <w:sz w:val="19"/>
-              </w:rPr>
-              <w:t xml:space="preserve"> </w:t>
-            </w:r>
-            <w:r>
-              <w:rPr>
-                <w:rStyle w:val="VerbatimChar"/>
-                <w:sz w:val="19"/>
-              </w:rPr>
-              <w:t xml:space="preserve">Modelos</w:t>
-            </w:r>
-            <w:r>
-              <w:rPr>
-                <w:sz w:val="19"/>
-              </w:rPr>
-              <w:t xml:space="preserve"> </w:t>
-            </w:r>
-            <w:r>
-              <w:rPr>
-                <w:sz w:val="19"/>
-              </w:rPr>
-              <w:t xml:space="preserve">y</w:t>
-            </w:r>
-            <w:r>
-              <w:rPr>
-                <w:sz w:val="19"/>
-              </w:rPr>
-              <w:t xml:space="preserve"> </w:t>
-            </w:r>
-            <w:r>
-              <w:rPr>
-                <w:rStyle w:val="VerbatimChar"/>
-                <w:sz w:val="19"/>
-              </w:rPr>
-              <w:t xml:space="preserve">Vista</w:t>
-            </w:r>
-            <w:r>
-              <w:rPr>
-                <w:sz w:val="19"/>
-              </w:rPr>
-              <w:t xml:space="preserve">; la Vista solo invoca clases de</w:t>
-            </w:r>
-            <w:r>
-              <w:rPr>
-                <w:sz w:val="19"/>
-              </w:rPr>
-              <w:t xml:space="preserve"> </w:t>
-            </w:r>
-            <w:r>
-              <w:rPr>
-                <w:rStyle w:val="VerbatimChar"/>
-                <w:sz w:val="19"/>
-              </w:rPr>
-              <w:t xml:space="preserve">Modelos.Datos</w:t>
-            </w:r>
-          </w:p>
-        </w:tc>
-      </w:tr>
-      <w:tr>
-        <w:tc>
-          <w:tcPr>
-            <w:shd w:val="clear" w:color="auto" w:fill="F1F5F9"/>
-          </w:tcPr>
-          <w:p>
-            <w:pPr>
-              <w:pStyle w:val="Compact"/>
-              <w:spacing w:after="0" w:before="0"/>
-            </w:pPr>
-            <w:r>
-              <w:rPr>
-                <w:sz w:val="19"/>
-              </w:rPr>
-              <w:t xml:space="preserve">2</w:t>
-            </w:r>
-          </w:p>
-        </w:tc>
-        <w:tc>
-          <w:tcPr>
-            <w:shd w:val="clear" w:color="auto" w:fill="F1F5F9"/>
-          </w:tcPr>
-          <w:p>
-            <w:pPr>
-              <w:pStyle w:val="Compact"/>
-              <w:spacing w:after="0" w:before="0"/>
-            </w:pPr>
-            <w:r>
-              <w:rPr>
-                <w:sz w:val="19"/>
-              </w:rPr>
-              <w:t xml:space="preserve">Estructura de carpetas</w:t>
-            </w:r>
-          </w:p>
-        </w:tc>
-        <w:tc>
-          <w:tcPr>
-            <w:shd w:val="clear" w:color="auto" w:fill="F1F5F9"/>
-          </w:tcPr>
-          <w:p>
-            <w:pPr>
-              <w:pStyle w:val="Compact"/>
-              <w:spacing w:after="0" w:before="0"/>
-            </w:pPr>
-            <w:r>
-              <w:rPr>
-                <w:sz w:val="19"/>
-              </w:rPr>
-              <w:t xml:space="preserve">Capas por proyecto y carpetas por funcionalidad (ver sección 3)</w:t>
-            </w:r>
-          </w:p>
-        </w:tc>
-      </w:tr>
-      <w:tr>
-        <w:tc>
-          <w:tcPr/>
-          <w:p>
-            <w:pPr>
-              <w:pStyle w:val="Compact"/>
-              <w:spacing w:after="0" w:before="0"/>
-            </w:pPr>
-            <w:r>
-              <w:rPr>
-                <w:sz w:val="19"/>
-              </w:rPr>
-              <w:t xml:space="preserve">3</w:t>
-            </w:r>
-          </w:p>
-        </w:tc>
-        <w:tc>
-          <w:tcPr/>
-          <w:p>
-            <w:pPr>
-              <w:pStyle w:val="Compact"/>
-              <w:spacing w:after="0" w:before="0"/>
-            </w:pPr>
-            <w:r>
-              <w:rPr>
-                <w:sz w:val="19"/>
-              </w:rPr>
-              <w:t xml:space="preserve">Login con BCrypt</w:t>
-            </w:r>
-          </w:p>
-        </w:tc>
-        <w:tc>
-          <w:tcPr/>
-          <w:p>
-            <w:pPr>
-              <w:pStyle w:val="Compact"/>
-              <w:spacing w:after="0" w:before="0"/>
-            </w:pPr>
-            <w:r>
-              <w:rPr>
-                <w:rStyle w:val="VerbatimChar"/>
-                <w:sz w:val="19"/>
-              </w:rPr>
-              <w:t xml:space="preserve">Vista/Login/frmLogin.cs</w:t>
-            </w:r>
-            <w:r>
-              <w:rPr>
-                <w:sz w:val="19"/>
-              </w:rPr>
-              <w:t xml:space="preserve">,</w:t>
-            </w:r>
-            <w:r>
-              <w:rPr>
-                <w:sz w:val="19"/>
-              </w:rPr>
-              <w:t xml:space="preserve"> </w:t>
-            </w:r>
-            <w:r>
-              <w:rPr>
-                <w:rStyle w:val="VerbatimChar"/>
-                <w:sz w:val="19"/>
-              </w:rPr>
-              <w:t xml:space="preserve">UsuarioDatos.Autenticar</w:t>
-            </w:r>
-            <w:r>
-              <w:rPr>
-                <w:sz w:val="19"/>
-              </w:rPr>
-              <w:t xml:space="preserve">,</w:t>
-            </w:r>
-            <w:r>
-              <w:rPr>
-                <w:sz w:val="19"/>
-              </w:rPr>
-              <w:t xml:space="preserve"> </w:t>
-            </w:r>
-            <w:r>
-              <w:rPr>
-                <w:rStyle w:val="VerbatimChar"/>
-                <w:sz w:val="19"/>
-              </w:rPr>
-              <w:t xml:space="preserve">EncriptadorContrasena</w:t>
-            </w:r>
-          </w:p>
-        </w:tc>
-      </w:tr>
-      <w:tr>
-        <w:tc>
-          <w:tcPr>
-            <w:shd w:val="clear" w:color="auto" w:fill="F1F5F9"/>
-          </w:tcPr>
-          <w:p>
-            <w:pPr>
-              <w:pStyle w:val="Compact"/>
-              <w:spacing w:after="0" w:before="0"/>
-            </w:pPr>
-            <w:r>
-              <w:rPr>
-                <w:sz w:val="19"/>
-              </w:rPr>
-              <w:t xml:space="preserve">4</w:t>
-            </w:r>
-          </w:p>
-        </w:tc>
-        <w:tc>
-          <w:tcPr>
-            <w:shd w:val="clear" w:color="auto" w:fill="F1F5F9"/>
-          </w:tcPr>
-          <w:p>
-            <w:pPr>
-              <w:pStyle w:val="Compact"/>
-              <w:spacing w:after="0" w:before="0"/>
-            </w:pPr>
-            <w:r>
-              <w:rPr>
-                <w:sz w:val="19"/>
-              </w:rPr>
-              <w:t xml:space="preserve">Gestión de usuarios</w:t>
-            </w:r>
-          </w:p>
-        </w:tc>
-        <w:tc>
-          <w:tcPr>
-            <w:shd w:val="clear" w:color="auto" w:fill="F1F5F9"/>
-          </w:tcPr>
-          <w:p>
-            <w:pPr>
-              <w:pStyle w:val="Compact"/>
-              <w:spacing w:after="0" w:before="0"/>
-            </w:pPr>
-            <w:r>
-              <w:rPr>
-                <w:rStyle w:val="VerbatimChar"/>
-                <w:sz w:val="19"/>
-              </w:rPr>
-              <w:t xml:space="preserve">Vista/Usuarios/frmUsuarios.cs</w:t>
-            </w:r>
-            <w:r>
-              <w:rPr>
-                <w:sz w:val="19"/>
-              </w:rPr>
-              <w:t xml:space="preserve"> </w:t>
-            </w:r>
-            <w:r>
-              <w:rPr>
-                <w:sz w:val="19"/>
-              </w:rPr>
-              <w:t xml:space="preserve">(CRUD + rol)</w:t>
-            </w:r>
-          </w:p>
-        </w:tc>
-      </w:tr>
-      <w:tr>
-        <w:tc>
-          <w:tcPr/>
-          <w:p>
-            <w:pPr>
-              <w:pStyle w:val="Compact"/>
-              <w:spacing w:after="0" w:before="0"/>
-            </w:pPr>
-            <w:r>
-              <w:rPr>
-                <w:sz w:val="19"/>
-              </w:rPr>
-              <w:t xml:space="preserve">5</w:t>
-            </w:r>
-          </w:p>
-        </w:tc>
-        <w:tc>
-          <w:tcPr/>
-          <w:p>
-            <w:pPr>
-              <w:pStyle w:val="Compact"/>
-              <w:spacing w:after="0" w:before="0"/>
-            </w:pPr>
-            <w:r>
-              <w:rPr>
-                <w:sz w:val="19"/>
-              </w:rPr>
-              <w:t xml:space="preserve">Roles y permisos</w:t>
-            </w:r>
-          </w:p>
-        </w:tc>
-        <w:tc>
-          <w:tcPr/>
-          <w:p>
-            <w:pPr>
-              <w:pStyle w:val="Compact"/>
-              <w:spacing w:after="0" w:before="0"/>
-            </w:pPr>
-            <w:r>
-              <w:rPr>
-                <w:sz w:val="19"/>
-              </w:rPr>
-              <w:t xml:space="preserve">Tablas</w:t>
-            </w:r>
-            <w:r>
-              <w:rPr>
-                <w:sz w:val="19"/>
-              </w:rPr>
-              <w:t xml:space="preserve"> </w:t>
-            </w:r>
-            <w:r>
-              <w:rPr>
-                <w:rStyle w:val="VerbatimChar"/>
-                <w:sz w:val="19"/>
-              </w:rPr>
-              <w:t xml:space="preserve">rol</w:t>
-            </w:r>
-            <w:r>
-              <w:rPr>
-                <w:sz w:val="19"/>
-              </w:rPr>
-              <w:t xml:space="preserve">/</w:t>
-            </w:r>
-            <w:r>
-              <w:rPr>
-                <w:rStyle w:val="VerbatimChar"/>
-                <w:sz w:val="19"/>
-              </w:rPr>
-              <w:t xml:space="preserve">permiso</w:t>
-            </w:r>
-            <w:r>
-              <w:rPr>
-                <w:sz w:val="19"/>
-              </w:rPr>
-              <w:t xml:space="preserve">/</w:t>
-            </w:r>
-            <w:r>
-              <w:rPr>
-                <w:rStyle w:val="VerbatimChar"/>
-                <w:sz w:val="19"/>
-              </w:rPr>
-              <w:t xml:space="preserve">rolPermiso</w:t>
-            </w:r>
-            <w:r>
-              <w:rPr>
-                <w:sz w:val="19"/>
-              </w:rPr>
-              <w:t xml:space="preserve">,</w:t>
-            </w:r>
-            <w:r>
-              <w:rPr>
-                <w:sz w:val="19"/>
-              </w:rPr>
-              <w:t xml:space="preserve"> </w:t>
-            </w:r>
-            <w:r>
-              <w:rPr>
-                <w:rStyle w:val="VerbatimChar"/>
-                <w:sz w:val="19"/>
-              </w:rPr>
-              <w:t xml:space="preserve">Sesion.Tiene</w:t>
-            </w:r>
-            <w:r>
-              <w:rPr>
-                <w:sz w:val="19"/>
-              </w:rPr>
-              <w:t xml:space="preserve">,</w:t>
-            </w:r>
-            <w:r>
-              <w:rPr>
-                <w:sz w:val="19"/>
-              </w:rPr>
-              <w:t xml:space="preserve"> </w:t>
-            </w:r>
-            <w:r>
-              <w:rPr>
-                <w:rStyle w:val="VerbatimChar"/>
-                <w:sz w:val="19"/>
-              </w:rPr>
-              <w:t xml:space="preserve">frmRoles</w:t>
-            </w:r>
-          </w:p>
-        </w:tc>
-      </w:tr>
-      <w:tr>
-        <w:tc>
-          <w:tcPr>
-            <w:shd w:val="clear" w:color="auto" w:fill="F1F5F9"/>
-          </w:tcPr>
-          <w:p>
-            <w:pPr>
-              <w:pStyle w:val="Compact"/>
-              <w:spacing w:after="0" w:before="0"/>
-            </w:pPr>
-            <w:r>
-              <w:rPr>
-                <w:sz w:val="19"/>
-              </w:rPr>
-              <w:t xml:space="preserve">6</w:t>
-            </w:r>
-          </w:p>
-        </w:tc>
-        <w:tc>
-          <w:tcPr>
-            <w:shd w:val="clear" w:color="auto" w:fill="F1F5F9"/>
-          </w:tcPr>
-          <w:p>
-            <w:pPr>
-              <w:pStyle w:val="Compact"/>
-              <w:spacing w:after="0" w:before="0"/>
-            </w:pPr>
-            <w:r>
-              <w:rPr>
-                <w:sz w:val="19"/>
-              </w:rPr>
-              <w:t xml:space="preserve">Seguridad</w:t>
-            </w:r>
-          </w:p>
-        </w:tc>
-        <w:tc>
-          <w:tcPr>
-            <w:shd w:val="clear" w:color="auto" w:fill="F1F5F9"/>
-          </w:tcPr>
-          <w:p>
-            <w:pPr>
-              <w:pStyle w:val="Compact"/>
-              <w:spacing w:after="0" w:before="0"/>
-            </w:pPr>
-            <w:r>
-              <w:rPr>
-                <w:sz w:val="19"/>
-              </w:rPr>
-              <w:t xml:space="preserve">Hash BCrypt, consultas parametrizadas, reglas anti-bloqueo</w:t>
-            </w:r>
-          </w:p>
-        </w:tc>
-      </w:tr>
-      <w:tr>
-        <w:tc>
-          <w:tcPr/>
-          <w:p>
-            <w:pPr>
-              <w:pStyle w:val="Compact"/>
-              <w:spacing w:after="0" w:before="0"/>
-            </w:pPr>
-            <w:r>
-              <w:rPr>
-                <w:sz w:val="19"/>
-              </w:rPr>
-              <w:t xml:space="preserve">7</w:t>
-            </w:r>
-          </w:p>
-        </w:tc>
-        <w:tc>
-          <w:tcPr/>
-          <w:p>
-            <w:pPr>
-              <w:pStyle w:val="Compact"/>
-              <w:spacing w:after="0" w:before="0"/>
-            </w:pPr>
-            <w:r>
-              <w:rPr>
-                <w:sz w:val="19"/>
-              </w:rPr>
-              <w:t xml:space="preserve">Scripts de BD</w:t>
-            </w:r>
-          </w:p>
-        </w:tc>
-        <w:tc>
-          <w:tcPr/>
-          <w:p>
-            <w:pPr>
-              <w:pStyle w:val="Compact"/>
-              <w:spacing w:after="0" w:before="0"/>
-            </w:pPr>
-            <w:r>
-              <w:rPr>
-                <w:rStyle w:val="VerbatimChar"/>
-                <w:sz w:val="19"/>
-              </w:rPr>
-              <w:t xml:space="preserve">BaseDatos/Veterinaria.sql</w:t>
-            </w:r>
-            <w:r>
-              <w:rPr>
-                <w:sz w:val="19"/>
-              </w:rPr>
-              <w:t xml:space="preserve"> </w:t>
-            </w:r>
-            <w:r>
-              <w:rPr>
-                <w:sz w:val="19"/>
-              </w:rPr>
-              <w:t xml:space="preserve">(comentado, con usuarios, roles y permisos)</w:t>
-            </w:r>
-          </w:p>
-        </w:tc>
-      </w:tr>
-      <w:tr>
-        <w:tc>
-          <w:tcPr>
-            <w:shd w:val="clear" w:color="auto" w:fill="F1F5F9"/>
-          </w:tcPr>
-          <w:p>
-            <w:pPr>
-              <w:pStyle w:val="Compact"/>
-              <w:spacing w:after="0" w:before="0"/>
-            </w:pPr>
-            <w:r>
-              <w:rPr>
-                <w:sz w:val="19"/>
-              </w:rPr>
-              <w:t xml:space="preserve">8</w:t>
-            </w:r>
-          </w:p>
-        </w:tc>
-        <w:tc>
-          <w:tcPr>
-            <w:shd w:val="clear" w:color="auto" w:fill="F1F5F9"/>
-          </w:tcPr>
-          <w:p>
-            <w:pPr>
-              <w:pStyle w:val="Compact"/>
-              <w:spacing w:after="0" w:before="0"/>
-            </w:pPr>
-            <w:r>
-              <w:rPr>
-                <w:sz w:val="19"/>
-              </w:rPr>
-              <w:t xml:space="preserve">CRUD de todas las entidades</w:t>
-            </w:r>
-          </w:p>
-        </w:tc>
-        <w:tc>
-          <w:tcPr>
-            <w:shd w:val="clear" w:color="auto" w:fill="F1F5F9"/>
-          </w:tcPr>
-          <w:p>
-            <w:pPr>
-              <w:pStyle w:val="Compact"/>
-              <w:spacing w:after="0" w:before="0"/>
-            </w:pPr>
-            <w:r>
-              <w:rPr>
-                <w:sz w:val="19"/>
-              </w:rPr>
-              <w:t xml:space="preserve">Propietarios, Mascotas, Citas, Consultas, Vacunas, Aplicaciones, Usuarios</w:t>
-            </w:r>
-          </w:p>
-        </w:tc>
-      </w:tr>
-      <w:tr>
-        <w:tc>
-          <w:tcPr/>
-          <w:p>
-            <w:pPr>
-              <w:pStyle w:val="Compact"/>
-              <w:spacing w:after="0" w:before="0"/>
-            </w:pPr>
-            <w:r>
-              <w:rPr>
-                <w:sz w:val="19"/>
-              </w:rPr>
-              <w:t xml:space="preserve">9</w:t>
-            </w:r>
-          </w:p>
-        </w:tc>
-        <w:tc>
-          <w:tcPr/>
-          <w:p>
-            <w:pPr>
-              <w:pStyle w:val="Compact"/>
-              <w:spacing w:after="0" w:before="0"/>
-            </w:pPr>
-            <w:r>
-              <w:rPr>
-                <w:sz w:val="19"/>
-              </w:rPr>
-              <w:t xml:space="preserve">Excepciones</w:t>
-            </w:r>
-          </w:p>
-        </w:tc>
-        <w:tc>
-          <w:tcPr/>
-          <w:p>
-            <w:pPr>
-              <w:pStyle w:val="Compact"/>
-              <w:spacing w:after="0" w:before="0"/>
-            </w:pPr>
-            <w:r>
-              <w:rPr>
-                <w:rStyle w:val="VerbatimChar"/>
-                <w:sz w:val="19"/>
-              </w:rPr>
-              <w:t xml:space="preserve">try/catch</w:t>
-            </w:r>
-            <w:r>
-              <w:rPr>
-                <w:sz w:val="19"/>
-              </w:rPr>
-              <w:t xml:space="preserve"> </w:t>
-            </w:r>
-            <w:r>
-              <w:rPr>
-                <w:sz w:val="19"/>
-              </w:rPr>
-              <w:t xml:space="preserve">+</w:t>
-            </w:r>
-            <w:r>
-              <w:rPr>
-                <w:sz w:val="19"/>
-              </w:rPr>
-              <w:t xml:space="preserve"> </w:t>
-            </w:r>
-            <w:r>
-              <w:rPr>
-                <w:rStyle w:val="VerbatimChar"/>
-                <w:sz w:val="19"/>
-              </w:rPr>
-              <w:t xml:space="preserve">MessageBox</w:t>
-            </w:r>
-            <w:r>
-              <w:rPr>
-                <w:sz w:val="19"/>
-              </w:rPr>
-              <w:t xml:space="preserve"> </w:t>
-            </w:r>
-            <w:r>
-              <w:rPr>
-                <w:sz w:val="19"/>
-              </w:rPr>
-              <w:t xml:space="preserve">+</w:t>
-            </w:r>
-            <w:r>
-              <w:rPr>
-                <w:sz w:val="19"/>
-              </w:rPr>
-              <w:t xml:space="preserve"> </w:t>
-            </w:r>
-            <w:r>
-              <w:rPr>
-                <w:rStyle w:val="VerbatimChar"/>
-                <w:sz w:val="19"/>
-              </w:rPr>
-              <w:t xml:space="preserve">Logger</w:t>
-            </w:r>
-          </w:p>
-        </w:tc>
-      </w:tr>
-      <w:tr>
-        <w:tc>
-          <w:tcPr>
-            <w:shd w:val="clear" w:color="auto" w:fill="F1F5F9"/>
-          </w:tcPr>
-          <w:p>
-            <w:pPr>
-              <w:pStyle w:val="Compact"/>
-              <w:spacing w:after="0" w:before="0"/>
-            </w:pPr>
-            <w:r>
-              <w:rPr>
-                <w:sz w:val="19"/>
-              </w:rPr>
-              <w:t xml:space="preserve">10</w:t>
-            </w:r>
-          </w:p>
-        </w:tc>
-        <w:tc>
-          <w:tcPr>
-            <w:shd w:val="clear" w:color="auto" w:fill="F1F5F9"/>
-          </w:tcPr>
-          <w:p>
-            <w:pPr>
-              <w:pStyle w:val="Compact"/>
-              <w:spacing w:after="0" w:before="0"/>
-            </w:pPr>
-            <w:r>
-              <w:rPr>
-                <w:sz w:val="19"/>
-              </w:rPr>
-              <w:t xml:space="preserve">Interfaz de usuario</w:t>
-            </w:r>
-          </w:p>
-        </w:tc>
-        <w:tc>
-          <w:tcPr>
-            <w:shd w:val="clear" w:color="auto" w:fill="F1F5F9"/>
-          </w:tcPr>
-          <w:p>
-            <w:pPr>
-              <w:pStyle w:val="Compact"/>
-              <w:spacing w:after="0" w:before="0"/>
-            </w:pPr>
-            <w:r>
-              <w:rPr>
-                <w:sz w:val="19"/>
-              </w:rPr>
-              <w:t xml:space="preserve">Formularios diseñados en el Designer con la misma estructura y colores; mensajes de validación claros</w:t>
-            </w:r>
-          </w:p>
-        </w:tc>
-      </w:tr>
-      <w:tr>
-        <w:tc>
-          <w:tcPr/>
-          <w:p>
-            <w:pPr>
-              <w:pStyle w:val="Compact"/>
-              <w:spacing w:after="0" w:before="0"/>
-            </w:pPr>
-            <w:r>
-              <w:rPr>
-                <w:sz w:val="19"/>
-              </w:rPr>
-              <w:t xml:space="preserve">11</w:t>
-            </w:r>
-          </w:p>
-        </w:tc>
-        <w:tc>
-          <w:tcPr/>
-          <w:p>
-            <w:pPr>
-              <w:pStyle w:val="Compact"/>
-              <w:spacing w:after="0" w:before="0"/>
-            </w:pPr>
-            <w:r>
-              <w:rPr>
-                <w:sz w:val="19"/>
-              </w:rPr>
-              <w:t xml:space="preserve">Conexión a BD</w:t>
-            </w:r>
-          </w:p>
-        </w:tc>
-        <w:tc>
-          <w:tcPr/>
-          <w:p>
-            <w:pPr>
-              <w:pStyle w:val="Compact"/>
-              <w:spacing w:after="0" w:before="0"/>
-            </w:pPr>
-            <w:r>
-              <w:rPr>
-                <w:rStyle w:val="VerbatimChar"/>
-                <w:sz w:val="19"/>
-              </w:rPr>
-              <w:t xml:space="preserve">Conexion_DB/Conexion.cs</w:t>
-            </w:r>
-            <w:r>
-              <w:rPr>
-                <w:sz w:val="19"/>
-              </w:rPr>
-              <w:t xml:space="preserve"> </w:t>
-            </w:r>
-            <w:r>
-              <w:rPr>
-                <w:sz w:val="19"/>
-              </w:rPr>
-              <w:t xml:space="preserve">(servidor y base configurables, conexiones con</w:t>
-            </w:r>
-            <w:r>
-              <w:rPr>
-                <w:sz w:val="19"/>
-              </w:rPr>
-              <w:t xml:space="preserve"> </w:t>
-            </w:r>
-            <w:r>
-              <w:rPr>
-                <w:rStyle w:val="VerbatimChar"/>
-                <w:sz w:val="19"/>
-              </w:rPr>
-              <w:t xml:space="preserve">using</w:t>
-            </w:r>
-            <w:r>
-              <w:rPr>
-                <w:sz w:val="19"/>
-              </w:rPr>
-              <w:t xml:space="preserve">, consultas con parámetros)</w:t>
-            </w:r>
-          </w:p>
-        </w:tc>
-      </w:tr>
-      <w:tr>
-        <w:tc>
-          <w:tcPr>
-            <w:shd w:val="clear" w:color="auto" w:fill="F1F5F9"/>
-          </w:tcPr>
-          <w:p>
-            <w:pPr>
-              <w:pStyle w:val="Compact"/>
-              <w:spacing w:after="0" w:before="0"/>
-            </w:pPr>
-            <w:r>
-              <w:rPr>
-                <w:sz w:val="19"/>
-              </w:rPr>
-              <w:t xml:space="preserve">12</w:t>
-            </w:r>
-          </w:p>
-        </w:tc>
-        <w:tc>
-          <w:tcPr>
-            <w:shd w:val="clear" w:color="auto" w:fill="F1F5F9"/>
-          </w:tcPr>
-          <w:p>
-            <w:pPr>
-              <w:pStyle w:val="Compact"/>
-              <w:spacing w:after="0" w:before="0"/>
-            </w:pPr>
-            <w:r>
-              <w:rPr>
-                <w:sz w:val="19"/>
-              </w:rPr>
-              <w:t xml:space="preserve">Documentación</w:t>
-            </w:r>
-          </w:p>
-        </w:tc>
-        <w:tc>
-          <w:tcPr>
-            <w:shd w:val="clear" w:color="auto" w:fill="F1F5F9"/>
-          </w:tcPr>
-          <w:p>
-            <w:pPr>
-              <w:pStyle w:val="Compact"/>
-              <w:spacing w:after="0" w:before="0"/>
-            </w:pPr>
-            <w:r>
-              <w:rPr>
-                <w:sz w:val="19"/>
-              </w:rPr>
-              <w:t xml:space="preserve">Este documento</w:t>
-            </w:r>
-          </w:p>
-        </w:tc>
-      </w:tr>
-    </w:tbl>
-    <w:p>
-      <w:pPr>
-        <w:pStyle w:val="Heading1"/>
-      </w:pPr>
-      <w:r>
-        <w:t xml:space="preserve">9. Manual rápido de uso</w:t>
-      </w:r>
-    </w:p>
-    <w:p>
-      <w:pPr>
-        <w:pStyle w:val="Compact"/>
-        <w:numPr>
-          <w:ilvl w:val="0"/>
-          <w:numId w:val="1004"/>
-        </w:numPr>
-      </w:pPr>
-      <w:r>
-        <w:t xml:space="preserve">Ejecutar</w:t>
-      </w:r>
-      <w:r>
-        <w:t xml:space="preserve"> </w:t>
-      </w:r>
-      <w:r>
-        <w:rPr>
-          <w:rStyle w:val="VerbatimChar"/>
-        </w:rPr>
-        <w:t xml:space="preserve">BaseDatos/Veterinaria.sql</w:t>
-      </w:r>
-      <w:r>
-        <w:t xml:space="preserve"> </w:t>
-      </w:r>
-      <w:r>
-        <w:t xml:space="preserve">y abrir</w:t>
-      </w:r>
-      <w:r>
-        <w:t xml:space="preserve"> </w:t>
-      </w:r>
-      <w:r>
-        <w:rPr>
-          <w:rStyle w:val="VerbatimChar"/>
-        </w:rPr>
-        <w:t xml:space="preserve">Veterinaria.sln</w:t>
-      </w:r>
-      <w:r>
-        <w:t xml:space="preserve">.</w:t>
-      </w:r>
-    </w:p>
-    <w:p>
-      <w:pPr>
-        <w:pStyle w:val="Compact"/>
-        <w:numPr>
-          <w:ilvl w:val="0"/>
-          <w:numId w:val="1004"/>
-        </w:numPr>
-      </w:pPr>
-      <w:r>
-        <w:t xml:space="preserve">Ingresar con</w:t>
-      </w:r>
-      <w:r>
-        <w:t xml:space="preserve"> </w:t>
-      </w:r>
-      <w:r>
-        <w:rPr>
-          <w:rStyle w:val="VerbatimChar"/>
-        </w:rPr>
-        <w:t xml:space="preserve">admin / Admin123*</w:t>
-      </w:r>
-      <w:r>
-        <w:t xml:space="preserve">,</w:t>
-      </w:r>
-      <w:r>
-        <w:t xml:space="preserve"> </w:t>
-      </w:r>
-      <w:r>
-        <w:rPr>
-          <w:rStyle w:val="VerbatimChar"/>
-        </w:rPr>
-        <w:t xml:space="preserve">dvera / Vet12345*</w:t>
-      </w:r>
-      <w:r>
-        <w:t xml:space="preserve"> </w:t>
-      </w:r>
-      <w:r>
-        <w:t xml:space="preserve">o</w:t>
-      </w:r>
-      <w:r>
-        <w:t xml:space="preserve"> </w:t>
-      </w:r>
-      <w:r>
-        <w:rPr>
-          <w:rStyle w:val="VerbatimChar"/>
-        </w:rPr>
-        <w:t xml:space="preserve">recep1 / Recep123*</w:t>
-      </w:r>
-      <w:r>
-        <w:t xml:space="preserve">.</w:t>
-      </w:r>
-    </w:p>
-    <w:p>
-      <w:pPr>
-        <w:pStyle w:val="Compact"/>
-        <w:numPr>
-          <w:ilvl w:val="0"/>
-          <w:numId w:val="1004"/>
-        </w:numPr>
-      </w:pPr>
-      <w:r>
-        <w:rPr>
-          <w:b/>
-          <w:bCs/>
-        </w:rPr>
-        <w:t xml:space="preserve">Recepcionista:</w:t>
-      </w:r>
-      <w:r>
-        <w:t xml:space="preserve"> </w:t>
-      </w:r>
-      <w:r>
-        <w:t xml:space="preserve">Propietarios → Mascotas → Citas.</w:t>
-      </w:r>
-    </w:p>
-    <w:p>
-      <w:pPr>
-        <w:pStyle w:val="Compact"/>
-        <w:numPr>
-          <w:ilvl w:val="0"/>
-          <w:numId w:val="1004"/>
-        </w:numPr>
-      </w:pPr>
-      <w:r>
-        <w:rPr>
-          <w:b/>
-          <w:bCs/>
-        </w:rPr>
-        <w:t xml:space="preserve">Veterinario:</w:t>
-      </w:r>
-      <w:r>
-        <w:t xml:space="preserve"> </w:t>
-      </w:r>
-      <w:r>
-        <w:t xml:space="preserve">Consultas médicas (historial) y Vacunas (aplicar y administrar catálogo).</w:t>
-      </w:r>
-    </w:p>
-    <w:p>
-      <w:pPr>
-        <w:pStyle w:val="Compact"/>
-        <w:numPr>
-          <w:ilvl w:val="0"/>
-          <w:numId w:val="1004"/>
-        </w:numPr>
-      </w:pPr>
-      <w:r>
-        <w:rPr>
-          <w:b/>
-          <w:bCs/>
-        </w:rPr>
-        <w:t xml:space="preserve">Administrador:</w:t>
-      </w:r>
-      <w:r>
-        <w:t xml:space="preserve"> </w:t>
-      </w:r>
-      <w:r>
-        <w:t xml:space="preserve">Usuarios (crear personal y asignar rol), Roles y permisos, Bitácora y todos los módulos.</w:t>
-      </w:r>
-    </w:p>
-    <w:p>
-      <w:pPr>
-        <w:pStyle w:val="Heading1"/>
-      </w:pPr>
-      <w:r>
-        <w:t xml:space="preserve">10. Capturas del sistema</w:t>
+        <w:t xml:space="preserve">7.1 Control de acceso por rol</w:t>
       </w:r>
     </w:p>
     <w:p>
@@ -11806,17 +10644,20 @@
         <w:pStyle w:val="FirstParagraph"/>
       </w:pPr>
       <w:r>
+        <w:t xml:space="preserve">El administrador asigna los permisos de cada rol desde la pantalla</w:t>
+      </w:r>
+      <w:r>
+        <w:t xml:space="preserve"> </w:t>
+      </w:r>
+      <w:r>
         <w:rPr>
           <w:b/>
           <w:bCs/>
         </w:rPr>
-        <w:t xml:space="preserve">Roles y permisos (rol Administrador).</w:t>
-      </w:r>
-      <w:r>
-        <w:t xml:space="preserve"> </w:t>
-      </w:r>
-      <w:r>
-        <w:t xml:space="preserve">Desde esta pantalla el administrador asigna los permisos a cada rol; los cambios se guardan en las tablas</w:t>
+        <w:t xml:space="preserve">Roles y permisos</w:t>
+      </w:r>
+      <w:r>
+        <w:t xml:space="preserve">; los cambios se guardan en las tablas</w:t>
       </w:r>
       <w:r>
         <w:t xml:space="preserve"> </w:t>
@@ -11855,7 +10696,10 @@
         <w:t xml:space="preserve">rolPermiso</w:t>
       </w:r>
       <w:r>
-        <w:t xml:space="preserve">.</w:t>
+        <w:t xml:space="preserve"> </w:t>
+      </w:r>
+      <w:r>
+        <w:t xml:space="preserve">y se aplican en el siguiente inicio de sesión de los usuarios de ese rol.</w:t>
       </w:r>
     </w:p>
     <w:p>
@@ -11867,7 +10711,7 @@
           <wp:inline>
             <wp:extent cx="5334000" cy="3619767"/>
             <wp:effectExtent b="0" l="0" r="0" t="0"/>
-            <wp:docPr descr="Pantalla de roles y permisos" title="" id="19" name="Picture"/>
+            <wp:docPr descr="Pantalla de roles y permisos (rol Administrador)" title="" id="19" name="Picture"/>
             <a:graphic>
               <a:graphicData uri="http://schemas.openxmlformats.org/drawingml/2006/picture">
                 <pic:pic>
@@ -11910,7 +10754,7 @@
         <w:pStyle w:val="ImageCaption"/>
       </w:pPr>
       <w:r>
-        <w:t xml:space="preserve">Pantalla de roles y permisos</w:t>
+        <w:t xml:space="preserve">Pantalla de roles y permisos (rol Administrador)</w:t>
       </w:r>
     </w:p>
     <w:p>
@@ -11918,17 +10762,7 @@
         <w:pStyle w:val="BodyText"/>
       </w:pPr>
       <w:r>
-        <w:rPr>
-          <w:b/>
-          <w:bCs/>
-        </w:rPr>
-        <w:t xml:space="preserve">Control de permisos por rol (usuario Veterinario).</w:t>
-      </w:r>
-      <w:r>
-        <w:t xml:space="preserve"> </w:t>
-      </w:r>
-      <w:r>
-        <w:t xml:space="preserve">El menú solo muestra los módulos permitidos y, en Mascotas, el veterinario tiene permiso de consulta pero no de gestión, por lo que el formulario y los botones aparecen deshabilitados.</w:t>
+        <w:t xml:space="preserve">El menú solo muestra los módulos permitidos y los botones se habilitan según el permiso. En la siguiente captura, el veterinario tiene permiso de consulta en Mascotas pero no de gestión, por lo que el formulario y los botones aparecen deshabilitados.</w:t>
       </w:r>
     </w:p>
     <w:p>
@@ -11984,6 +10818,1630 @@
       </w:pPr>
       <w:r>
         <w:t xml:space="preserve">Mascotas con el rol Veterinario (solo lectura)</w:t>
+      </w:r>
+    </w:p>
+    <w:p>
+      <w:pPr>
+        <w:pStyle w:val="Heading1"/>
+      </w:pPr>
+      <w:r>
+        <w:t xml:space="preserve">8. Cumplimiento de la rúbrica</w:t>
+      </w:r>
+    </w:p>
+    <w:tbl>
+      <w:tblPr>
+        <w:tblStyle w:val="Table"/>
+        <w:tblW w:type="pct" w:w="5000"/>
+        <w:tblLayout w:type="fixed"/>
+        <w:tblLook w:firstRow="1" w:lastRow="0" w:firstColumn="0" w:lastColumn="0" w:noHBand="0" w:noVBand="0" w:val="0020"/>
+        <w:tblBorders>
+          <w:top w:val="single" w:sz="4" w:space="0" w:color="CBD5E1"/>
+          <w:left w:val="single" w:sz="4" w:space="0" w:color="CBD5E1"/>
+          <w:bottom w:val="single" w:sz="4" w:space="0" w:color="CBD5E1"/>
+          <w:right w:val="single" w:sz="4" w:space="0" w:color="CBD5E1"/>
+          <w:insideH w:val="single" w:sz="4" w:space="0" w:color="CBD5E1"/>
+          <w:insideV w:val="single" w:sz="4" w:space="0" w:color="CBD5E1"/>
+        </w:tblBorders>
+        <w:tblCellMar>
+          <w:top w:w="50" w:type="dxa"/>
+          <w:left w:w="100" w:type="dxa"/>
+          <w:bottom w:w="50" w:type="dxa"/>
+          <w:right w:w="100" w:type="dxa"/>
+        </w:tblCellMar>
+      </w:tblPr>
+      <w:tblGrid>
+        <w:gridCol w:w="792"/>
+        <w:gridCol w:w="2640"/>
+        <w:gridCol w:w="4488"/>
+      </w:tblGrid>
+      <w:tr>
+        <w:trPr>
+          <w:tblHeader w:val="on"/>
+        </w:trPr>
+        <w:tc>
+          <w:tcPr>
+            <w:shd w:val="clear" w:color="auto" w:fill="0F766E"/>
+          </w:tcPr>
+          <w:p>
+            <w:pPr>
+              <w:pStyle w:val="Compact"/>
+              <w:spacing w:after="0" w:before="0"/>
+            </w:pPr>
+            <w:r>
+              <w:rPr>
+                <w:b/>
+                <w:color w:val="FFFFFF"/>
+                <w:sz w:val="19"/>
+              </w:rPr>
+              <w:t xml:space="preserve">#</w:t>
+            </w:r>
+          </w:p>
+        </w:tc>
+        <w:tc>
+          <w:tcPr>
+            <w:shd w:val="clear" w:color="auto" w:fill="0F766E"/>
+          </w:tcPr>
+          <w:p>
+            <w:pPr>
+              <w:pStyle w:val="Compact"/>
+              <w:spacing w:after="0" w:before="0"/>
+            </w:pPr>
+            <w:r>
+              <w:rPr>
+                <w:b/>
+                <w:color w:val="FFFFFF"/>
+                <w:sz w:val="19"/>
+              </w:rPr>
+              <w:t xml:space="preserve">Criterio</w:t>
+            </w:r>
+          </w:p>
+        </w:tc>
+        <w:tc>
+          <w:tcPr>
+            <w:shd w:val="clear" w:color="auto" w:fill="0F766E"/>
+          </w:tcPr>
+          <w:p>
+            <w:pPr>
+              <w:pStyle w:val="Compact"/>
+              <w:spacing w:after="0" w:before="0"/>
+            </w:pPr>
+            <w:r>
+              <w:rPr>
+                <w:b/>
+                <w:color w:val="FFFFFF"/>
+                <w:sz w:val="19"/>
+              </w:rPr>
+              <w:t xml:space="preserve">Dónde se cumple</w:t>
+            </w:r>
+          </w:p>
+        </w:tc>
+      </w:tr>
+      <w:tr>
+        <w:tc>
+          <w:tcPr/>
+          <w:p>
+            <w:pPr>
+              <w:pStyle w:val="Compact"/>
+              <w:spacing w:after="0" w:before="0"/>
+            </w:pPr>
+            <w:r>
+              <w:rPr>
+                <w:sz w:val="19"/>
+              </w:rPr>
+              <w:t xml:space="preserve">1</w:t>
+            </w:r>
+          </w:p>
+        </w:tc>
+        <w:tc>
+          <w:tcPr/>
+          <w:p>
+            <w:pPr>
+              <w:pStyle w:val="Compact"/>
+              <w:spacing w:after="0" w:before="0"/>
+            </w:pPr>
+            <w:r>
+              <w:rPr>
+                <w:sz w:val="19"/>
+              </w:rPr>
+              <w:t xml:space="preserve">Arquitectura MV</w:t>
+            </w:r>
+          </w:p>
+        </w:tc>
+        <w:tc>
+          <w:tcPr/>
+          <w:p>
+            <w:pPr>
+              <w:pStyle w:val="Compact"/>
+              <w:spacing w:after="0" w:before="0"/>
+            </w:pPr>
+            <w:r>
+              <w:rPr>
+                <w:sz w:val="19"/>
+              </w:rPr>
+              <w:t xml:space="preserve">Proyectos</w:t>
+            </w:r>
+            <w:r>
+              <w:rPr>
+                <w:sz w:val="19"/>
+              </w:rPr>
+              <w:t xml:space="preserve"> </w:t>
+            </w:r>
+            <w:r>
+              <w:rPr>
+                <w:rStyle w:val="VerbatimChar"/>
+                <w:sz w:val="19"/>
+              </w:rPr>
+              <w:t xml:space="preserve">Modelos</w:t>
+            </w:r>
+            <w:r>
+              <w:rPr>
+                <w:sz w:val="19"/>
+              </w:rPr>
+              <w:t xml:space="preserve"> </w:t>
+            </w:r>
+            <w:r>
+              <w:rPr>
+                <w:sz w:val="19"/>
+              </w:rPr>
+              <w:t xml:space="preserve">y</w:t>
+            </w:r>
+            <w:r>
+              <w:rPr>
+                <w:sz w:val="19"/>
+              </w:rPr>
+              <w:t xml:space="preserve"> </w:t>
+            </w:r>
+            <w:r>
+              <w:rPr>
+                <w:rStyle w:val="VerbatimChar"/>
+                <w:sz w:val="19"/>
+              </w:rPr>
+              <w:t xml:space="preserve">Vista</w:t>
+            </w:r>
+            <w:r>
+              <w:rPr>
+                <w:sz w:val="19"/>
+              </w:rPr>
+              <w:t xml:space="preserve">; la Vista solo invoca clases de</w:t>
+            </w:r>
+            <w:r>
+              <w:rPr>
+                <w:sz w:val="19"/>
+              </w:rPr>
+              <w:t xml:space="preserve"> </w:t>
+            </w:r>
+            <w:r>
+              <w:rPr>
+                <w:rStyle w:val="VerbatimChar"/>
+                <w:sz w:val="19"/>
+              </w:rPr>
+              <w:t xml:space="preserve">Modelos.Datos</w:t>
+            </w:r>
+          </w:p>
+        </w:tc>
+      </w:tr>
+      <w:tr>
+        <w:tc>
+          <w:tcPr>
+            <w:shd w:val="clear" w:color="auto" w:fill="F1F5F9"/>
+          </w:tcPr>
+          <w:p>
+            <w:pPr>
+              <w:pStyle w:val="Compact"/>
+              <w:spacing w:after="0" w:before="0"/>
+            </w:pPr>
+            <w:r>
+              <w:rPr>
+                <w:sz w:val="19"/>
+              </w:rPr>
+              <w:t xml:space="preserve">2</w:t>
+            </w:r>
+          </w:p>
+        </w:tc>
+        <w:tc>
+          <w:tcPr>
+            <w:shd w:val="clear" w:color="auto" w:fill="F1F5F9"/>
+          </w:tcPr>
+          <w:p>
+            <w:pPr>
+              <w:pStyle w:val="Compact"/>
+              <w:spacing w:after="0" w:before="0"/>
+            </w:pPr>
+            <w:r>
+              <w:rPr>
+                <w:sz w:val="19"/>
+              </w:rPr>
+              <w:t xml:space="preserve">Estructura de carpetas</w:t>
+            </w:r>
+          </w:p>
+        </w:tc>
+        <w:tc>
+          <w:tcPr>
+            <w:shd w:val="clear" w:color="auto" w:fill="F1F5F9"/>
+          </w:tcPr>
+          <w:p>
+            <w:pPr>
+              <w:pStyle w:val="Compact"/>
+              <w:spacing w:after="0" w:before="0"/>
+            </w:pPr>
+            <w:r>
+              <w:rPr>
+                <w:sz w:val="19"/>
+              </w:rPr>
+              <w:t xml:space="preserve">Capas por proyecto y carpetas por funcionalidad (ver sección 3)</w:t>
+            </w:r>
+          </w:p>
+        </w:tc>
+      </w:tr>
+      <w:tr>
+        <w:tc>
+          <w:tcPr/>
+          <w:p>
+            <w:pPr>
+              <w:pStyle w:val="Compact"/>
+              <w:spacing w:after="0" w:before="0"/>
+            </w:pPr>
+            <w:r>
+              <w:rPr>
+                <w:sz w:val="19"/>
+              </w:rPr>
+              <w:t xml:space="preserve">3</w:t>
+            </w:r>
+          </w:p>
+        </w:tc>
+        <w:tc>
+          <w:tcPr/>
+          <w:p>
+            <w:pPr>
+              <w:pStyle w:val="Compact"/>
+              <w:spacing w:after="0" w:before="0"/>
+            </w:pPr>
+            <w:r>
+              <w:rPr>
+                <w:sz w:val="19"/>
+              </w:rPr>
+              <w:t xml:space="preserve">Login con BCrypt</w:t>
+            </w:r>
+          </w:p>
+        </w:tc>
+        <w:tc>
+          <w:tcPr/>
+          <w:p>
+            <w:pPr>
+              <w:pStyle w:val="Compact"/>
+              <w:spacing w:after="0" w:before="0"/>
+            </w:pPr>
+            <w:r>
+              <w:rPr>
+                <w:rStyle w:val="VerbatimChar"/>
+                <w:sz w:val="19"/>
+              </w:rPr>
+              <w:t xml:space="preserve">Vista/Login/frmLogin.cs</w:t>
+            </w:r>
+            <w:r>
+              <w:rPr>
+                <w:sz w:val="19"/>
+              </w:rPr>
+              <w:t xml:space="preserve">,</w:t>
+            </w:r>
+            <w:r>
+              <w:rPr>
+                <w:sz w:val="19"/>
+              </w:rPr>
+              <w:t xml:space="preserve"> </w:t>
+            </w:r>
+            <w:r>
+              <w:rPr>
+                <w:rStyle w:val="VerbatimChar"/>
+                <w:sz w:val="19"/>
+              </w:rPr>
+              <w:t xml:space="preserve">UsuarioDatos.Autenticar</w:t>
+            </w:r>
+            <w:r>
+              <w:rPr>
+                <w:sz w:val="19"/>
+              </w:rPr>
+              <w:t xml:space="preserve">,</w:t>
+            </w:r>
+            <w:r>
+              <w:rPr>
+                <w:sz w:val="19"/>
+              </w:rPr>
+              <w:t xml:space="preserve"> </w:t>
+            </w:r>
+            <w:r>
+              <w:rPr>
+                <w:rStyle w:val="VerbatimChar"/>
+                <w:sz w:val="19"/>
+              </w:rPr>
+              <w:t xml:space="preserve">EncriptadorContrasena</w:t>
+            </w:r>
+          </w:p>
+        </w:tc>
+      </w:tr>
+      <w:tr>
+        <w:tc>
+          <w:tcPr>
+            <w:shd w:val="clear" w:color="auto" w:fill="F1F5F9"/>
+          </w:tcPr>
+          <w:p>
+            <w:pPr>
+              <w:pStyle w:val="Compact"/>
+              <w:spacing w:after="0" w:before="0"/>
+            </w:pPr>
+            <w:r>
+              <w:rPr>
+                <w:sz w:val="19"/>
+              </w:rPr>
+              <w:t xml:space="preserve">4</w:t>
+            </w:r>
+          </w:p>
+        </w:tc>
+        <w:tc>
+          <w:tcPr>
+            <w:shd w:val="clear" w:color="auto" w:fill="F1F5F9"/>
+          </w:tcPr>
+          <w:p>
+            <w:pPr>
+              <w:pStyle w:val="Compact"/>
+              <w:spacing w:after="0" w:before="0"/>
+            </w:pPr>
+            <w:r>
+              <w:rPr>
+                <w:sz w:val="19"/>
+              </w:rPr>
+              <w:t xml:space="preserve">Gestión de usuarios</w:t>
+            </w:r>
+          </w:p>
+        </w:tc>
+        <w:tc>
+          <w:tcPr>
+            <w:shd w:val="clear" w:color="auto" w:fill="F1F5F9"/>
+          </w:tcPr>
+          <w:p>
+            <w:pPr>
+              <w:pStyle w:val="Compact"/>
+              <w:spacing w:after="0" w:before="0"/>
+            </w:pPr>
+            <w:r>
+              <w:rPr>
+                <w:rStyle w:val="VerbatimChar"/>
+                <w:sz w:val="19"/>
+              </w:rPr>
+              <w:t xml:space="preserve">Vista/Usuarios/frmUsuarios.cs</w:t>
+            </w:r>
+            <w:r>
+              <w:rPr>
+                <w:sz w:val="19"/>
+              </w:rPr>
+              <w:t xml:space="preserve"> </w:t>
+            </w:r>
+            <w:r>
+              <w:rPr>
+                <w:sz w:val="19"/>
+              </w:rPr>
+              <w:t xml:space="preserve">(CRUD + rol)</w:t>
+            </w:r>
+          </w:p>
+        </w:tc>
+      </w:tr>
+      <w:tr>
+        <w:tc>
+          <w:tcPr/>
+          <w:p>
+            <w:pPr>
+              <w:pStyle w:val="Compact"/>
+              <w:spacing w:after="0" w:before="0"/>
+            </w:pPr>
+            <w:r>
+              <w:rPr>
+                <w:sz w:val="19"/>
+              </w:rPr>
+              <w:t xml:space="preserve">5</w:t>
+            </w:r>
+          </w:p>
+        </w:tc>
+        <w:tc>
+          <w:tcPr/>
+          <w:p>
+            <w:pPr>
+              <w:pStyle w:val="Compact"/>
+              <w:spacing w:after="0" w:before="0"/>
+            </w:pPr>
+            <w:r>
+              <w:rPr>
+                <w:sz w:val="19"/>
+              </w:rPr>
+              <w:t xml:space="preserve">Roles y permisos</w:t>
+            </w:r>
+          </w:p>
+        </w:tc>
+        <w:tc>
+          <w:tcPr/>
+          <w:p>
+            <w:pPr>
+              <w:pStyle w:val="Compact"/>
+              <w:spacing w:after="0" w:before="0"/>
+            </w:pPr>
+            <w:r>
+              <w:rPr>
+                <w:sz w:val="19"/>
+              </w:rPr>
+              <w:t xml:space="preserve">Tablas</w:t>
+            </w:r>
+            <w:r>
+              <w:rPr>
+                <w:sz w:val="19"/>
+              </w:rPr>
+              <w:t xml:space="preserve"> </w:t>
+            </w:r>
+            <w:r>
+              <w:rPr>
+                <w:rStyle w:val="VerbatimChar"/>
+                <w:sz w:val="19"/>
+              </w:rPr>
+              <w:t xml:space="preserve">rol</w:t>
+            </w:r>
+            <w:r>
+              <w:rPr>
+                <w:sz w:val="19"/>
+              </w:rPr>
+              <w:t xml:space="preserve">/</w:t>
+            </w:r>
+            <w:r>
+              <w:rPr>
+                <w:rStyle w:val="VerbatimChar"/>
+                <w:sz w:val="19"/>
+              </w:rPr>
+              <w:t xml:space="preserve">permiso</w:t>
+            </w:r>
+            <w:r>
+              <w:rPr>
+                <w:sz w:val="19"/>
+              </w:rPr>
+              <w:t xml:space="preserve">/</w:t>
+            </w:r>
+            <w:r>
+              <w:rPr>
+                <w:rStyle w:val="VerbatimChar"/>
+                <w:sz w:val="19"/>
+              </w:rPr>
+              <w:t xml:space="preserve">rolPermiso</w:t>
+            </w:r>
+            <w:r>
+              <w:rPr>
+                <w:sz w:val="19"/>
+              </w:rPr>
+              <w:t xml:space="preserve">,</w:t>
+            </w:r>
+            <w:r>
+              <w:rPr>
+                <w:sz w:val="19"/>
+              </w:rPr>
+              <w:t xml:space="preserve"> </w:t>
+            </w:r>
+            <w:r>
+              <w:rPr>
+                <w:rStyle w:val="VerbatimChar"/>
+                <w:sz w:val="19"/>
+              </w:rPr>
+              <w:t xml:space="preserve">Sesion.Tiene</w:t>
+            </w:r>
+            <w:r>
+              <w:rPr>
+                <w:sz w:val="19"/>
+              </w:rPr>
+              <w:t xml:space="preserve">,</w:t>
+            </w:r>
+            <w:r>
+              <w:rPr>
+                <w:sz w:val="19"/>
+              </w:rPr>
+              <w:t xml:space="preserve"> </w:t>
+            </w:r>
+            <w:r>
+              <w:rPr>
+                <w:rStyle w:val="VerbatimChar"/>
+                <w:sz w:val="19"/>
+              </w:rPr>
+              <w:t xml:space="preserve">frmRoles</w:t>
+            </w:r>
+          </w:p>
+        </w:tc>
+      </w:tr>
+      <w:tr>
+        <w:tc>
+          <w:tcPr>
+            <w:shd w:val="clear" w:color="auto" w:fill="F1F5F9"/>
+          </w:tcPr>
+          <w:p>
+            <w:pPr>
+              <w:pStyle w:val="Compact"/>
+              <w:spacing w:after="0" w:before="0"/>
+            </w:pPr>
+            <w:r>
+              <w:rPr>
+                <w:sz w:val="19"/>
+              </w:rPr>
+              <w:t xml:space="preserve">6</w:t>
+            </w:r>
+          </w:p>
+        </w:tc>
+        <w:tc>
+          <w:tcPr>
+            <w:shd w:val="clear" w:color="auto" w:fill="F1F5F9"/>
+          </w:tcPr>
+          <w:p>
+            <w:pPr>
+              <w:pStyle w:val="Compact"/>
+              <w:spacing w:after="0" w:before="0"/>
+            </w:pPr>
+            <w:r>
+              <w:rPr>
+                <w:sz w:val="19"/>
+              </w:rPr>
+              <w:t xml:space="preserve">Seguridad</w:t>
+            </w:r>
+          </w:p>
+        </w:tc>
+        <w:tc>
+          <w:tcPr>
+            <w:shd w:val="clear" w:color="auto" w:fill="F1F5F9"/>
+          </w:tcPr>
+          <w:p>
+            <w:pPr>
+              <w:pStyle w:val="Compact"/>
+              <w:spacing w:after="0" w:before="0"/>
+            </w:pPr>
+            <w:r>
+              <w:rPr>
+                <w:sz w:val="19"/>
+              </w:rPr>
+              <w:t xml:space="preserve">Hash BCrypt, consultas parametrizadas, reglas anti-bloqueo</w:t>
+            </w:r>
+          </w:p>
+        </w:tc>
+      </w:tr>
+      <w:tr>
+        <w:tc>
+          <w:tcPr/>
+          <w:p>
+            <w:pPr>
+              <w:pStyle w:val="Compact"/>
+              <w:spacing w:after="0" w:before="0"/>
+            </w:pPr>
+            <w:r>
+              <w:rPr>
+                <w:sz w:val="19"/>
+              </w:rPr>
+              <w:t xml:space="preserve">7</w:t>
+            </w:r>
+          </w:p>
+        </w:tc>
+        <w:tc>
+          <w:tcPr/>
+          <w:p>
+            <w:pPr>
+              <w:pStyle w:val="Compact"/>
+              <w:spacing w:after="0" w:before="0"/>
+            </w:pPr>
+            <w:r>
+              <w:rPr>
+                <w:sz w:val="19"/>
+              </w:rPr>
+              <w:t xml:space="preserve">Scripts de BD</w:t>
+            </w:r>
+          </w:p>
+        </w:tc>
+        <w:tc>
+          <w:tcPr/>
+          <w:p>
+            <w:pPr>
+              <w:pStyle w:val="Compact"/>
+              <w:spacing w:after="0" w:before="0"/>
+            </w:pPr>
+            <w:r>
+              <w:rPr>
+                <w:rStyle w:val="VerbatimChar"/>
+                <w:sz w:val="19"/>
+              </w:rPr>
+              <w:t xml:space="preserve">BaseDatos/Veterinaria.sql</w:t>
+            </w:r>
+            <w:r>
+              <w:rPr>
+                <w:sz w:val="19"/>
+              </w:rPr>
+              <w:t xml:space="preserve"> </w:t>
+            </w:r>
+            <w:r>
+              <w:rPr>
+                <w:sz w:val="19"/>
+              </w:rPr>
+              <w:t xml:space="preserve">(comentado, con usuarios, roles y permisos)</w:t>
+            </w:r>
+          </w:p>
+        </w:tc>
+      </w:tr>
+      <w:tr>
+        <w:tc>
+          <w:tcPr>
+            <w:shd w:val="clear" w:color="auto" w:fill="F1F5F9"/>
+          </w:tcPr>
+          <w:p>
+            <w:pPr>
+              <w:pStyle w:val="Compact"/>
+              <w:spacing w:after="0" w:before="0"/>
+            </w:pPr>
+            <w:r>
+              <w:rPr>
+                <w:sz w:val="19"/>
+              </w:rPr>
+              <w:t xml:space="preserve">8</w:t>
+            </w:r>
+          </w:p>
+        </w:tc>
+        <w:tc>
+          <w:tcPr>
+            <w:shd w:val="clear" w:color="auto" w:fill="F1F5F9"/>
+          </w:tcPr>
+          <w:p>
+            <w:pPr>
+              <w:pStyle w:val="Compact"/>
+              <w:spacing w:after="0" w:before="0"/>
+            </w:pPr>
+            <w:r>
+              <w:rPr>
+                <w:sz w:val="19"/>
+              </w:rPr>
+              <w:t xml:space="preserve">CRUD de todas las entidades</w:t>
+            </w:r>
+          </w:p>
+        </w:tc>
+        <w:tc>
+          <w:tcPr>
+            <w:shd w:val="clear" w:color="auto" w:fill="F1F5F9"/>
+          </w:tcPr>
+          <w:p>
+            <w:pPr>
+              <w:pStyle w:val="Compact"/>
+              <w:spacing w:after="0" w:before="0"/>
+            </w:pPr>
+            <w:r>
+              <w:rPr>
+                <w:sz w:val="19"/>
+              </w:rPr>
+              <w:t xml:space="preserve">Propietarios, Mascotas, Citas, Consultas, Vacunas, Aplicaciones, Usuarios</w:t>
+            </w:r>
+          </w:p>
+        </w:tc>
+      </w:tr>
+      <w:tr>
+        <w:tc>
+          <w:tcPr/>
+          <w:p>
+            <w:pPr>
+              <w:pStyle w:val="Compact"/>
+              <w:spacing w:after="0" w:before="0"/>
+            </w:pPr>
+            <w:r>
+              <w:rPr>
+                <w:sz w:val="19"/>
+              </w:rPr>
+              <w:t xml:space="preserve">9</w:t>
+            </w:r>
+          </w:p>
+        </w:tc>
+        <w:tc>
+          <w:tcPr/>
+          <w:p>
+            <w:pPr>
+              <w:pStyle w:val="Compact"/>
+              <w:spacing w:after="0" w:before="0"/>
+            </w:pPr>
+            <w:r>
+              <w:rPr>
+                <w:sz w:val="19"/>
+              </w:rPr>
+              <w:t xml:space="preserve">Excepciones</w:t>
+            </w:r>
+          </w:p>
+        </w:tc>
+        <w:tc>
+          <w:tcPr/>
+          <w:p>
+            <w:pPr>
+              <w:pStyle w:val="Compact"/>
+              <w:spacing w:after="0" w:before="0"/>
+            </w:pPr>
+            <w:r>
+              <w:rPr>
+                <w:rStyle w:val="VerbatimChar"/>
+                <w:sz w:val="19"/>
+              </w:rPr>
+              <w:t xml:space="preserve">try/catch</w:t>
+            </w:r>
+            <w:r>
+              <w:rPr>
+                <w:sz w:val="19"/>
+              </w:rPr>
+              <w:t xml:space="preserve"> </w:t>
+            </w:r>
+            <w:r>
+              <w:rPr>
+                <w:sz w:val="19"/>
+              </w:rPr>
+              <w:t xml:space="preserve">+</w:t>
+            </w:r>
+            <w:r>
+              <w:rPr>
+                <w:sz w:val="19"/>
+              </w:rPr>
+              <w:t xml:space="preserve"> </w:t>
+            </w:r>
+            <w:r>
+              <w:rPr>
+                <w:rStyle w:val="VerbatimChar"/>
+                <w:sz w:val="19"/>
+              </w:rPr>
+              <w:t xml:space="preserve">MessageBox</w:t>
+            </w:r>
+            <w:r>
+              <w:rPr>
+                <w:sz w:val="19"/>
+              </w:rPr>
+              <w:t xml:space="preserve"> </w:t>
+            </w:r>
+            <w:r>
+              <w:rPr>
+                <w:sz w:val="19"/>
+              </w:rPr>
+              <w:t xml:space="preserve">+</w:t>
+            </w:r>
+            <w:r>
+              <w:rPr>
+                <w:sz w:val="19"/>
+              </w:rPr>
+              <w:t xml:space="preserve"> </w:t>
+            </w:r>
+            <w:r>
+              <w:rPr>
+                <w:rStyle w:val="VerbatimChar"/>
+                <w:sz w:val="19"/>
+              </w:rPr>
+              <w:t xml:space="preserve">Logger</w:t>
+            </w:r>
+          </w:p>
+        </w:tc>
+      </w:tr>
+      <w:tr>
+        <w:tc>
+          <w:tcPr>
+            <w:shd w:val="clear" w:color="auto" w:fill="F1F5F9"/>
+          </w:tcPr>
+          <w:p>
+            <w:pPr>
+              <w:pStyle w:val="Compact"/>
+              <w:spacing w:after="0" w:before="0"/>
+            </w:pPr>
+            <w:r>
+              <w:rPr>
+                <w:sz w:val="19"/>
+              </w:rPr>
+              <w:t xml:space="preserve">10</w:t>
+            </w:r>
+          </w:p>
+        </w:tc>
+        <w:tc>
+          <w:tcPr>
+            <w:shd w:val="clear" w:color="auto" w:fill="F1F5F9"/>
+          </w:tcPr>
+          <w:p>
+            <w:pPr>
+              <w:pStyle w:val="Compact"/>
+              <w:spacing w:after="0" w:before="0"/>
+            </w:pPr>
+            <w:r>
+              <w:rPr>
+                <w:sz w:val="19"/>
+              </w:rPr>
+              <w:t xml:space="preserve">Interfaz de usuario</w:t>
+            </w:r>
+          </w:p>
+        </w:tc>
+        <w:tc>
+          <w:tcPr>
+            <w:shd w:val="clear" w:color="auto" w:fill="F1F5F9"/>
+          </w:tcPr>
+          <w:p>
+            <w:pPr>
+              <w:pStyle w:val="Compact"/>
+              <w:spacing w:after="0" w:before="0"/>
+            </w:pPr>
+            <w:r>
+              <w:rPr>
+                <w:sz w:val="19"/>
+              </w:rPr>
+              <w:t xml:space="preserve">Formularios diseñados en el Designer con la misma estructura y colores; mensajes de validación claros</w:t>
+            </w:r>
+          </w:p>
+        </w:tc>
+      </w:tr>
+      <w:tr>
+        <w:tc>
+          <w:tcPr/>
+          <w:p>
+            <w:pPr>
+              <w:pStyle w:val="Compact"/>
+              <w:spacing w:after="0" w:before="0"/>
+            </w:pPr>
+            <w:r>
+              <w:rPr>
+                <w:sz w:val="19"/>
+              </w:rPr>
+              <w:t xml:space="preserve">11</w:t>
+            </w:r>
+          </w:p>
+        </w:tc>
+        <w:tc>
+          <w:tcPr/>
+          <w:p>
+            <w:pPr>
+              <w:pStyle w:val="Compact"/>
+              <w:spacing w:after="0" w:before="0"/>
+            </w:pPr>
+            <w:r>
+              <w:rPr>
+                <w:sz w:val="19"/>
+              </w:rPr>
+              <w:t xml:space="preserve">Conexión a BD</w:t>
+            </w:r>
+          </w:p>
+        </w:tc>
+        <w:tc>
+          <w:tcPr/>
+          <w:p>
+            <w:pPr>
+              <w:pStyle w:val="Compact"/>
+              <w:spacing w:after="0" w:before="0"/>
+            </w:pPr>
+            <w:r>
+              <w:rPr>
+                <w:rStyle w:val="VerbatimChar"/>
+                <w:sz w:val="19"/>
+              </w:rPr>
+              <w:t xml:space="preserve">Conexion_DB/Conexion.cs</w:t>
+            </w:r>
+            <w:r>
+              <w:rPr>
+                <w:sz w:val="19"/>
+              </w:rPr>
+              <w:t xml:space="preserve"> </w:t>
+            </w:r>
+            <w:r>
+              <w:rPr>
+                <w:sz w:val="19"/>
+              </w:rPr>
+              <w:t xml:space="preserve">(servidor y base configurables, conexiones con</w:t>
+            </w:r>
+            <w:r>
+              <w:rPr>
+                <w:sz w:val="19"/>
+              </w:rPr>
+              <w:t xml:space="preserve"> </w:t>
+            </w:r>
+            <w:r>
+              <w:rPr>
+                <w:rStyle w:val="VerbatimChar"/>
+                <w:sz w:val="19"/>
+              </w:rPr>
+              <w:t xml:space="preserve">using</w:t>
+            </w:r>
+            <w:r>
+              <w:rPr>
+                <w:sz w:val="19"/>
+              </w:rPr>
+              <w:t xml:space="preserve">, consultas con parámetros)</w:t>
+            </w:r>
+          </w:p>
+        </w:tc>
+      </w:tr>
+      <w:tr>
+        <w:tc>
+          <w:tcPr>
+            <w:shd w:val="clear" w:color="auto" w:fill="F1F5F9"/>
+          </w:tcPr>
+          <w:p>
+            <w:pPr>
+              <w:pStyle w:val="Compact"/>
+              <w:spacing w:after="0" w:before="0"/>
+            </w:pPr>
+            <w:r>
+              <w:rPr>
+                <w:sz w:val="19"/>
+              </w:rPr>
+              <w:t xml:space="preserve">12</w:t>
+            </w:r>
+          </w:p>
+        </w:tc>
+        <w:tc>
+          <w:tcPr>
+            <w:shd w:val="clear" w:color="auto" w:fill="F1F5F9"/>
+          </w:tcPr>
+          <w:p>
+            <w:pPr>
+              <w:pStyle w:val="Compact"/>
+              <w:spacing w:after="0" w:before="0"/>
+            </w:pPr>
+            <w:r>
+              <w:rPr>
+                <w:sz w:val="19"/>
+              </w:rPr>
+              <w:t xml:space="preserve">Documentación</w:t>
+            </w:r>
+          </w:p>
+        </w:tc>
+        <w:tc>
+          <w:tcPr>
+            <w:shd w:val="clear" w:color="auto" w:fill="F1F5F9"/>
+          </w:tcPr>
+          <w:p>
+            <w:pPr>
+              <w:pStyle w:val="Compact"/>
+              <w:spacing w:after="0" w:before="0"/>
+            </w:pPr>
+            <w:r>
+              <w:rPr>
+                <w:sz w:val="19"/>
+              </w:rPr>
+              <w:t xml:space="preserve">Este documento</w:t>
+            </w:r>
+          </w:p>
+        </w:tc>
+      </w:tr>
+    </w:tbl>
+    <w:p>
+      <w:pPr>
+        <w:pStyle w:val="Heading1"/>
+      </w:pPr>
+      <w:r>
+        <w:t xml:space="preserve">9. Manual rápido de uso</w:t>
+      </w:r>
+    </w:p>
+    <w:p>
+      <w:pPr>
+        <w:pStyle w:val="Heading2"/>
+      </w:pPr>
+      <w:r>
+        <w:t xml:space="preserve">9.1 Preparación</w:t>
+      </w:r>
+    </w:p>
+    <w:p>
+      <w:pPr>
+        <w:pStyle w:val="Compact"/>
+        <w:numPr>
+          <w:ilvl w:val="0"/>
+          <w:numId w:val="1004"/>
+        </w:numPr>
+      </w:pPr>
+      <w:r>
+        <w:t xml:space="preserve">Ejecutar</w:t>
+      </w:r>
+      <w:r>
+        <w:t xml:space="preserve"> </w:t>
+      </w:r>
+      <w:r>
+        <w:rPr>
+          <w:rStyle w:val="VerbatimChar"/>
+        </w:rPr>
+        <w:t xml:space="preserve">BaseDatos/Veterinaria.sql</w:t>
+      </w:r>
+      <w:r>
+        <w:t xml:space="preserve"> </w:t>
+      </w:r>
+      <w:r>
+        <w:t xml:space="preserve">en SQL Server y abrir</w:t>
+      </w:r>
+      <w:r>
+        <w:t xml:space="preserve"> </w:t>
+      </w:r>
+      <w:r>
+        <w:rPr>
+          <w:rStyle w:val="VerbatimChar"/>
+        </w:rPr>
+        <w:t xml:space="preserve">Veterinaria.sln</w:t>
+      </w:r>
+      <w:r>
+        <w:t xml:space="preserve"> </w:t>
+      </w:r>
+      <w:r>
+        <w:t xml:space="preserve">en Visual Studio.</w:t>
+      </w:r>
+    </w:p>
+    <w:p>
+      <w:pPr>
+        <w:pStyle w:val="Compact"/>
+        <w:numPr>
+          <w:ilvl w:val="0"/>
+          <w:numId w:val="1004"/>
+        </w:numPr>
+      </w:pPr>
+      <w:r>
+        <w:t xml:space="preserve">Escribir el nombre del servidor en</w:t>
+      </w:r>
+      <w:r>
+        <w:t xml:space="preserve"> </w:t>
+      </w:r>
+      <w:r>
+        <w:rPr>
+          <w:rStyle w:val="VerbatimChar"/>
+        </w:rPr>
+        <w:t xml:space="preserve">Modelos/Conexion_DB/Conexion.cs</w:t>
+      </w:r>
+      <w:r>
+        <w:t xml:space="preserve"> </w:t>
+      </w:r>
+      <w:r>
+        <w:t xml:space="preserve">(variable</w:t>
+      </w:r>
+      <w:r>
+        <w:t xml:space="preserve"> </w:t>
+      </w:r>
+      <w:r>
+        <w:rPr>
+          <w:rStyle w:val="VerbatimChar"/>
+        </w:rPr>
+        <w:t xml:space="preserve">servidor</w:t>
+      </w:r>
+      <w:r>
+        <w:t xml:space="preserve">).</w:t>
+      </w:r>
+    </w:p>
+    <w:p>
+      <w:pPr>
+        <w:pStyle w:val="Compact"/>
+        <w:numPr>
+          <w:ilvl w:val="0"/>
+          <w:numId w:val="1004"/>
+        </w:numPr>
+      </w:pPr>
+      <w:r>
+        <w:t xml:space="preserve">Establecer</w:t>
+      </w:r>
+      <w:r>
+        <w:t xml:space="preserve"> </w:t>
+      </w:r>
+      <w:r>
+        <w:rPr>
+          <w:b/>
+          <w:bCs/>
+        </w:rPr>
+        <w:t xml:space="preserve">Vista</w:t>
+      </w:r>
+      <w:r>
+        <w:t xml:space="preserve"> </w:t>
+      </w:r>
+      <w:r>
+        <w:t xml:space="preserve">como proyecto de inicio y ejecutar.</w:t>
+      </w:r>
+    </w:p>
+    <w:p>
+      <w:pPr>
+        <w:pStyle w:val="Heading2"/>
+      </w:pPr>
+      <w:r>
+        <w:t xml:space="preserve">9.2 Inicio de sesión</w:t>
+      </w:r>
+    </w:p>
+    <w:p>
+      <w:pPr>
+        <w:pStyle w:val="FirstParagraph"/>
+      </w:pPr>
+      <w:r>
+        <w:t xml:space="preserve">Se ingresa el usuario y la contraseña. La contraseña se verifica con BCrypt y, tras 3 intentos fallidos, el sistema se cierra. Usuarios de prueba:</w:t>
+      </w:r>
+      <w:r>
+        <w:t xml:space="preserve"> </w:t>
+      </w:r>
+      <w:r>
+        <w:rPr>
+          <w:rStyle w:val="VerbatimChar"/>
+        </w:rPr>
+        <w:t xml:space="preserve">admin / Admin123*</w:t>
+      </w:r>
+      <w:r>
+        <w:t xml:space="preserve">,</w:t>
+      </w:r>
+      <w:r>
+        <w:t xml:space="preserve"> </w:t>
+      </w:r>
+      <w:r>
+        <w:rPr>
+          <w:rStyle w:val="VerbatimChar"/>
+        </w:rPr>
+        <w:t xml:space="preserve">dvera / Vet12345*</w:t>
+      </w:r>
+      <w:r>
+        <w:t xml:space="preserve"> </w:t>
+      </w:r>
+      <w:r>
+        <w:t xml:space="preserve">y</w:t>
+      </w:r>
+      <w:r>
+        <w:t xml:space="preserve"> </w:t>
+      </w:r>
+      <w:r>
+        <w:rPr>
+          <w:rStyle w:val="VerbatimChar"/>
+        </w:rPr>
+        <w:t xml:space="preserve">recep1 / Recep123*</w:t>
+      </w:r>
+      <w:r>
+        <w:t xml:space="preserve">.</w:t>
+      </w:r>
+    </w:p>
+    <w:p>
+      <w:pPr>
+        <w:pStyle w:val="CaptionedFigure"/>
+      </w:pPr>
+      <w:r>
+        <w:drawing>
+          <wp:inline>
+            <wp:extent cx="4389120" cy="3068583"/>
+            <wp:effectExtent b="0" l="0" r="0" t="0"/>
+            <wp:docPr descr="Pantalla de inicio de sesión" title="" id="25" name="Picture"/>
+            <a:graphic>
+              <a:graphicData uri="http://schemas.openxmlformats.org/drawingml/2006/picture">
+                <pic:pic>
+                  <pic:nvPicPr>
+                    <pic:cNvPr descr="capturas/login.png" id="26" name="Picture"/>
+                    <pic:cNvPicPr>
+                      <a:picLocks noChangeArrowheads="1" noChangeAspect="1"/>
+                    </pic:cNvPicPr>
+                  </pic:nvPicPr>
+                  <pic:blipFill>
+                    <a:blip r:embed="rId24"/>
+                    <a:stretch>
+                      <a:fillRect/>
+                    </a:stretch>
+                  </pic:blipFill>
+                  <pic:spPr bwMode="auto">
+                    <a:xfrm>
+                      <a:off x="0" y="0"/>
+                      <a:ext cx="4389120" cy="3068583"/>
+                    </a:xfrm>
+                    <a:prstGeom prst="rect">
+                      <a:avLst/>
+                    </a:prstGeom>
+                    <a:noFill/>
+                    <a:ln w="9525">
+                      <a:noFill/>
+                      <a:headEnd/>
+                      <a:tailEnd/>
+                    </a:ln>
+                  </pic:spPr>
+                </pic:pic>
+              </a:graphicData>
+            </a:graphic>
+          </wp:inline>
+        </w:drawing>
+      </w:r>
+    </w:p>
+    <w:p>
+      <w:pPr>
+        <w:pStyle w:val="ImageCaption"/>
+      </w:pPr>
+      <w:r>
+        <w:t xml:space="preserve">Pantalla de inicio de sesión</w:t>
+      </w:r>
+    </w:p>
+    <w:p>
+      <w:pPr>
+        <w:pStyle w:val="Heading2"/>
+      </w:pPr>
+      <w:r>
+        <w:t xml:space="preserve">9.3 Pantalla de inicio</w:t>
+      </w:r>
+    </w:p>
+    <w:p>
+      <w:pPr>
+        <w:pStyle w:val="FirstParagraph"/>
+      </w:pPr>
+      <w:r>
+        <w:t xml:space="preserve">Después de iniciar sesión se muestra el menú lateral (solo con los módulos permitidos para el rol) y un resumen con el total de propietarios, mascotas, citas programadas, consultas y vacunas aplicadas, junto con las próximas citas.</w:t>
+      </w:r>
+    </w:p>
+    <w:p>
+      <w:pPr>
+        <w:pStyle w:val="CaptionedFigure"/>
+      </w:pPr>
+      <w:r>
+        <w:drawing>
+          <wp:inline>
+            <wp:extent cx="5334000" cy="3626821"/>
+            <wp:effectExtent b="0" l="0" r="0" t="0"/>
+            <wp:docPr descr="Pantalla de inicio con estadísticas y próximas citas" title="" id="28" name="Picture"/>
+            <a:graphic>
+              <a:graphicData uri="http://schemas.openxmlformats.org/drawingml/2006/picture">
+                <pic:pic>
+                  <pic:nvPicPr>
+                    <pic:cNvPr descr="capturas/inicio.png" id="29" name="Picture"/>
+                    <pic:cNvPicPr>
+                      <a:picLocks noChangeArrowheads="1" noChangeAspect="1"/>
+                    </pic:cNvPicPr>
+                  </pic:nvPicPr>
+                  <pic:blipFill>
+                    <a:blip r:embed="rId27"/>
+                    <a:stretch>
+                      <a:fillRect/>
+                    </a:stretch>
+                  </pic:blipFill>
+                  <pic:spPr bwMode="auto">
+                    <a:xfrm>
+                      <a:off x="0" y="0"/>
+                      <a:ext cx="5334000" cy="3626821"/>
+                    </a:xfrm>
+                    <a:prstGeom prst="rect">
+                      <a:avLst/>
+                    </a:prstGeom>
+                    <a:noFill/>
+                    <a:ln w="9525">
+                      <a:noFill/>
+                      <a:headEnd/>
+                      <a:tailEnd/>
+                    </a:ln>
+                  </pic:spPr>
+                </pic:pic>
+              </a:graphicData>
+            </a:graphic>
+          </wp:inline>
+        </w:drawing>
+      </w:r>
+    </w:p>
+    <w:p>
+      <w:pPr>
+        <w:pStyle w:val="ImageCaption"/>
+      </w:pPr>
+      <w:r>
+        <w:t xml:space="preserve">Pantalla de inicio con estadísticas y próximas citas</w:t>
+      </w:r>
+    </w:p>
+    <w:p>
+      <w:pPr>
+        <w:pStyle w:val="Heading2"/>
+      </w:pPr>
+      <w:r>
+        <w:t xml:space="preserve">9.4 Recepcionista: propietarios, mascotas y citas</w:t>
+      </w:r>
+    </w:p>
+    <w:p>
+      <w:pPr>
+        <w:pStyle w:val="FirstParagraph"/>
+      </w:pPr>
+      <w:r>
+        <w:rPr>
+          <w:b/>
+          <w:bCs/>
+        </w:rPr>
+        <w:t xml:space="preserve">Propietarios.</w:t>
+      </w:r>
+      <w:r>
+        <w:t xml:space="preserve"> </w:t>
+      </w:r>
+      <w:r>
+        <w:t xml:space="preserve">Se registran con nombre (solo letras), DUI y teléfono (solo números, con formato automático) y correo opcional.</w:t>
+      </w:r>
+    </w:p>
+    <w:p>
+      <w:pPr>
+        <w:pStyle w:val="CaptionedFigure"/>
+      </w:pPr>
+      <w:r>
+        <w:drawing>
+          <wp:inline>
+            <wp:extent cx="5334000" cy="3143249"/>
+            <wp:effectExtent b="0" l="0" r="0" t="0"/>
+            <wp:docPr descr="Gestión de propietarios" title="" id="31" name="Picture"/>
+            <a:graphic>
+              <a:graphicData uri="http://schemas.openxmlformats.org/drawingml/2006/picture">
+                <pic:pic>
+                  <pic:nvPicPr>
+                    <pic:cNvPr descr="capturas/propietarios.png" id="32" name="Picture"/>
+                    <pic:cNvPicPr>
+                      <a:picLocks noChangeArrowheads="1" noChangeAspect="1"/>
+                    </pic:cNvPicPr>
+                  </pic:nvPicPr>
+                  <pic:blipFill>
+                    <a:blip r:embed="rId30"/>
+                    <a:stretch>
+                      <a:fillRect/>
+                    </a:stretch>
+                  </pic:blipFill>
+                  <pic:spPr bwMode="auto">
+                    <a:xfrm>
+                      <a:off x="0" y="0"/>
+                      <a:ext cx="5334000" cy="3143249"/>
+                    </a:xfrm>
+                    <a:prstGeom prst="rect">
+                      <a:avLst/>
+                    </a:prstGeom>
+                    <a:noFill/>
+                    <a:ln w="9525">
+                      <a:noFill/>
+                      <a:headEnd/>
+                      <a:tailEnd/>
+                    </a:ln>
+                  </pic:spPr>
+                </pic:pic>
+              </a:graphicData>
+            </a:graphic>
+          </wp:inline>
+        </w:drawing>
+      </w:r>
+    </w:p>
+    <w:p>
+      <w:pPr>
+        <w:pStyle w:val="ImageCaption"/>
+      </w:pPr>
+      <w:r>
+        <w:t xml:space="preserve">Gestión de propietarios</w:t>
+      </w:r>
+    </w:p>
+    <w:p>
+      <w:pPr>
+        <w:pStyle w:val="BodyText"/>
+      </w:pPr>
+      <w:r>
+        <w:rPr>
+          <w:b/>
+          <w:bCs/>
+        </w:rPr>
+        <w:t xml:space="preserve">Mascotas.</w:t>
+      </w:r>
+      <w:r>
+        <w:t xml:space="preserve"> </w:t>
+      </w:r>
+      <w:r>
+        <w:t xml:space="preserve">Cada mascota se asocia a un propietario y se registran su especie, raza, sexo, fecha de nacimiento, peso y color.</w:t>
+      </w:r>
+    </w:p>
+    <w:p>
+      <w:pPr>
+        <w:pStyle w:val="CaptionedFigure"/>
+      </w:pPr>
+      <w:r>
+        <w:drawing>
+          <wp:inline>
+            <wp:extent cx="5334000" cy="3133724"/>
+            <wp:effectExtent b="0" l="0" r="0" t="0"/>
+            <wp:docPr descr="Gestión de mascotas" title="" id="34" name="Picture"/>
+            <a:graphic>
+              <a:graphicData uri="http://schemas.openxmlformats.org/drawingml/2006/picture">
+                <pic:pic>
+                  <pic:nvPicPr>
+                    <pic:cNvPr descr="capturas/mascotas_admin.png" id="35" name="Picture"/>
+                    <pic:cNvPicPr>
+                      <a:picLocks noChangeArrowheads="1" noChangeAspect="1"/>
+                    </pic:cNvPicPr>
+                  </pic:nvPicPr>
+                  <pic:blipFill>
+                    <a:blip r:embed="rId33"/>
+                    <a:stretch>
+                      <a:fillRect/>
+                    </a:stretch>
+                  </pic:blipFill>
+                  <pic:spPr bwMode="auto">
+                    <a:xfrm>
+                      <a:off x="0" y="0"/>
+                      <a:ext cx="5334000" cy="3133724"/>
+                    </a:xfrm>
+                    <a:prstGeom prst="rect">
+                      <a:avLst/>
+                    </a:prstGeom>
+                    <a:noFill/>
+                    <a:ln w="9525">
+                      <a:noFill/>
+                      <a:headEnd/>
+                      <a:tailEnd/>
+                    </a:ln>
+                  </pic:spPr>
+                </pic:pic>
+              </a:graphicData>
+            </a:graphic>
+          </wp:inline>
+        </w:drawing>
+      </w:r>
+    </w:p>
+    <w:p>
+      <w:pPr>
+        <w:pStyle w:val="ImageCaption"/>
+      </w:pPr>
+      <w:r>
+        <w:t xml:space="preserve">Gestión de mascotas</w:t>
+      </w:r>
+    </w:p>
+    <w:p>
+      <w:pPr>
+        <w:pStyle w:val="BodyText"/>
+      </w:pPr>
+      <w:r>
+        <w:rPr>
+          <w:b/>
+          <w:bCs/>
+        </w:rPr>
+        <w:t xml:space="preserve">Citas.</w:t>
+      </w:r>
+      <w:r>
+        <w:t xml:space="preserve"> </w:t>
+      </w:r>
+      <w:r>
+        <w:t xml:space="preserve">Se elige la mascota, el veterinario y la fecha y hora. El sistema no permite citas en el pasado ni dos citas del mismo veterinario a la misma hora.</w:t>
+      </w:r>
+    </w:p>
+    <w:p>
+      <w:pPr>
+        <w:pStyle w:val="CaptionedFigure"/>
+      </w:pPr>
+      <w:r>
+        <w:drawing>
+          <wp:inline>
+            <wp:extent cx="5334000" cy="3126608"/>
+            <wp:effectExtent b="0" l="0" r="0" t="0"/>
+            <wp:docPr descr="Gestión de citas médicas" title="" id="37" name="Picture"/>
+            <a:graphic>
+              <a:graphicData uri="http://schemas.openxmlformats.org/drawingml/2006/picture">
+                <pic:pic>
+                  <pic:nvPicPr>
+                    <pic:cNvPr descr="capturas/citas.png" id="38" name="Picture"/>
+                    <pic:cNvPicPr>
+                      <a:picLocks noChangeArrowheads="1" noChangeAspect="1"/>
+                    </pic:cNvPicPr>
+                  </pic:nvPicPr>
+                  <pic:blipFill>
+                    <a:blip r:embed="rId36"/>
+                    <a:stretch>
+                      <a:fillRect/>
+                    </a:stretch>
+                  </pic:blipFill>
+                  <pic:spPr bwMode="auto">
+                    <a:xfrm>
+                      <a:off x="0" y="0"/>
+                      <a:ext cx="5334000" cy="3126608"/>
+                    </a:xfrm>
+                    <a:prstGeom prst="rect">
+                      <a:avLst/>
+                    </a:prstGeom>
+                    <a:noFill/>
+                    <a:ln w="9525">
+                      <a:noFill/>
+                      <a:headEnd/>
+                      <a:tailEnd/>
+                    </a:ln>
+                  </pic:spPr>
+                </pic:pic>
+              </a:graphicData>
+            </a:graphic>
+          </wp:inline>
+        </w:drawing>
+      </w:r>
+    </w:p>
+    <w:p>
+      <w:pPr>
+        <w:pStyle w:val="ImageCaption"/>
+      </w:pPr>
+      <w:r>
+        <w:t xml:space="preserve">Gestión de citas médicas</w:t>
+      </w:r>
+    </w:p>
+    <w:p>
+      <w:pPr>
+        <w:pStyle w:val="Heading2"/>
+      </w:pPr>
+      <w:r>
+        <w:t xml:space="preserve">9.5 Veterinario: historial médico y vacunas</w:t>
+      </w:r>
+    </w:p>
+    <w:p>
+      <w:pPr>
+        <w:pStyle w:val="FirstParagraph"/>
+      </w:pPr>
+      <w:r>
+        <w:t xml:space="preserve">En</w:t>
+      </w:r>
+      <w:r>
+        <w:t xml:space="preserve"> </w:t>
+      </w:r>
+      <w:r>
+        <w:rPr>
+          <w:b/>
+          <w:bCs/>
+        </w:rPr>
+        <w:t xml:space="preserve">Consultas médicas</w:t>
+      </w:r>
+      <w:r>
+        <w:t xml:space="preserve"> </w:t>
+      </w:r>
+      <w:r>
+        <w:t xml:space="preserve">se registra y actualiza el historial clínico de cada mascota (motivo, diagnóstico y tratamiento). En</w:t>
+      </w:r>
+      <w:r>
+        <w:t xml:space="preserve"> </w:t>
+      </w:r>
+      <w:r>
+        <w:rPr>
+          <w:b/>
+          <w:bCs/>
+        </w:rPr>
+        <w:t xml:space="preserve">Vacunas</w:t>
+      </w:r>
+      <w:r>
+        <w:t xml:space="preserve"> </w:t>
+      </w:r>
+      <w:r>
+        <w:t xml:space="preserve">se administra el catálogo y se aplican vacunas a las mascotas; la próxima dosis se calcula según el intervalo de cada vacuna.</w:t>
+      </w:r>
+    </w:p>
+    <w:p>
+      <w:pPr>
+        <w:pStyle w:val="Heading2"/>
+      </w:pPr>
+      <w:r>
+        <w:t xml:space="preserve">9.6 Administrador: personal y control general</w:t>
+      </w:r>
+    </w:p>
+    <w:p>
+      <w:pPr>
+        <w:pStyle w:val="FirstParagraph"/>
+      </w:pPr>
+      <w:r>
+        <w:t xml:space="preserve">En</w:t>
+      </w:r>
+      <w:r>
+        <w:t xml:space="preserve"> </w:t>
+      </w:r>
+      <w:r>
+        <w:rPr>
+          <w:b/>
+          <w:bCs/>
+        </w:rPr>
+        <w:t xml:space="preserve">Usuarios</w:t>
+      </w:r>
+      <w:r>
+        <w:t xml:space="preserve"> </w:t>
+      </w:r>
+      <w:r>
+        <w:t xml:space="preserve">se crean los usuarios del personal y se les asigna un rol; en</w:t>
+      </w:r>
+      <w:r>
+        <w:t xml:space="preserve"> </w:t>
+      </w:r>
+      <w:r>
+        <w:rPr>
+          <w:b/>
+          <w:bCs/>
+        </w:rPr>
+        <w:t xml:space="preserve">Roles y permisos</w:t>
+      </w:r>
+      <w:r>
+        <w:t xml:space="preserve"> </w:t>
+      </w:r>
+      <w:r>
+        <w:t xml:space="preserve">se definen los permisos de cada rol (ver sección 7.1); y en</w:t>
+      </w:r>
+      <w:r>
+        <w:t xml:space="preserve"> </w:t>
+      </w:r>
+      <w:r>
+        <w:rPr>
+          <w:b/>
+          <w:bCs/>
+        </w:rPr>
+        <w:t xml:space="preserve">Bitácora</w:t>
+      </w:r>
+      <w:r>
+        <w:t xml:space="preserve"> </w:t>
+      </w:r>
+      <w:r>
+        <w:t xml:space="preserve">se consultan las actividades y errores registrados. El administrador también tiene acceso a todos los demás módulos.</w:t>
       </w:r>
     </w:p>
     <w:sectPr>

</xml_diff>

<commit_message>
Validaciones ampliadas: duplicados, reglas de negocio, limpieza de texto e iconos de error
- Nombre y apellido, letras repetidas, teléfono, correo y contraseña más estrictos
- DUI: verificación del dígito verificador (con confirmación) y duplicados
- Citas: horario de atención, separación de 30 minutos y una cita por mascota al día
- Vacunas: especie compatible, sin duplicados, fecha posterior al nacimiento
- Siempre debe quedar un administrador activo
- Limpieza y capitalización de textos antes de guardar; icono rojo en campos con error

Co-Authored-By: Claude Sonnet 5.5 <noreply@anthropic.com>
Claude-Session: https://claude.ai/code/session_01RcPjtfzT8BCifCewpErVnb
</commit_message>
<xml_diff>
--- a/Documentacion/Documentacion.docx
+++ b/Documentacion/Documentacion.docx
@@ -13823,7 +13823,7 @@
         <w:t xml:space="preserve"> </w:t>
       </w:r>
       <w:r>
-        <w:t xml:space="preserve">bloquea teclas no permitidas mientras se escribe (nombres solo con letras; teléfono y DUI solo con números y formato automático) y</w:t>
+        <w:t xml:space="preserve">bloquea teclas no permitidas mientras se escribe (nombres solo con letras; teléfono y DUI solo con números y formato automático; usuario y correo sin espacios) y</w:t>
       </w:r>
       <w:r>
         <w:t xml:space="preserve"> </w:t>
@@ -13838,7 +13838,7 @@
         <w:t xml:space="preserve"> </w:t>
       </w:r>
       <w:r>
-        <w:t xml:space="preserve">revisa los datos al guardar (teléfono que inicia con 2, 6 o 7, DUI con formato correcto, longitudes mínimas, fechas coherentes).</w:t>
+        <w:t xml:space="preserve">revisa los datos al guardar: nombre y apellido, teléfono que inicia con 2, 6 o 7, DUI con formato y dígito verificador, correo con formato válido, contraseña segura (sin el nombre de usuario ni patrones comunes), longitudes mínimas y máximas y fechas coherentes. También se evitan los duplicados (DUI, usuario, correo, vacuna y mascota del mismo propietario), se exige que la vacuna corresponda a la especie de la mascota, que las citas estén dentro del horario de atención y separadas al menos 30 minutos por veterinario, y que siempre quede un administrador activo. Los textos se limpian antes de guardarse y los campos con error se marcan con un icono rojo.</w:t>
       </w:r>
     </w:p>
     <w:p>

</xml_diff>

<commit_message>
Reestructura el proyecto según el proyecto de referencia (Modelos con DAL, dashboardVet con FrmBase), sin comentarios; diagramas como código PlantUML
Co-Authored-By: Claude Sonnet 5.5 <noreply@anthropic.com>
Claude-Session: https://claude.ai/code/session_01RcPjtfzT8BCifCewpErVnb
</commit_message>
<xml_diff>
--- a/Documentacion/Documentacion.docx
+++ b/Documentacion/Documentacion.docx
@@ -182,7 +182,7 @@
       </w:r>
       <w:r>
         <w:tab/>
-        <w:t>8</w:t>
+        <w:t>7</w:t>
       </w:r>
     </w:p>
     <w:p>
@@ -197,7 +197,7 @@
       </w:r>
       <w:r>
         <w:tab/>
-        <w:t>12</w:t>
+        <w:t>11</w:t>
       </w:r>
     </w:p>
     <w:p>
@@ -212,7 +212,7 @@
       </w:r>
       <w:r>
         <w:tab/>
-        <w:t>15</w:t>
+        <w:t>14</w:t>
       </w:r>
     </w:p>
     <w:p>
@@ -227,7 +227,7 @@
       </w:r>
       <w:r>
         <w:tab/>
-        <w:t>15</w:t>
+        <w:t>14</w:t>
       </w:r>
     </w:p>
     <w:p>
@@ -242,7 +242,7 @@
       </w:r>
       <w:r>
         <w:tab/>
-        <w:t>21</w:t>
+        <w:t>20</w:t>
       </w:r>
     </w:p>
     <w:p>
@@ -2169,7 +2169,79 @@
         <w:pStyle w:val="FirstParagraph"/>
       </w:pPr>
       <w:r>
-        <w:t xml:space="preserve">El sistema se organiza en dos capas, Modelo y Vista, como se muestra en la Figura 1; la Tabla 3 describe la responsabilidad de cada carpeta.</w:t>
+        <w:t xml:space="preserve">El sistema se organiza en dos proyectos,</w:t>
+      </w:r>
+      <w:r>
+        <w:t xml:space="preserve"> </w:t>
+      </w:r>
+      <w:r>
+        <w:rPr>
+          <w:rStyle w:val="VerbatimChar"/>
+        </w:rPr>
+        <w:t xml:space="preserve">Modelos</w:t>
+      </w:r>
+      <w:r>
+        <w:t xml:space="preserve"> </w:t>
+      </w:r>
+      <w:r>
+        <w:t xml:space="preserve">y</w:t>
+      </w:r>
+      <w:r>
+        <w:t xml:space="preserve"> </w:t>
+      </w:r>
+      <w:r>
+        <w:rPr>
+          <w:rStyle w:val="VerbatimChar"/>
+        </w:rPr>
+        <w:t xml:space="preserve">dashboardVet</w:t>
+      </w:r>
+      <w:r>
+        <w:t xml:space="preserve"> </w:t>
+      </w:r>
+      <w:r>
+        <w:t xml:space="preserve">(la Vista), como se muestra en la Figura 1; la Tabla 3 describe la responsabilidad de cada carpeta. La estructura sigue la del proyecto de referencia de planillas: clases</w:t>
+      </w:r>
+      <w:r>
+        <w:t xml:space="preserve"> </w:t>
+      </w:r>
+      <w:r>
+        <w:rPr>
+          <w:rStyle w:val="VerbatimChar"/>
+        </w:rPr>
+        <w:t xml:space="preserve">*DAL</w:t>
+      </w:r>
+      <w:r>
+        <w:t xml:space="preserve"> </w:t>
+      </w:r>
+      <w:r>
+        <w:t xml:space="preserve">con conexión por instancia, catálogo de errores con</w:t>
+      </w:r>
+      <w:r>
+        <w:t xml:space="preserve"> </w:t>
+      </w:r>
+      <w:r>
+        <w:rPr>
+          <w:rStyle w:val="VerbatimChar"/>
+        </w:rPr>
+        <w:t xml:space="preserve">AppException</w:t>
+      </w:r>
+      <w:r>
+        <w:t xml:space="preserve">, formulario base</w:t>
+      </w:r>
+      <w:r>
+        <w:t xml:space="preserve"> </w:t>
+      </w:r>
+      <w:r>
+        <w:rPr>
+          <w:rStyle w:val="VerbatimChar"/>
+        </w:rPr>
+        <w:t xml:space="preserve">FrmBase</w:t>
+      </w:r>
+      <w:r>
+        <w:t xml:space="preserve"> </w:t>
+      </w:r>
+      <w:r>
+        <w:t xml:space="preserve">y una carpeta por pantalla.</w:t>
       </w:r>
     </w:p>
     <w:p>
@@ -2204,54 +2276,10 @@
     </w:p>
     <w:p>
       <w:pPr>
-        <w:pStyle w:val="BodyText"/>
-        <w:keepNext/>
-        <w:keepLines/>
-        <w:spacing w:line="240" w:lineRule="auto" w:before="0" w:after="120"/>
-        <w:ind w:firstLine="0"/>
-        <w:jc w:val="center"/>
-      </w:pPr>
-      <w:r>
-        <w:drawing>
-          <wp:inline>
-            <wp:extent cx="5334000" cy="3782290"/>
-            <wp:effectExtent b="0" l="0" r="0" t="0"/>
-            <wp:docPr descr="" title="" id="10" name="Picture"/>
-            <a:graphic>
-              <a:graphicData uri="http://schemas.openxmlformats.org/drawingml/2006/picture">
-                <pic:pic>
-                  <pic:nvPicPr>
-                    <pic:cNvPr descr="diagramas/arquitectura.png" id="11" name="Picture"/>
-                    <pic:cNvPicPr>
-                      <a:picLocks noChangeArrowheads="1" noChangeAspect="1"/>
-                    </pic:cNvPicPr>
-                  </pic:nvPicPr>
-                  <pic:blipFill>
-                    <a:blip r:embed="rId9"/>
-                    <a:stretch>
-                      <a:fillRect/>
-                    </a:stretch>
-                  </pic:blipFill>
-                  <pic:spPr bwMode="auto">
-                    <a:xfrm>
-                      <a:off x="0" y="0"/>
-                      <a:ext cx="5334000" cy="3782290"/>
-                    </a:xfrm>
-                    <a:prstGeom prst="rect">
-                      <a:avLst/>
-                    </a:prstGeom>
-                    <a:noFill/>
-                    <a:ln w="9525">
-                      <a:noFill/>
-                      <a:headEnd/>
-                      <a:tailEnd/>
-                    </a:ln>
-                  </pic:spPr>
-                </pic:pic>
-              </a:graphicData>
-            </a:graphic>
-          </wp:inline>
-        </w:drawing>
+        <w:pStyle w:val="FiguraEspacio"/>
+      </w:pPr>
+      <w:r>
+        <w:t xml:space="preserve">[Inserte aquí el diagrama UML generado con el código 03_arquitectura.puml]</w:t>
       </w:r>
     </w:p>
     <w:p>
@@ -2401,7 +2429,23 @@
                 <w:color w:val="000000"/>
                 <w:sz w:val="18"/>
               </w:rPr>
-              <w:t xml:space="preserve">Modelos/Conexion_DB</w:t>
+              <w:t xml:space="preserve">Modelos</w:t>
+            </w:r>
+            <w:r>
+              <w:rPr>
+                <w:rFonts w:ascii="Arial" w:hAnsi="Arial" w:cs="Arial" w:eastAsia="Arial"/>
+                <w:color w:val="000000"/>
+                <w:sz w:val="18"/>
+              </w:rPr>
+              <w:t xml:space="preserve"> </w:t>
+            </w:r>
+            <w:r>
+              <w:rPr>
+                <w:rFonts w:ascii="Arial" w:hAnsi="Arial" w:cs="Arial" w:eastAsia="Arial"/>
+                <w:color w:val="000000"/>
+                <w:sz w:val="18"/>
+              </w:rPr>
+              <w:t xml:space="preserve">(espacio de nombres único)</w:t>
             </w:r>
           </w:p>
         </w:tc>
@@ -2424,7 +2468,7 @@
                 <w:color w:val="000000"/>
                 <w:sz w:val="18"/>
               </w:rPr>
-              <w:t xml:space="preserve">Conexión a SQL Server (servidor y base de datos definidos en la clase</w:t>
+              <w:t xml:space="preserve">Capa de datos.</w:t>
             </w:r>
             <w:r>
               <w:rPr>
@@ -2449,7 +2493,431 @@
                 <w:color w:val="000000"/>
                 <w:sz w:val="18"/>
               </w:rPr>
-              <w:t xml:space="preserve">) y métodos parametrizados</w:t>
+              <w:t xml:space="preserve"> </w:t>
+            </w:r>
+            <w:r>
+              <w:rPr>
+                <w:rFonts w:ascii="Arial" w:hAnsi="Arial" w:cs="Arial" w:eastAsia="Arial"/>
+                <w:color w:val="000000"/>
+                <w:sz w:val="18"/>
+              </w:rPr>
+              <w:t xml:space="preserve">entrega la conexión a SQL Server;</w:t>
+            </w:r>
+            <w:r>
+              <w:rPr>
+                <w:rFonts w:ascii="Arial" w:hAnsi="Arial" w:cs="Arial" w:eastAsia="Arial"/>
+                <w:color w:val="000000"/>
+                <w:sz w:val="18"/>
+              </w:rPr>
+              <w:t xml:space="preserve"> </w:t>
+            </w:r>
+            <w:r>
+              <w:rPr>
+                <w:rStyle w:val="VerbatimChar"/>
+                <w:rFonts w:ascii="Arial" w:hAnsi="Arial" w:cs="Arial" w:eastAsia="Arial"/>
+                <w:color w:val="000000"/>
+                <w:sz w:val="18"/>
+              </w:rPr>
+              <w:t xml:space="preserve">DALBase</w:t>
+            </w:r>
+            <w:r>
+              <w:rPr>
+                <w:rFonts w:ascii="Arial" w:hAnsi="Arial" w:cs="Arial" w:eastAsia="Arial"/>
+                <w:color w:val="000000"/>
+                <w:sz w:val="18"/>
+              </w:rPr>
+              <w:t xml:space="preserve"> </w:t>
+            </w:r>
+            <w:r>
+              <w:rPr>
+                <w:rFonts w:ascii="Arial" w:hAnsi="Arial" w:cs="Arial" w:eastAsia="Arial"/>
+                <w:color w:val="000000"/>
+                <w:sz w:val="18"/>
+              </w:rPr>
+              <w:t xml:space="preserve">ejecuta consultas parametrizadas y traduce</w:t>
+            </w:r>
+            <w:r>
+              <w:rPr>
+                <w:rFonts w:ascii="Arial" w:hAnsi="Arial" w:cs="Arial" w:eastAsia="Arial"/>
+                <w:color w:val="000000"/>
+                <w:sz w:val="18"/>
+              </w:rPr>
+              <w:t xml:space="preserve"> </w:t>
+            </w:r>
+            <w:r>
+              <w:rPr>
+                <w:rStyle w:val="VerbatimChar"/>
+                <w:rFonts w:ascii="Arial" w:hAnsi="Arial" w:cs="Arial" w:eastAsia="Arial"/>
+                <w:color w:val="000000"/>
+                <w:sz w:val="18"/>
+              </w:rPr>
+              <w:t xml:space="preserve">SqlException</w:t>
+            </w:r>
+            <w:r>
+              <w:rPr>
+                <w:rFonts w:ascii="Arial" w:hAnsi="Arial" w:cs="Arial" w:eastAsia="Arial"/>
+                <w:color w:val="000000"/>
+                <w:sz w:val="18"/>
+              </w:rPr>
+              <w:t xml:space="preserve"> </w:t>
+            </w:r>
+            <w:r>
+              <w:rPr>
+                <w:rFonts w:ascii="Arial" w:hAnsi="Arial" w:cs="Arial" w:eastAsia="Arial"/>
+                <w:color w:val="000000"/>
+                <w:sz w:val="18"/>
+              </w:rPr>
+              <w:t xml:space="preserve">a</w:t>
+            </w:r>
+            <w:r>
+              <w:rPr>
+                <w:rFonts w:ascii="Arial" w:hAnsi="Arial" w:cs="Arial" w:eastAsia="Arial"/>
+                <w:color w:val="000000"/>
+                <w:sz w:val="18"/>
+              </w:rPr>
+              <w:t xml:space="preserve"> </w:t>
+            </w:r>
+            <w:r>
+              <w:rPr>
+                <w:rStyle w:val="VerbatimChar"/>
+                <w:rFonts w:ascii="Arial" w:hAnsi="Arial" w:cs="Arial" w:eastAsia="Arial"/>
+                <w:color w:val="000000"/>
+                <w:sz w:val="18"/>
+              </w:rPr>
+              <w:t xml:space="preserve">AppException</w:t>
+            </w:r>
+            <w:r>
+              <w:rPr>
+                <w:rFonts w:ascii="Arial" w:hAnsi="Arial" w:cs="Arial" w:eastAsia="Arial"/>
+                <w:color w:val="000000"/>
+                <w:sz w:val="18"/>
+              </w:rPr>
+              <w:t xml:space="preserve">; cada tabla tiene su clase</w:t>
+            </w:r>
+            <w:r>
+              <w:rPr>
+                <w:rFonts w:ascii="Arial" w:hAnsi="Arial" w:cs="Arial" w:eastAsia="Arial"/>
+                <w:color w:val="000000"/>
+                <w:sz w:val="18"/>
+              </w:rPr>
+              <w:t xml:space="preserve"> </w:t>
+            </w:r>
+            <w:r>
+              <w:rPr>
+                <w:rStyle w:val="VerbatimChar"/>
+                <w:rFonts w:ascii="Arial" w:hAnsi="Arial" w:cs="Arial" w:eastAsia="Arial"/>
+                <w:color w:val="000000"/>
+                <w:sz w:val="18"/>
+              </w:rPr>
+              <w:t xml:space="preserve">*DAL</w:t>
+            </w:r>
+            <w:r>
+              <w:rPr>
+                <w:rFonts w:ascii="Arial" w:hAnsi="Arial" w:cs="Arial" w:eastAsia="Arial"/>
+                <w:color w:val="000000"/>
+                <w:sz w:val="18"/>
+              </w:rPr>
+              <w:t xml:space="preserve"> </w:t>
+            </w:r>
+            <w:r>
+              <w:rPr>
+                <w:rFonts w:ascii="Arial" w:hAnsi="Arial" w:cs="Arial" w:eastAsia="Arial"/>
+                <w:color w:val="000000"/>
+                <w:sz w:val="18"/>
+              </w:rPr>
+              <w:t xml:space="preserve">(</w:t>
+            </w:r>
+            <w:r>
+              <w:rPr>
+                <w:rStyle w:val="VerbatimChar"/>
+                <w:rFonts w:ascii="Arial" w:hAnsi="Arial" w:cs="Arial" w:eastAsia="Arial"/>
+                <w:color w:val="000000"/>
+                <w:sz w:val="18"/>
+              </w:rPr>
+              <w:t xml:space="preserve">PropietarioDAL</w:t>
+            </w:r>
+            <w:r>
+              <w:rPr>
+                <w:rFonts w:ascii="Arial" w:hAnsi="Arial" w:cs="Arial" w:eastAsia="Arial"/>
+                <w:color w:val="000000"/>
+                <w:sz w:val="18"/>
+              </w:rPr>
+              <w:t xml:space="preserve">,</w:t>
+            </w:r>
+            <w:r>
+              <w:rPr>
+                <w:rFonts w:ascii="Arial" w:hAnsi="Arial" w:cs="Arial" w:eastAsia="Arial"/>
+                <w:color w:val="000000"/>
+                <w:sz w:val="18"/>
+              </w:rPr>
+              <w:t xml:space="preserve"> </w:t>
+            </w:r>
+            <w:r>
+              <w:rPr>
+                <w:rStyle w:val="VerbatimChar"/>
+                <w:rFonts w:ascii="Arial" w:hAnsi="Arial" w:cs="Arial" w:eastAsia="Arial"/>
+                <w:color w:val="000000"/>
+                <w:sz w:val="18"/>
+              </w:rPr>
+              <w:t xml:space="preserve">MascotaDAL</w:t>
+            </w:r>
+            <w:r>
+              <w:rPr>
+                <w:rFonts w:ascii="Arial" w:hAnsi="Arial" w:cs="Arial" w:eastAsia="Arial"/>
+                <w:color w:val="000000"/>
+                <w:sz w:val="18"/>
+              </w:rPr>
+              <w:t xml:space="preserve">,</w:t>
+            </w:r>
+            <w:r>
+              <w:rPr>
+                <w:rFonts w:ascii="Arial" w:hAnsi="Arial" w:cs="Arial" w:eastAsia="Arial"/>
+                <w:color w:val="000000"/>
+                <w:sz w:val="18"/>
+              </w:rPr>
+              <w:t xml:space="preserve"> </w:t>
+            </w:r>
+            <w:r>
+              <w:rPr>
+                <w:rStyle w:val="VerbatimChar"/>
+                <w:rFonts w:ascii="Arial" w:hAnsi="Arial" w:cs="Arial" w:eastAsia="Arial"/>
+                <w:color w:val="000000"/>
+                <w:sz w:val="18"/>
+              </w:rPr>
+              <w:t xml:space="preserve">CitaDAL</w:t>
+            </w:r>
+            <w:r>
+              <w:rPr>
+                <w:rFonts w:ascii="Arial" w:hAnsi="Arial" w:cs="Arial" w:eastAsia="Arial"/>
+                <w:color w:val="000000"/>
+                <w:sz w:val="18"/>
+              </w:rPr>
+              <w:t xml:space="preserve">,</w:t>
+            </w:r>
+            <w:r>
+              <w:rPr>
+                <w:rFonts w:ascii="Arial" w:hAnsi="Arial" w:cs="Arial" w:eastAsia="Arial"/>
+                <w:color w:val="000000"/>
+                <w:sz w:val="18"/>
+              </w:rPr>
+              <w:t xml:space="preserve"> </w:t>
+            </w:r>
+            <w:r>
+              <w:rPr>
+                <w:rStyle w:val="VerbatimChar"/>
+                <w:rFonts w:ascii="Arial" w:hAnsi="Arial" w:cs="Arial" w:eastAsia="Arial"/>
+                <w:color w:val="000000"/>
+                <w:sz w:val="18"/>
+              </w:rPr>
+              <w:t xml:space="preserve">ConsultaDAL</w:t>
+            </w:r>
+            <w:r>
+              <w:rPr>
+                <w:rFonts w:ascii="Arial" w:hAnsi="Arial" w:cs="Arial" w:eastAsia="Arial"/>
+                <w:color w:val="000000"/>
+                <w:sz w:val="18"/>
+              </w:rPr>
+              <w:t xml:space="preserve">,</w:t>
+            </w:r>
+            <w:r>
+              <w:rPr>
+                <w:rFonts w:ascii="Arial" w:hAnsi="Arial" w:cs="Arial" w:eastAsia="Arial"/>
+                <w:color w:val="000000"/>
+                <w:sz w:val="18"/>
+              </w:rPr>
+              <w:t xml:space="preserve"> </w:t>
+            </w:r>
+            <w:r>
+              <w:rPr>
+                <w:rStyle w:val="VerbatimChar"/>
+                <w:rFonts w:ascii="Arial" w:hAnsi="Arial" w:cs="Arial" w:eastAsia="Arial"/>
+                <w:color w:val="000000"/>
+                <w:sz w:val="18"/>
+              </w:rPr>
+              <w:t xml:space="preserve">VacunaDAL</w:t>
+            </w:r>
+            <w:r>
+              <w:rPr>
+                <w:rFonts w:ascii="Arial" w:hAnsi="Arial" w:cs="Arial" w:eastAsia="Arial"/>
+                <w:color w:val="000000"/>
+                <w:sz w:val="18"/>
+              </w:rPr>
+              <w:t xml:space="preserve">,</w:t>
+            </w:r>
+            <w:r>
+              <w:rPr>
+                <w:rFonts w:ascii="Arial" w:hAnsi="Arial" w:cs="Arial" w:eastAsia="Arial"/>
+                <w:color w:val="000000"/>
+                <w:sz w:val="18"/>
+              </w:rPr>
+              <w:t xml:space="preserve"> </w:t>
+            </w:r>
+            <w:r>
+              <w:rPr>
+                <w:rStyle w:val="VerbatimChar"/>
+                <w:rFonts w:ascii="Arial" w:hAnsi="Arial" w:cs="Arial" w:eastAsia="Arial"/>
+                <w:color w:val="000000"/>
+                <w:sz w:val="18"/>
+              </w:rPr>
+              <w:t xml:space="preserve">AplicacionVacunaDAL</w:t>
+            </w:r>
+            <w:r>
+              <w:rPr>
+                <w:rFonts w:ascii="Arial" w:hAnsi="Arial" w:cs="Arial" w:eastAsia="Arial"/>
+                <w:color w:val="000000"/>
+                <w:sz w:val="18"/>
+              </w:rPr>
+              <w:t xml:space="preserve">,</w:t>
+            </w:r>
+            <w:r>
+              <w:rPr>
+                <w:rFonts w:ascii="Arial" w:hAnsi="Arial" w:cs="Arial" w:eastAsia="Arial"/>
+                <w:color w:val="000000"/>
+                <w:sz w:val="18"/>
+              </w:rPr>
+              <w:t xml:space="preserve"> </w:t>
+            </w:r>
+            <w:r>
+              <w:rPr>
+                <w:rStyle w:val="VerbatimChar"/>
+                <w:rFonts w:ascii="Arial" w:hAnsi="Arial" w:cs="Arial" w:eastAsia="Arial"/>
+                <w:color w:val="000000"/>
+                <w:sz w:val="18"/>
+              </w:rPr>
+              <w:t xml:space="preserve">UsuarioDAL</w:t>
+            </w:r>
+            <w:r>
+              <w:rPr>
+                <w:rFonts w:ascii="Arial" w:hAnsi="Arial" w:cs="Arial" w:eastAsia="Arial"/>
+                <w:color w:val="000000"/>
+                <w:sz w:val="18"/>
+              </w:rPr>
+              <w:t xml:space="preserve">,</w:t>
+            </w:r>
+            <w:r>
+              <w:rPr>
+                <w:rFonts w:ascii="Arial" w:hAnsi="Arial" w:cs="Arial" w:eastAsia="Arial"/>
+                <w:color w:val="000000"/>
+                <w:sz w:val="18"/>
+              </w:rPr>
+              <w:t xml:space="preserve"> </w:t>
+            </w:r>
+            <w:r>
+              <w:rPr>
+                <w:rStyle w:val="VerbatimChar"/>
+                <w:rFonts w:ascii="Arial" w:hAnsi="Arial" w:cs="Arial" w:eastAsia="Arial"/>
+                <w:color w:val="000000"/>
+                <w:sz w:val="18"/>
+              </w:rPr>
+              <w:t xml:space="preserve">RolDAL</w:t>
+            </w:r>
+            <w:r>
+              <w:rPr>
+                <w:rFonts w:ascii="Arial" w:hAnsi="Arial" w:cs="Arial" w:eastAsia="Arial"/>
+                <w:color w:val="000000"/>
+                <w:sz w:val="18"/>
+              </w:rPr>
+              <w:t xml:space="preserve">,</w:t>
+            </w:r>
+            <w:r>
+              <w:rPr>
+                <w:rFonts w:ascii="Arial" w:hAnsi="Arial" w:cs="Arial" w:eastAsia="Arial"/>
+                <w:color w:val="000000"/>
+                <w:sz w:val="18"/>
+              </w:rPr>
+              <w:t xml:space="preserve"> </w:t>
+            </w:r>
+            <w:r>
+              <w:rPr>
+                <w:rStyle w:val="VerbatimChar"/>
+                <w:rFonts w:ascii="Arial" w:hAnsi="Arial" w:cs="Arial" w:eastAsia="Arial"/>
+                <w:color w:val="000000"/>
+                <w:sz w:val="18"/>
+              </w:rPr>
+              <w:t xml:space="preserve">PermisosDAL</w:t>
+            </w:r>
+            <w:r>
+              <w:rPr>
+                <w:rFonts w:ascii="Arial" w:hAnsi="Arial" w:cs="Arial" w:eastAsia="Arial"/>
+                <w:color w:val="000000"/>
+                <w:sz w:val="18"/>
+              </w:rPr>
+              <w:t xml:space="preserve">,</w:t>
+            </w:r>
+            <w:r>
+              <w:rPr>
+                <w:rFonts w:ascii="Arial" w:hAnsi="Arial" w:cs="Arial" w:eastAsia="Arial"/>
+                <w:color w:val="000000"/>
+                <w:sz w:val="18"/>
+              </w:rPr>
+              <w:t xml:space="preserve"> </w:t>
+            </w:r>
+            <w:r>
+              <w:rPr>
+                <w:rStyle w:val="VerbatimChar"/>
+                <w:rFonts w:ascii="Arial" w:hAnsi="Arial" w:cs="Arial" w:eastAsia="Arial"/>
+                <w:color w:val="000000"/>
+                <w:sz w:val="18"/>
+              </w:rPr>
+              <w:t xml:space="preserve">LoginDAL</w:t>
+            </w:r>
+            <w:r>
+              <w:rPr>
+                <w:rFonts w:ascii="Arial" w:hAnsi="Arial" w:cs="Arial" w:eastAsia="Arial"/>
+                <w:color w:val="000000"/>
+                <w:sz w:val="18"/>
+              </w:rPr>
+              <w:t xml:space="preserve">,</w:t>
+            </w:r>
+            <w:r>
+              <w:rPr>
+                <w:rFonts w:ascii="Arial" w:hAnsi="Arial" w:cs="Arial" w:eastAsia="Arial"/>
+                <w:color w:val="000000"/>
+                <w:sz w:val="18"/>
+              </w:rPr>
+              <w:t xml:space="preserve"> </w:t>
+            </w:r>
+            <w:r>
+              <w:rPr>
+                <w:rStyle w:val="VerbatimChar"/>
+                <w:rFonts w:ascii="Arial" w:hAnsi="Arial" w:cs="Arial" w:eastAsia="Arial"/>
+                <w:color w:val="000000"/>
+                <w:sz w:val="18"/>
+              </w:rPr>
+              <w:t xml:space="preserve">BitacoraDAL</w:t>
+            </w:r>
+            <w:r>
+              <w:rPr>
+                <w:rFonts w:ascii="Arial" w:hAnsi="Arial" w:cs="Arial" w:eastAsia="Arial"/>
+                <w:color w:val="000000"/>
+                <w:sz w:val="18"/>
+              </w:rPr>
+              <w:t xml:space="preserve">,</w:t>
+            </w:r>
+            <w:r>
+              <w:rPr>
+                <w:rFonts w:ascii="Arial" w:hAnsi="Arial" w:cs="Arial" w:eastAsia="Arial"/>
+                <w:color w:val="000000"/>
+                <w:sz w:val="18"/>
+              </w:rPr>
+              <w:t xml:space="preserve"> </w:t>
+            </w:r>
+            <w:r>
+              <w:rPr>
+                <w:rStyle w:val="VerbatimChar"/>
+                <w:rFonts w:ascii="Arial" w:hAnsi="Arial" w:cs="Arial" w:eastAsia="Arial"/>
+                <w:color w:val="000000"/>
+                <w:sz w:val="18"/>
+              </w:rPr>
+              <w:t xml:space="preserve">DashboardDAL</w:t>
+            </w:r>
+            <w:r>
+              <w:rPr>
+                <w:rFonts w:ascii="Arial" w:hAnsi="Arial" w:cs="Arial" w:eastAsia="Arial"/>
+                <w:color w:val="000000"/>
+                <w:sz w:val="18"/>
+              </w:rPr>
+              <w:t xml:space="preserve">)</w:t>
             </w:r>
           </w:p>
         </w:tc>
@@ -2475,7 +2943,7 @@
                 <w:color w:val="000000"/>
                 <w:sz w:val="18"/>
               </w:rPr>
-              <w:t xml:space="preserve">Modelos/Entidades</w:t>
+              <w:t xml:space="preserve">Modelos/ErroresSistema.cs</w:t>
             </w:r>
           </w:p>
         </w:tc>
@@ -2494,11 +2962,194 @@
             </w:pPr>
             <w:r>
               <w:rPr>
-                <w:rFonts w:ascii="Arial" w:hAnsi="Arial" w:cs="Arial" w:eastAsia="Arial"/>
-                <w:color w:val="000000"/>
-                <w:sz w:val="18"/>
-              </w:rPr>
-              <w:t xml:space="preserve">Clases de dominio (Usuario, Propietario, Mascota, Cita, Consulta, Vacuna…)</w:t>
+                <w:rStyle w:val="VerbatimChar"/>
+                <w:rFonts w:ascii="Arial" w:hAnsi="Arial" w:cs="Arial" w:eastAsia="Arial"/>
+                <w:color w:val="000000"/>
+                <w:sz w:val="18"/>
+              </w:rPr>
+              <w:t xml:space="preserve">CatalogoErrores</w:t>
+            </w:r>
+            <w:r>
+              <w:rPr>
+                <w:rFonts w:ascii="Arial" w:hAnsi="Arial" w:cs="Arial" w:eastAsia="Arial"/>
+                <w:color w:val="000000"/>
+                <w:sz w:val="18"/>
+              </w:rPr>
+              <w:t xml:space="preserve"> </w:t>
+            </w:r>
+            <w:r>
+              <w:rPr>
+                <w:rFonts w:ascii="Arial" w:hAnsi="Arial" w:cs="Arial" w:eastAsia="Arial"/>
+                <w:color w:val="000000"/>
+                <w:sz w:val="18"/>
+              </w:rPr>
+              <w:t xml:space="preserve">(códigos</w:t>
+            </w:r>
+            <w:r>
+              <w:rPr>
+                <w:rFonts w:ascii="Arial" w:hAnsi="Arial" w:cs="Arial" w:eastAsia="Arial"/>
+                <w:color w:val="000000"/>
+                <w:sz w:val="18"/>
+              </w:rPr>
+              <w:t xml:space="preserve"> </w:t>
+            </w:r>
+            <w:r>
+              <w:rPr>
+                <w:rStyle w:val="VerbatimChar"/>
+                <w:rFonts w:ascii="Arial" w:hAnsi="Arial" w:cs="Arial" w:eastAsia="Arial"/>
+                <w:color w:val="000000"/>
+                <w:sz w:val="18"/>
+              </w:rPr>
+              <w:t xml:space="preserve">ERR-SQL</w:t>
+            </w:r>
+            <w:r>
+              <w:rPr>
+                <w:rFonts w:ascii="Arial" w:hAnsi="Arial" w:cs="Arial" w:eastAsia="Arial"/>
+                <w:color w:val="000000"/>
+                <w:sz w:val="18"/>
+              </w:rPr>
+              <w:t xml:space="preserve">,</w:t>
+            </w:r>
+            <w:r>
+              <w:rPr>
+                <w:rFonts w:ascii="Arial" w:hAnsi="Arial" w:cs="Arial" w:eastAsia="Arial"/>
+                <w:color w:val="000000"/>
+                <w:sz w:val="18"/>
+              </w:rPr>
+              <w:t xml:space="preserve"> </w:t>
+            </w:r>
+            <w:r>
+              <w:rPr>
+                <w:rStyle w:val="VerbatimChar"/>
+                <w:rFonts w:ascii="Arial" w:hAnsi="Arial" w:cs="Arial" w:eastAsia="Arial"/>
+                <w:color w:val="000000"/>
+                <w:sz w:val="18"/>
+              </w:rPr>
+              <w:t xml:space="preserve">ERR-VAL</w:t>
+            </w:r>
+            <w:r>
+              <w:rPr>
+                <w:rFonts w:ascii="Arial" w:hAnsi="Arial" w:cs="Arial" w:eastAsia="Arial"/>
+                <w:color w:val="000000"/>
+                <w:sz w:val="18"/>
+              </w:rPr>
+              <w:t xml:space="preserve">,</w:t>
+            </w:r>
+            <w:r>
+              <w:rPr>
+                <w:rFonts w:ascii="Arial" w:hAnsi="Arial" w:cs="Arial" w:eastAsia="Arial"/>
+                <w:color w:val="000000"/>
+                <w:sz w:val="18"/>
+              </w:rPr>
+              <w:t xml:space="preserve"> </w:t>
+            </w:r>
+            <w:r>
+              <w:rPr>
+                <w:rStyle w:val="VerbatimChar"/>
+                <w:rFonts w:ascii="Arial" w:hAnsi="Arial" w:cs="Arial" w:eastAsia="Arial"/>
+                <w:color w:val="000000"/>
+                <w:sz w:val="18"/>
+              </w:rPr>
+              <w:t xml:space="preserve">ERR-NEG</w:t>
+            </w:r>
+            <w:r>
+              <w:rPr>
+                <w:rFonts w:ascii="Arial" w:hAnsi="Arial" w:cs="Arial" w:eastAsia="Arial"/>
+                <w:color w:val="000000"/>
+                <w:sz w:val="18"/>
+              </w:rPr>
+              <w:t xml:space="preserve"> </w:t>
+            </w:r>
+            <w:r>
+              <w:rPr>
+                <w:rFonts w:ascii="Arial" w:hAnsi="Arial" w:cs="Arial" w:eastAsia="Arial"/>
+                <w:color w:val="000000"/>
+                <w:sz w:val="18"/>
+              </w:rPr>
+              <w:t xml:space="preserve">y</w:t>
+            </w:r>
+            <w:r>
+              <w:rPr>
+                <w:rFonts w:ascii="Arial" w:hAnsi="Arial" w:cs="Arial" w:eastAsia="Arial"/>
+                <w:color w:val="000000"/>
+                <w:sz w:val="18"/>
+              </w:rPr>
+              <w:t xml:space="preserve"> </w:t>
+            </w:r>
+            <w:r>
+              <w:rPr>
+                <w:rStyle w:val="VerbatimChar"/>
+                <w:rFonts w:ascii="Arial" w:hAnsi="Arial" w:cs="Arial" w:eastAsia="Arial"/>
+                <w:color w:val="000000"/>
+                <w:sz w:val="18"/>
+              </w:rPr>
+              <w:t xml:space="preserve">ERR-GEN</w:t>
+            </w:r>
+            <w:r>
+              <w:rPr>
+                <w:rFonts w:ascii="Arial" w:hAnsi="Arial" w:cs="Arial" w:eastAsia="Arial"/>
+                <w:color w:val="000000"/>
+                <w:sz w:val="18"/>
+              </w:rPr>
+              <w:t xml:space="preserve"> </w:t>
+            </w:r>
+            <w:r>
+              <w:rPr>
+                <w:rFonts w:ascii="Arial" w:hAnsi="Arial" w:cs="Arial" w:eastAsia="Arial"/>
+                <w:color w:val="000000"/>
+                <w:sz w:val="18"/>
+              </w:rPr>
+              <w:t xml:space="preserve">con su mensaje),</w:t>
+            </w:r>
+            <w:r>
+              <w:rPr>
+                <w:rFonts w:ascii="Arial" w:hAnsi="Arial" w:cs="Arial" w:eastAsia="Arial"/>
+                <w:color w:val="000000"/>
+                <w:sz w:val="18"/>
+              </w:rPr>
+              <w:t xml:space="preserve"> </w:t>
+            </w:r>
+            <w:r>
+              <w:rPr>
+                <w:rStyle w:val="VerbatimChar"/>
+                <w:rFonts w:ascii="Arial" w:hAnsi="Arial" w:cs="Arial" w:eastAsia="Arial"/>
+                <w:color w:val="000000"/>
+                <w:sz w:val="18"/>
+              </w:rPr>
+              <w:t xml:space="preserve">ErrorInfo</w:t>
+            </w:r>
+            <w:r>
+              <w:rPr>
+                <w:rFonts w:ascii="Arial" w:hAnsi="Arial" w:cs="Arial" w:eastAsia="Arial"/>
+                <w:color w:val="000000"/>
+                <w:sz w:val="18"/>
+              </w:rPr>
+              <w:t xml:space="preserve"> </w:t>
+            </w:r>
+            <w:r>
+              <w:rPr>
+                <w:rFonts w:ascii="Arial" w:hAnsi="Arial" w:cs="Arial" w:eastAsia="Arial"/>
+                <w:color w:val="000000"/>
+                <w:sz w:val="18"/>
+              </w:rPr>
+              <w:t xml:space="preserve">y</w:t>
+            </w:r>
+            <w:r>
+              <w:rPr>
+                <w:rFonts w:ascii="Arial" w:hAnsi="Arial" w:cs="Arial" w:eastAsia="Arial"/>
+                <w:color w:val="000000"/>
+                <w:sz w:val="18"/>
+              </w:rPr>
+              <w:t xml:space="preserve"> </w:t>
+            </w:r>
+            <w:r>
+              <w:rPr>
+                <w:rStyle w:val="VerbatimChar"/>
+                <w:rFonts w:ascii="Arial" w:hAnsi="Arial" w:cs="Arial" w:eastAsia="Arial"/>
+                <w:color w:val="000000"/>
+                <w:sz w:val="18"/>
+              </w:rPr>
+              <w:t xml:space="preserve">AppException</w:t>
             </w:r>
           </w:p>
         </w:tc>
@@ -2524,7 +3175,57 @@
                 <w:color w:val="000000"/>
                 <w:sz w:val="18"/>
               </w:rPr>
-              <w:t xml:space="preserve">Modelos/Datos</w:t>
+              <w:t xml:space="preserve">Modelos/Sesion.cs</w:t>
+            </w:r>
+            <w:r>
+              <w:rPr>
+                <w:rFonts w:ascii="Arial" w:hAnsi="Arial" w:cs="Arial" w:eastAsia="Arial"/>
+                <w:color w:val="000000"/>
+                <w:sz w:val="18"/>
+              </w:rPr>
+              <w:t xml:space="preserve">,</w:t>
+            </w:r>
+            <w:r>
+              <w:rPr>
+                <w:rFonts w:ascii="Arial" w:hAnsi="Arial" w:cs="Arial" w:eastAsia="Arial"/>
+                <w:color w:val="000000"/>
+                <w:sz w:val="18"/>
+              </w:rPr>
+              <w:t xml:space="preserve"> </w:t>
+            </w:r>
+            <w:r>
+              <w:rPr>
+                <w:rStyle w:val="VerbatimChar"/>
+                <w:rFonts w:ascii="Arial" w:hAnsi="Arial" w:cs="Arial" w:eastAsia="Arial"/>
+                <w:color w:val="000000"/>
+                <w:sz w:val="18"/>
+              </w:rPr>
+              <w:t xml:space="preserve">EncriptadorContrasena.cs</w:t>
+            </w:r>
+            <w:r>
+              <w:rPr>
+                <w:rFonts w:ascii="Arial" w:hAnsi="Arial" w:cs="Arial" w:eastAsia="Arial"/>
+                <w:color w:val="000000"/>
+                <w:sz w:val="18"/>
+              </w:rPr>
+              <w:t xml:space="preserve">,</w:t>
+            </w:r>
+            <w:r>
+              <w:rPr>
+                <w:rFonts w:ascii="Arial" w:hAnsi="Arial" w:cs="Arial" w:eastAsia="Arial"/>
+                <w:color w:val="000000"/>
+                <w:sz w:val="18"/>
+              </w:rPr>
+              <w:t xml:space="preserve"> </w:t>
+            </w:r>
+            <w:r>
+              <w:rPr>
+                <w:rStyle w:val="VerbatimChar"/>
+                <w:rFonts w:ascii="Arial" w:hAnsi="Arial" w:cs="Arial" w:eastAsia="Arial"/>
+                <w:color w:val="000000"/>
+                <w:sz w:val="18"/>
+              </w:rPr>
+              <w:t xml:space="preserve">Logger.cs</w:t>
             </w:r>
           </w:p>
         </w:tc>
@@ -2547,7 +3248,7 @@
                 <w:color w:val="000000"/>
                 <w:sz w:val="18"/>
               </w:rPr>
-              <w:t xml:space="preserve">Operaciones CRUD por entidad (únicas con SQL)</w:t>
+              <w:t xml:space="preserve">Sesión actual y códigos de permiso, cifrado BCrypt y registro de actividades (archivo + bitácora)</w:t>
             </w:r>
           </w:p>
         </w:tc>
@@ -2573,7 +3274,7 @@
                 <w:color w:val="000000"/>
                 <w:sz w:val="18"/>
               </w:rPr>
-              <w:t xml:space="preserve">Modelos/Seguridad</w:t>
+              <w:t xml:space="preserve">dashboardVet/Base</w:t>
             </w:r>
           </w:p>
         </w:tc>
@@ -2592,11 +3293,20 @@
             </w:pPr>
             <w:r>
               <w:rPr>
-                <w:rFonts w:ascii="Arial" w:hAnsi="Arial" w:cs="Arial" w:eastAsia="Arial"/>
-                <w:color w:val="000000"/>
-                <w:sz w:val="18"/>
-              </w:rPr>
-              <w:t xml:space="preserve">Cifrado BCrypt, sesión actual y códigos de permisos</w:t>
+                <w:rStyle w:val="VerbatimChar"/>
+                <w:rFonts w:ascii="Arial" w:hAnsi="Arial" w:cs="Arial" w:eastAsia="Arial"/>
+                <w:color w:val="000000"/>
+                <w:sz w:val="18"/>
+              </w:rPr>
+              <w:t xml:space="preserve">FrmBase</w:t>
+            </w:r>
+            <w:r>
+              <w:rPr>
+                <w:rFonts w:ascii="Arial" w:hAnsi="Arial" w:cs="Arial" w:eastAsia="Arial"/>
+                <w:color w:val="000000"/>
+                <w:sz w:val="18"/>
+              </w:rPr>
+              <w:t xml:space="preserve">, formulario base del que heredan todas las pantallas</w:t>
             </w:r>
           </w:p>
         </w:tc>
@@ -2622,7 +3332,7 @@
                 <w:color w:val="000000"/>
                 <w:sz w:val="18"/>
               </w:rPr>
-              <w:t xml:space="preserve">Modelos/Utilidades</w:t>
+              <w:t xml:space="preserve">dashboardVet/Helpers</w:t>
             </w:r>
           </w:p>
         </w:tc>
@@ -2646,7 +3356,7 @@
                 <w:color w:val="000000"/>
                 <w:sz w:val="18"/>
               </w:rPr>
-              <w:t xml:space="preserve">Logger</w:t>
+              <w:t xml:space="preserve">Tema</w:t>
             </w:r>
             <w:r>
               <w:rPr>
@@ -2662,7 +3372,173 @@
                 <w:color w:val="000000"/>
                 <w:sz w:val="18"/>
               </w:rPr>
-              <w:t xml:space="preserve">(archivo + bitácora)</w:t>
+              <w:t xml:space="preserve">(paleta),</w:t>
+            </w:r>
+            <w:r>
+              <w:rPr>
+                <w:rFonts w:ascii="Arial" w:hAnsi="Arial" w:cs="Arial" w:eastAsia="Arial"/>
+                <w:color w:val="000000"/>
+                <w:sz w:val="18"/>
+              </w:rPr>
+              <w:t xml:space="preserve"> </w:t>
+            </w:r>
+            <w:r>
+              <w:rPr>
+                <w:rStyle w:val="VerbatimChar"/>
+                <w:rFonts w:ascii="Arial" w:hAnsi="Arial" w:cs="Arial" w:eastAsia="Arial"/>
+                <w:color w:val="000000"/>
+                <w:sz w:val="18"/>
+              </w:rPr>
+              <w:t xml:space="preserve">Responsive</w:t>
+            </w:r>
+            <w:r>
+              <w:rPr>
+                <w:rFonts w:ascii="Arial" w:hAnsi="Arial" w:cs="Arial" w:eastAsia="Arial"/>
+                <w:color w:val="000000"/>
+                <w:sz w:val="18"/>
+              </w:rPr>
+              <w:t xml:space="preserve"> </w:t>
+            </w:r>
+            <w:r>
+              <w:rPr>
+                <w:rFonts w:ascii="Arial" w:hAnsi="Arial" w:cs="Arial" w:eastAsia="Arial"/>
+                <w:color w:val="000000"/>
+                <w:sz w:val="18"/>
+              </w:rPr>
+              <w:t xml:space="preserve">(diseño adaptable),</w:t>
+            </w:r>
+            <w:r>
+              <w:rPr>
+                <w:rFonts w:ascii="Arial" w:hAnsi="Arial" w:cs="Arial" w:eastAsia="Arial"/>
+                <w:color w:val="000000"/>
+                <w:sz w:val="18"/>
+              </w:rPr>
+              <w:t xml:space="preserve"> </w:t>
+            </w:r>
+            <w:r>
+              <w:rPr>
+                <w:rStyle w:val="VerbatimChar"/>
+                <w:rFonts w:ascii="Arial" w:hAnsi="Arial" w:cs="Arial" w:eastAsia="Arial"/>
+                <w:color w:val="000000"/>
+                <w:sz w:val="18"/>
+              </w:rPr>
+              <w:t xml:space="preserve">Mensajes</w:t>
+            </w:r>
+            <w:r>
+              <w:rPr>
+                <w:rFonts w:ascii="Arial" w:hAnsi="Arial" w:cs="Arial" w:eastAsia="Arial"/>
+                <w:color w:val="000000"/>
+                <w:sz w:val="18"/>
+              </w:rPr>
+              <w:t xml:space="preserve"> </w:t>
+            </w:r>
+            <w:r>
+              <w:rPr>
+                <w:rFonts w:ascii="Arial" w:hAnsi="Arial" w:cs="Arial" w:eastAsia="Arial"/>
+                <w:color w:val="000000"/>
+                <w:sz w:val="18"/>
+              </w:rPr>
+              <w:t xml:space="preserve">(MessageBox de aviso y confirmación),</w:t>
+            </w:r>
+            <w:r>
+              <w:rPr>
+                <w:rFonts w:ascii="Arial" w:hAnsi="Arial" w:cs="Arial" w:eastAsia="Arial"/>
+                <w:color w:val="000000"/>
+                <w:sz w:val="18"/>
+              </w:rPr>
+              <w:t xml:space="preserve"> </w:t>
+            </w:r>
+            <w:r>
+              <w:rPr>
+                <w:rStyle w:val="VerbatimChar"/>
+                <w:rFonts w:ascii="Arial" w:hAnsi="Arial" w:cs="Arial" w:eastAsia="Arial"/>
+                <w:color w:val="000000"/>
+                <w:sz w:val="18"/>
+              </w:rPr>
+              <w:t xml:space="preserve">Validaciones</w:t>
+            </w:r>
+            <w:r>
+              <w:rPr>
+                <w:rFonts w:ascii="Arial" w:hAnsi="Arial" w:cs="Arial" w:eastAsia="Arial"/>
+                <w:color w:val="000000"/>
+                <w:sz w:val="18"/>
+              </w:rPr>
+              <w:t xml:space="preserve">,</w:t>
+            </w:r>
+            <w:r>
+              <w:rPr>
+                <w:rFonts w:ascii="Arial" w:hAnsi="Arial" w:cs="Arial" w:eastAsia="Arial"/>
+                <w:color w:val="000000"/>
+                <w:sz w:val="18"/>
+              </w:rPr>
+              <w:t xml:space="preserve"> </w:t>
+            </w:r>
+            <w:r>
+              <w:rPr>
+                <w:rStyle w:val="VerbatimChar"/>
+                <w:rFonts w:ascii="Arial" w:hAnsi="Arial" w:cs="Arial" w:eastAsia="Arial"/>
+                <w:color w:val="000000"/>
+                <w:sz w:val="18"/>
+              </w:rPr>
+              <w:t xml:space="preserve">Entrada</w:t>
+            </w:r>
+            <w:r>
+              <w:rPr>
+                <w:rFonts w:ascii="Arial" w:hAnsi="Arial" w:cs="Arial" w:eastAsia="Arial"/>
+                <w:color w:val="000000"/>
+                <w:sz w:val="18"/>
+              </w:rPr>
+              <w:t xml:space="preserve">,</w:t>
+            </w:r>
+            <w:r>
+              <w:rPr>
+                <w:rFonts w:ascii="Arial" w:hAnsi="Arial" w:cs="Arial" w:eastAsia="Arial"/>
+                <w:color w:val="000000"/>
+                <w:sz w:val="18"/>
+              </w:rPr>
+              <w:t xml:space="preserve"> </w:t>
+            </w:r>
+            <w:r>
+              <w:rPr>
+                <w:rStyle w:val="VerbatimChar"/>
+                <w:rFonts w:ascii="Arial" w:hAnsi="Arial" w:cs="Arial" w:eastAsia="Arial"/>
+                <w:color w:val="000000"/>
+                <w:sz w:val="18"/>
+              </w:rPr>
+              <w:t xml:space="preserve">Texto</w:t>
+            </w:r>
+            <w:r>
+              <w:rPr>
+                <w:rFonts w:ascii="Arial" w:hAnsi="Arial" w:cs="Arial" w:eastAsia="Arial"/>
+                <w:color w:val="000000"/>
+                <w:sz w:val="18"/>
+              </w:rPr>
+              <w:t xml:space="preserve"> </w:t>
+            </w:r>
+            <w:r>
+              <w:rPr>
+                <w:rFonts w:ascii="Arial" w:hAnsi="Arial" w:cs="Arial" w:eastAsia="Arial"/>
+                <w:color w:val="000000"/>
+                <w:sz w:val="18"/>
+              </w:rPr>
+              <w:t xml:space="preserve">y</w:t>
+            </w:r>
+            <w:r>
+              <w:rPr>
+                <w:rFonts w:ascii="Arial" w:hAnsi="Arial" w:cs="Arial" w:eastAsia="Arial"/>
+                <w:color w:val="000000"/>
+                <w:sz w:val="18"/>
+              </w:rPr>
+              <w:t xml:space="preserve"> </w:t>
+            </w:r>
+            <w:r>
+              <w:rPr>
+                <w:rStyle w:val="VerbatimChar"/>
+                <w:rFonts w:ascii="Arial" w:hAnsi="Arial" w:cs="Arial" w:eastAsia="Arial"/>
+                <w:color w:val="000000"/>
+                <w:sz w:val="18"/>
+              </w:rPr>
+              <w:t xml:space="preserve">GridUtil</w:t>
             </w:r>
           </w:p>
         </w:tc>
@@ -2688,7 +3564,7 @@
                 <w:color w:val="000000"/>
                 <w:sz w:val="18"/>
               </w:rPr>
-              <w:t xml:space="preserve">Vista/Comun</w:t>
+              <w:t xml:space="preserve">dashboardVet/Controles</w:t>
             </w:r>
           </w:p>
         </w:tc>
@@ -2707,12 +3583,36 @@
             </w:pPr>
             <w:r>
               <w:rPr>
+                <w:rFonts w:ascii="Arial" w:hAnsi="Arial" w:cs="Arial" w:eastAsia="Arial"/>
+                <w:color w:val="000000"/>
+                <w:sz w:val="18"/>
+              </w:rPr>
+              <w:t xml:space="preserve">Controles propios:</w:t>
+            </w:r>
+            <w:r>
+              <w:rPr>
+                <w:rFonts w:ascii="Arial" w:hAnsi="Arial" w:cs="Arial" w:eastAsia="Arial"/>
+                <w:color w:val="000000"/>
+                <w:sz w:val="18"/>
+              </w:rPr>
+              <w:t xml:space="preserve"> </w:t>
+            </w:r>
+            <w:r>
+              <w:rPr>
                 <w:rStyle w:val="VerbatimChar"/>
                 <w:rFonts w:ascii="Arial" w:hAnsi="Arial" w:cs="Arial" w:eastAsia="Arial"/>
                 <w:color w:val="000000"/>
                 <w:sz w:val="18"/>
               </w:rPr>
-              <w:t xml:space="preserve">Tema</w:t>
+              <w:t xml:space="preserve">BotonModerno</w:t>
+            </w:r>
+            <w:r>
+              <w:rPr>
+                <w:rFonts w:ascii="Arial" w:hAnsi="Arial" w:cs="Arial" w:eastAsia="Arial"/>
+                <w:color w:val="000000"/>
+                <w:sz w:val="18"/>
+              </w:rPr>
+              <w:t xml:space="preserve">,</w:t>
             </w:r>
             <w:r>
               <w:rPr>
@@ -2724,20 +3624,12 @@
             </w:r>
             <w:r>
               <w:rPr>
-                <w:rFonts w:ascii="Arial" w:hAnsi="Arial" w:cs="Arial" w:eastAsia="Arial"/>
-                <w:color w:val="000000"/>
-                <w:sz w:val="18"/>
-              </w:rPr>
-              <w:t xml:space="preserve">(paleta), controles propios (</w:t>
-            </w:r>
-            <w:r>
-              <w:rPr>
                 <w:rStyle w:val="VerbatimChar"/>
                 <w:rFonts w:ascii="Arial" w:hAnsi="Arial" w:cs="Arial" w:eastAsia="Arial"/>
                 <w:color w:val="000000"/>
                 <w:sz w:val="18"/>
               </w:rPr>
-              <w:t xml:space="preserve">BotonModerno</w:t>
+              <w:t xml:space="preserve">BotonMenu</w:t>
             </w:r>
             <w:r>
               <w:rPr>
@@ -2762,15 +3654,7 @@
                 <w:color w:val="000000"/>
                 <w:sz w:val="18"/>
               </w:rPr>
-              <w:t xml:space="preserve">BotonMenu</w:t>
-            </w:r>
-            <w:r>
-              <w:rPr>
-                <w:rFonts w:ascii="Arial" w:hAnsi="Arial" w:cs="Arial" w:eastAsia="Arial"/>
-                <w:color w:val="000000"/>
-                <w:sz w:val="18"/>
-              </w:rPr>
-              <w:t xml:space="preserve">,</w:t>
+              <w:t xml:space="preserve">PanelTarjeta</w:t>
             </w:r>
             <w:r>
               <w:rPr>
@@ -2782,29 +3666,46 @@
             </w:r>
             <w:r>
               <w:rPr>
+                <w:rFonts w:ascii="Arial" w:hAnsi="Arial" w:cs="Arial" w:eastAsia="Arial"/>
+                <w:color w:val="000000"/>
+                <w:sz w:val="18"/>
+              </w:rPr>
+              <w:t xml:space="preserve">y</w:t>
+            </w:r>
+            <w:r>
+              <w:rPr>
+                <w:rFonts w:ascii="Arial" w:hAnsi="Arial" w:cs="Arial" w:eastAsia="Arial"/>
+                <w:color w:val="000000"/>
+                <w:sz w:val="18"/>
+              </w:rPr>
+              <w:t xml:space="preserve"> </w:t>
+            </w:r>
+            <w:r>
+              <w:rPr>
                 <w:rStyle w:val="VerbatimChar"/>
                 <w:rFonts w:ascii="Arial" w:hAnsi="Arial" w:cs="Arial" w:eastAsia="Arial"/>
                 <w:color w:val="000000"/>
                 <w:sz w:val="18"/>
               </w:rPr>
-              <w:t xml:space="preserve">PanelTarjeta</w:t>
-            </w:r>
-            <w:r>
-              <w:rPr>
-                <w:rFonts w:ascii="Arial" w:hAnsi="Arial" w:cs="Arial" w:eastAsia="Arial"/>
-                <w:color w:val="000000"/>
-                <w:sz w:val="18"/>
-              </w:rPr>
-              <w:t xml:space="preserve">,</w:t>
-            </w:r>
-            <w:r>
-              <w:rPr>
-                <w:rFonts w:ascii="Arial" w:hAnsi="Arial" w:cs="Arial" w:eastAsia="Arial"/>
-                <w:color w:val="000000"/>
-                <w:sz w:val="18"/>
-              </w:rPr>
-              <w:t xml:space="preserve"> </w:t>
-            </w:r>
+              <w:t xml:space="preserve">PanelDegradado</w:t>
+            </w:r>
+          </w:p>
+        </w:tc>
+      </w:tr>
+      <w:tr>
+        <w:tc>
+          <w:tcPr>
+            <w:tcW w:type="dxa" w:w="3312"/>
+          </w:tcPr>
+          <w:p>
+            <w:pPr>
+              <w:pStyle w:val="Compact"/>
+              <w:keepNext/>
+              <w:keepLines/>
+              <w:spacing w:after="0" w:before="0" w:line="240" w:lineRule="auto"/>
+              <w:ind w:firstLine="0"/>
+              <w:jc w:val="left"/>
+            </w:pPr>
             <w:r>
               <w:rPr>
                 <w:rStyle w:val="VerbatimChar"/>
@@ -2812,123 +3713,30 @@
                 <w:color w:val="000000"/>
                 <w:sz w:val="18"/>
               </w:rPr>
-              <w:t xml:space="preserve">PanelDegradado</w:t>
-            </w:r>
-            <w:r>
-              <w:rPr>
-                <w:rFonts w:ascii="Arial" w:hAnsi="Arial" w:cs="Arial" w:eastAsia="Arial"/>
-                <w:color w:val="000000"/>
-                <w:sz w:val="18"/>
-              </w:rPr>
-              <w:t xml:space="preserve">),</w:t>
-            </w:r>
-            <w:r>
-              <w:rPr>
-                <w:rFonts w:ascii="Arial" w:hAnsi="Arial" w:cs="Arial" w:eastAsia="Arial"/>
-                <w:color w:val="000000"/>
-                <w:sz w:val="18"/>
-              </w:rPr>
-              <w:t xml:space="preserve"> </w:t>
-            </w:r>
-            <w:r>
-              <w:rPr>
-                <w:rStyle w:val="VerbatimChar"/>
-                <w:rFonts w:ascii="Arial" w:hAnsi="Arial" w:cs="Arial" w:eastAsia="Arial"/>
-                <w:color w:val="000000"/>
-                <w:sz w:val="18"/>
-              </w:rPr>
-              <w:t xml:space="preserve">Responsive</w:t>
-            </w:r>
-            <w:r>
-              <w:rPr>
-                <w:rFonts w:ascii="Arial" w:hAnsi="Arial" w:cs="Arial" w:eastAsia="Arial"/>
-                <w:color w:val="000000"/>
-                <w:sz w:val="18"/>
-              </w:rPr>
-              <w:t xml:space="preserve"> </w:t>
-            </w:r>
-            <w:r>
-              <w:rPr>
-                <w:rFonts w:ascii="Arial" w:hAnsi="Arial" w:cs="Arial" w:eastAsia="Arial"/>
-                <w:color w:val="000000"/>
-                <w:sz w:val="18"/>
-              </w:rPr>
-              <w:t xml:space="preserve">(diseño adaptable),</w:t>
-            </w:r>
-            <w:r>
-              <w:rPr>
-                <w:rFonts w:ascii="Arial" w:hAnsi="Arial" w:cs="Arial" w:eastAsia="Arial"/>
-                <w:color w:val="000000"/>
-                <w:sz w:val="18"/>
-              </w:rPr>
-              <w:t xml:space="preserve"> </w:t>
-            </w:r>
-            <w:r>
-              <w:rPr>
-                <w:rStyle w:val="VerbatimChar"/>
-                <w:rFonts w:ascii="Arial" w:hAnsi="Arial" w:cs="Arial" w:eastAsia="Arial"/>
-                <w:color w:val="000000"/>
-                <w:sz w:val="18"/>
-              </w:rPr>
-              <w:t xml:space="preserve">Mensajes</w:t>
-            </w:r>
-            <w:r>
-              <w:rPr>
-                <w:rFonts w:ascii="Arial" w:hAnsi="Arial" w:cs="Arial" w:eastAsia="Arial"/>
-                <w:color w:val="000000"/>
-                <w:sz w:val="18"/>
-              </w:rPr>
-              <w:t xml:space="preserve"> </w:t>
-            </w:r>
-            <w:r>
-              <w:rPr>
-                <w:rFonts w:ascii="Arial" w:hAnsi="Arial" w:cs="Arial" w:eastAsia="Arial"/>
-                <w:color w:val="000000"/>
-                <w:sz w:val="18"/>
-              </w:rPr>
-              <w:t xml:space="preserve">(MessageBox y errores SQL),</w:t>
-            </w:r>
-            <w:r>
-              <w:rPr>
-                <w:rFonts w:ascii="Arial" w:hAnsi="Arial" w:cs="Arial" w:eastAsia="Arial"/>
-                <w:color w:val="000000"/>
-                <w:sz w:val="18"/>
-              </w:rPr>
-              <w:t xml:space="preserve"> </w:t>
-            </w:r>
-            <w:r>
-              <w:rPr>
-                <w:rStyle w:val="VerbatimChar"/>
-                <w:rFonts w:ascii="Arial" w:hAnsi="Arial" w:cs="Arial" w:eastAsia="Arial"/>
-                <w:color w:val="000000"/>
-                <w:sz w:val="18"/>
-              </w:rPr>
-              <w:t xml:space="preserve">Validaciones</w:t>
-            </w:r>
-            <w:r>
-              <w:rPr>
-                <w:rFonts w:ascii="Arial" w:hAnsi="Arial" w:cs="Arial" w:eastAsia="Arial"/>
-                <w:color w:val="000000"/>
-                <w:sz w:val="18"/>
-              </w:rPr>
-              <w:t xml:space="preserve">,</w:t>
-            </w:r>
-            <w:r>
-              <w:rPr>
-                <w:rFonts w:ascii="Arial" w:hAnsi="Arial" w:cs="Arial" w:eastAsia="Arial"/>
-                <w:color w:val="000000"/>
-                <w:sz w:val="18"/>
-              </w:rPr>
-              <w:t xml:space="preserve"> </w:t>
-            </w:r>
-            <w:r>
-              <w:rPr>
-                <w:rStyle w:val="VerbatimChar"/>
-                <w:rFonts w:ascii="Arial" w:hAnsi="Arial" w:cs="Arial" w:eastAsia="Arial"/>
-                <w:color w:val="000000"/>
-                <w:sz w:val="18"/>
-              </w:rPr>
-              <w:t xml:space="preserve">GridUtil</w:t>
+              <w:t xml:space="preserve">dashboardVet/ManejadorUIErrores.cs</w:t>
+            </w:r>
+          </w:p>
+        </w:tc>
+        <w:tc>
+          <w:tcPr>
+            <w:tcW w:type="dxa" w:w="6048"/>
+          </w:tcPr>
+          <w:p>
+            <w:pPr>
+              <w:pStyle w:val="Compact"/>
+              <w:keepNext/>
+              <w:keepLines/>
+              <w:spacing w:after="0" w:before="0" w:line="240" w:lineRule="auto"/>
+              <w:ind w:firstLine="0"/>
+              <w:jc w:val="left"/>
+            </w:pPr>
+            <w:r>
+              <w:rPr>
+                <w:rFonts w:ascii="Arial" w:hAnsi="Arial" w:cs="Arial" w:eastAsia="Arial"/>
+                <w:color w:val="000000"/>
+                <w:sz w:val="18"/>
+              </w:rPr>
+              <w:t xml:space="preserve">Muestra el mensaje y el código de cualquier error, lo registra en la bitácora y asigna tooltips a los controles</w:t>
             </w:r>
           </w:p>
         </w:tc>
@@ -2956,7 +3764,7 @@
                 <w:color w:val="000000"/>
                 <w:sz w:val="18"/>
               </w:rPr>
-              <w:t xml:space="preserve">Vista/&lt;Módulo&gt;</w:t>
+              <w:t xml:space="preserve">dashboardVet/&lt;Pantalla&gt;</w:t>
             </w:r>
           </w:p>
         </w:tc>
@@ -2981,7 +3789,324 @@
                 <w:color w:val="000000"/>
                 <w:sz w:val="18"/>
               </w:rPr>
-              <w:t xml:space="preserve">Formularios agrupados por funcionalidad; cada uno con su</w:t>
+              <w:t xml:space="preserve">Una carpeta por pantalla (</w:t>
+            </w:r>
+            <w:r>
+              <w:rPr>
+                <w:rStyle w:val="VerbatimChar"/>
+                <w:rFonts w:ascii="Arial" w:hAnsi="Arial" w:cs="Arial" w:eastAsia="Arial"/>
+                <w:color w:val="000000"/>
+                <w:sz w:val="18"/>
+              </w:rPr>
+              <w:t xml:space="preserve">Login</w:t>
+            </w:r>
+            <w:r>
+              <w:rPr>
+                <w:rFonts w:ascii="Arial" w:hAnsi="Arial" w:cs="Arial" w:eastAsia="Arial"/>
+                <w:color w:val="000000"/>
+                <w:sz w:val="18"/>
+              </w:rPr>
+              <w:t xml:space="preserve">,</w:t>
+            </w:r>
+            <w:r>
+              <w:rPr>
+                <w:rFonts w:ascii="Arial" w:hAnsi="Arial" w:cs="Arial" w:eastAsia="Arial"/>
+                <w:color w:val="000000"/>
+                <w:sz w:val="18"/>
+              </w:rPr>
+              <w:t xml:space="preserve"> </w:t>
+            </w:r>
+            <w:r>
+              <w:rPr>
+                <w:rStyle w:val="VerbatimChar"/>
+                <w:rFonts w:ascii="Arial" w:hAnsi="Arial" w:cs="Arial" w:eastAsia="Arial"/>
+                <w:color w:val="000000"/>
+                <w:sz w:val="18"/>
+              </w:rPr>
+              <w:t xml:space="preserve">DashBoard</w:t>
+            </w:r>
+            <w:r>
+              <w:rPr>
+                <w:rFonts w:ascii="Arial" w:hAnsi="Arial" w:cs="Arial" w:eastAsia="Arial"/>
+                <w:color w:val="000000"/>
+                <w:sz w:val="18"/>
+              </w:rPr>
+              <w:t xml:space="preserve">,</w:t>
+            </w:r>
+            <w:r>
+              <w:rPr>
+                <w:rFonts w:ascii="Arial" w:hAnsi="Arial" w:cs="Arial" w:eastAsia="Arial"/>
+                <w:color w:val="000000"/>
+                <w:sz w:val="18"/>
+              </w:rPr>
+              <w:t xml:space="preserve"> </w:t>
+            </w:r>
+            <w:r>
+              <w:rPr>
+                <w:rStyle w:val="VerbatimChar"/>
+                <w:rFonts w:ascii="Arial" w:hAnsi="Arial" w:cs="Arial" w:eastAsia="Arial"/>
+                <w:color w:val="000000"/>
+                <w:sz w:val="18"/>
+              </w:rPr>
+              <w:t xml:space="preserve">Inicio</w:t>
+            </w:r>
+            <w:r>
+              <w:rPr>
+                <w:rFonts w:ascii="Arial" w:hAnsi="Arial" w:cs="Arial" w:eastAsia="Arial"/>
+                <w:color w:val="000000"/>
+                <w:sz w:val="18"/>
+              </w:rPr>
+              <w:t xml:space="preserve">,</w:t>
+            </w:r>
+            <w:r>
+              <w:rPr>
+                <w:rFonts w:ascii="Arial" w:hAnsi="Arial" w:cs="Arial" w:eastAsia="Arial"/>
+                <w:color w:val="000000"/>
+                <w:sz w:val="18"/>
+              </w:rPr>
+              <w:t xml:space="preserve"> </w:t>
+            </w:r>
+            <w:r>
+              <w:rPr>
+                <w:rStyle w:val="VerbatimChar"/>
+                <w:rFonts w:ascii="Arial" w:hAnsi="Arial" w:cs="Arial" w:eastAsia="Arial"/>
+                <w:color w:val="000000"/>
+                <w:sz w:val="18"/>
+              </w:rPr>
+              <w:t xml:space="preserve">Propietarios</w:t>
+            </w:r>
+            <w:r>
+              <w:rPr>
+                <w:rFonts w:ascii="Arial" w:hAnsi="Arial" w:cs="Arial" w:eastAsia="Arial"/>
+                <w:color w:val="000000"/>
+                <w:sz w:val="18"/>
+              </w:rPr>
+              <w:t xml:space="preserve">,</w:t>
+            </w:r>
+            <w:r>
+              <w:rPr>
+                <w:rFonts w:ascii="Arial" w:hAnsi="Arial" w:cs="Arial" w:eastAsia="Arial"/>
+                <w:color w:val="000000"/>
+                <w:sz w:val="18"/>
+              </w:rPr>
+              <w:t xml:space="preserve"> </w:t>
+            </w:r>
+            <w:r>
+              <w:rPr>
+                <w:rStyle w:val="VerbatimChar"/>
+                <w:rFonts w:ascii="Arial" w:hAnsi="Arial" w:cs="Arial" w:eastAsia="Arial"/>
+                <w:color w:val="000000"/>
+                <w:sz w:val="18"/>
+              </w:rPr>
+              <w:t xml:space="preserve">Mascotas</w:t>
+            </w:r>
+            <w:r>
+              <w:rPr>
+                <w:rFonts w:ascii="Arial" w:hAnsi="Arial" w:cs="Arial" w:eastAsia="Arial"/>
+                <w:color w:val="000000"/>
+                <w:sz w:val="18"/>
+              </w:rPr>
+              <w:t xml:space="preserve">,</w:t>
+            </w:r>
+            <w:r>
+              <w:rPr>
+                <w:rFonts w:ascii="Arial" w:hAnsi="Arial" w:cs="Arial" w:eastAsia="Arial"/>
+                <w:color w:val="000000"/>
+                <w:sz w:val="18"/>
+              </w:rPr>
+              <w:t xml:space="preserve"> </w:t>
+            </w:r>
+            <w:r>
+              <w:rPr>
+                <w:rStyle w:val="VerbatimChar"/>
+                <w:rFonts w:ascii="Arial" w:hAnsi="Arial" w:cs="Arial" w:eastAsia="Arial"/>
+                <w:color w:val="000000"/>
+                <w:sz w:val="18"/>
+              </w:rPr>
+              <w:t xml:space="preserve">Citas</w:t>
+            </w:r>
+            <w:r>
+              <w:rPr>
+                <w:rFonts w:ascii="Arial" w:hAnsi="Arial" w:cs="Arial" w:eastAsia="Arial"/>
+                <w:color w:val="000000"/>
+                <w:sz w:val="18"/>
+              </w:rPr>
+              <w:t xml:space="preserve">,</w:t>
+            </w:r>
+            <w:r>
+              <w:rPr>
+                <w:rFonts w:ascii="Arial" w:hAnsi="Arial" w:cs="Arial" w:eastAsia="Arial"/>
+                <w:color w:val="000000"/>
+                <w:sz w:val="18"/>
+              </w:rPr>
+              <w:t xml:space="preserve"> </w:t>
+            </w:r>
+            <w:r>
+              <w:rPr>
+                <w:rStyle w:val="VerbatimChar"/>
+                <w:rFonts w:ascii="Arial" w:hAnsi="Arial" w:cs="Arial" w:eastAsia="Arial"/>
+                <w:color w:val="000000"/>
+                <w:sz w:val="18"/>
+              </w:rPr>
+              <w:t xml:space="preserve">Consultas</w:t>
+            </w:r>
+            <w:r>
+              <w:rPr>
+                <w:rFonts w:ascii="Arial" w:hAnsi="Arial" w:cs="Arial" w:eastAsia="Arial"/>
+                <w:color w:val="000000"/>
+                <w:sz w:val="18"/>
+              </w:rPr>
+              <w:t xml:space="preserve">,</w:t>
+            </w:r>
+            <w:r>
+              <w:rPr>
+                <w:rFonts w:ascii="Arial" w:hAnsi="Arial" w:cs="Arial" w:eastAsia="Arial"/>
+                <w:color w:val="000000"/>
+                <w:sz w:val="18"/>
+              </w:rPr>
+              <w:t xml:space="preserve"> </w:t>
+            </w:r>
+            <w:r>
+              <w:rPr>
+                <w:rStyle w:val="VerbatimChar"/>
+                <w:rFonts w:ascii="Arial" w:hAnsi="Arial" w:cs="Arial" w:eastAsia="Arial"/>
+                <w:color w:val="000000"/>
+                <w:sz w:val="18"/>
+              </w:rPr>
+              <w:t xml:space="preserve">Vacunas</w:t>
+            </w:r>
+            <w:r>
+              <w:rPr>
+                <w:rFonts w:ascii="Arial" w:hAnsi="Arial" w:cs="Arial" w:eastAsia="Arial"/>
+                <w:color w:val="000000"/>
+                <w:sz w:val="18"/>
+              </w:rPr>
+              <w:t xml:space="preserve">,</w:t>
+            </w:r>
+            <w:r>
+              <w:rPr>
+                <w:rFonts w:ascii="Arial" w:hAnsi="Arial" w:cs="Arial" w:eastAsia="Arial"/>
+                <w:color w:val="000000"/>
+                <w:sz w:val="18"/>
+              </w:rPr>
+              <w:t xml:space="preserve"> </w:t>
+            </w:r>
+            <w:r>
+              <w:rPr>
+                <w:rStyle w:val="VerbatimChar"/>
+                <w:rFonts w:ascii="Arial" w:hAnsi="Arial" w:cs="Arial" w:eastAsia="Arial"/>
+                <w:color w:val="000000"/>
+                <w:sz w:val="18"/>
+              </w:rPr>
+              <w:t xml:space="preserve">CatalogoVacunas</w:t>
+            </w:r>
+            <w:r>
+              <w:rPr>
+                <w:rFonts w:ascii="Arial" w:hAnsi="Arial" w:cs="Arial" w:eastAsia="Arial"/>
+                <w:color w:val="000000"/>
+                <w:sz w:val="18"/>
+              </w:rPr>
+              <w:t xml:space="preserve">,</w:t>
+            </w:r>
+            <w:r>
+              <w:rPr>
+                <w:rFonts w:ascii="Arial" w:hAnsi="Arial" w:cs="Arial" w:eastAsia="Arial"/>
+                <w:color w:val="000000"/>
+                <w:sz w:val="18"/>
+              </w:rPr>
+              <w:t xml:space="preserve"> </w:t>
+            </w:r>
+            <w:r>
+              <w:rPr>
+                <w:rStyle w:val="VerbatimChar"/>
+                <w:rFonts w:ascii="Arial" w:hAnsi="Arial" w:cs="Arial" w:eastAsia="Arial"/>
+                <w:color w:val="000000"/>
+                <w:sz w:val="18"/>
+              </w:rPr>
+              <w:t xml:space="preserve">AplicacionVacunas</w:t>
+            </w:r>
+            <w:r>
+              <w:rPr>
+                <w:rFonts w:ascii="Arial" w:hAnsi="Arial" w:cs="Arial" w:eastAsia="Arial"/>
+                <w:color w:val="000000"/>
+                <w:sz w:val="18"/>
+              </w:rPr>
+              <w:t xml:space="preserve">,</w:t>
+            </w:r>
+            <w:r>
+              <w:rPr>
+                <w:rFonts w:ascii="Arial" w:hAnsi="Arial" w:cs="Arial" w:eastAsia="Arial"/>
+                <w:color w:val="000000"/>
+                <w:sz w:val="18"/>
+              </w:rPr>
+              <w:t xml:space="preserve"> </w:t>
+            </w:r>
+            <w:r>
+              <w:rPr>
+                <w:rStyle w:val="VerbatimChar"/>
+                <w:rFonts w:ascii="Arial" w:hAnsi="Arial" w:cs="Arial" w:eastAsia="Arial"/>
+                <w:color w:val="000000"/>
+                <w:sz w:val="18"/>
+              </w:rPr>
+              <w:t xml:space="preserve">Usuarios</w:t>
+            </w:r>
+            <w:r>
+              <w:rPr>
+                <w:rFonts w:ascii="Arial" w:hAnsi="Arial" w:cs="Arial" w:eastAsia="Arial"/>
+                <w:color w:val="000000"/>
+                <w:sz w:val="18"/>
+              </w:rPr>
+              <w:t xml:space="preserve">,</w:t>
+            </w:r>
+            <w:r>
+              <w:rPr>
+                <w:rFonts w:ascii="Arial" w:hAnsi="Arial" w:cs="Arial" w:eastAsia="Arial"/>
+                <w:color w:val="000000"/>
+                <w:sz w:val="18"/>
+              </w:rPr>
+              <w:t xml:space="preserve"> </w:t>
+            </w:r>
+            <w:r>
+              <w:rPr>
+                <w:rStyle w:val="VerbatimChar"/>
+                <w:rFonts w:ascii="Arial" w:hAnsi="Arial" w:cs="Arial" w:eastAsia="Arial"/>
+                <w:color w:val="000000"/>
+                <w:sz w:val="18"/>
+              </w:rPr>
+              <w:t xml:space="preserve">Roles</w:t>
+            </w:r>
+            <w:r>
+              <w:rPr>
+                <w:rFonts w:ascii="Arial" w:hAnsi="Arial" w:cs="Arial" w:eastAsia="Arial"/>
+                <w:color w:val="000000"/>
+                <w:sz w:val="18"/>
+              </w:rPr>
+              <w:t xml:space="preserve">,</w:t>
+            </w:r>
+            <w:r>
+              <w:rPr>
+                <w:rFonts w:ascii="Arial" w:hAnsi="Arial" w:cs="Arial" w:eastAsia="Arial"/>
+                <w:color w:val="000000"/>
+                <w:sz w:val="18"/>
+              </w:rPr>
+              <w:t xml:space="preserve"> </w:t>
+            </w:r>
+            <w:r>
+              <w:rPr>
+                <w:rStyle w:val="VerbatimChar"/>
+                <w:rFonts w:ascii="Arial" w:hAnsi="Arial" w:cs="Arial" w:eastAsia="Arial"/>
+                <w:color w:val="000000"/>
+                <w:sz w:val="18"/>
+              </w:rPr>
+              <w:t xml:space="preserve">Bitacora</w:t>
+            </w:r>
+            <w:r>
+              <w:rPr>
+                <w:rFonts w:ascii="Arial" w:hAnsi="Arial" w:cs="Arial" w:eastAsia="Arial"/>
+                <w:color w:val="000000"/>
+                <w:sz w:val="18"/>
+              </w:rPr>
+              <w:t xml:space="preserve">) con su</w:t>
             </w:r>
             <w:r>
               <w:rPr>
@@ -3101,54 +4226,10 @@
     </w:p>
     <w:p>
       <w:pPr>
-        <w:pStyle w:val="BodyText"/>
-        <w:keepNext/>
-        <w:keepLines/>
-        <w:spacing w:line="240" w:lineRule="auto" w:before="0" w:after="120"/>
-        <w:ind w:firstLine="0"/>
-        <w:jc w:val="center"/>
-      </w:pPr>
-      <w:r>
-        <w:drawing>
-          <wp:inline>
-            <wp:extent cx="5334000" cy="4000500"/>
-            <wp:effectExtent b="0" l="0" r="0" t="0"/>
-            <wp:docPr descr="" title="" id="13" name="Picture"/>
-            <a:graphic>
-              <a:graphicData uri="http://schemas.openxmlformats.org/drawingml/2006/picture">
-                <pic:pic>
-                  <pic:nvPicPr>
-                    <pic:cNvPr descr="diagramas/casos_de_uso.png" id="14" name="Picture"/>
-                    <pic:cNvPicPr>
-                      <a:picLocks noChangeArrowheads="1" noChangeAspect="1"/>
-                    </pic:cNvPicPr>
-                  </pic:nvPicPr>
-                  <pic:blipFill>
-                    <a:blip r:embed="rId12"/>
-                    <a:stretch>
-                      <a:fillRect/>
-                    </a:stretch>
-                  </pic:blipFill>
-                  <pic:spPr bwMode="auto">
-                    <a:xfrm>
-                      <a:off x="0" y="0"/>
-                      <a:ext cx="5334000" cy="4000500"/>
-                    </a:xfrm>
-                    <a:prstGeom prst="rect">
-                      <a:avLst/>
-                    </a:prstGeom>
-                    <a:noFill/>
-                    <a:ln w="9525">
-                      <a:noFill/>
-                      <a:headEnd/>
-                      <a:tailEnd/>
-                    </a:ln>
-                  </pic:spPr>
-                </pic:pic>
-              </a:graphicData>
-            </a:graphic>
-          </wp:inline>
-        </w:drawing>
+        <w:pStyle w:val="FiguraEspacio"/>
+      </w:pPr>
+      <w:r>
+        <w:t xml:space="preserve">[Inserte aquí el diagrama UML generado con el código 01_casos_de_uso.puml]</w:t>
       </w:r>
     </w:p>
     <w:p>
@@ -3499,54 +4580,10 @@
     </w:p>
     <w:p>
       <w:pPr>
-        <w:pStyle w:val="BodyText"/>
-        <w:keepNext/>
-        <w:keepLines/>
-        <w:spacing w:line="240" w:lineRule="auto" w:before="0" w:after="120"/>
-        <w:ind w:firstLine="0"/>
-        <w:jc w:val="center"/>
-      </w:pPr>
-      <w:r>
-        <w:drawing>
-          <wp:inline>
-            <wp:extent cx="5334000" cy="5456152"/>
-            <wp:effectExtent b="0" l="0" r="0" t="0"/>
-            <wp:docPr descr="" title="" id="16" name="Picture"/>
-            <a:graphic>
-              <a:graphicData uri="http://schemas.openxmlformats.org/drawingml/2006/picture">
-                <pic:pic>
-                  <pic:nvPicPr>
-                    <pic:cNvPr descr="diagramas/entidad_relacion.png" id="17" name="Picture"/>
-                    <pic:cNvPicPr>
-                      <a:picLocks noChangeArrowheads="1" noChangeAspect="1"/>
-                    </pic:cNvPicPr>
-                  </pic:nvPicPr>
-                  <pic:blipFill>
-                    <a:blip r:embed="rId15"/>
-                    <a:stretch>
-                      <a:fillRect/>
-                    </a:stretch>
-                  </pic:blipFill>
-                  <pic:spPr bwMode="auto">
-                    <a:xfrm>
-                      <a:off x="0" y="0"/>
-                      <a:ext cx="5334000" cy="5456152"/>
-                    </a:xfrm>
-                    <a:prstGeom prst="rect">
-                      <a:avLst/>
-                    </a:prstGeom>
-                    <a:noFill/>
-                    <a:ln w="9525">
-                      <a:noFill/>
-                      <a:headEnd/>
-                      <a:tailEnd/>
-                    </a:ln>
-                  </pic:spPr>
-                </pic:pic>
-              </a:graphicData>
-            </a:graphic>
-          </wp:inline>
-        </w:drawing>
+        <w:pStyle w:val="FiguraEspacio"/>
+      </w:pPr>
+      <w:r>
+        <w:t xml:space="preserve">[Inserte aquí el diagrama UML generado con el código 02_entidad_relacion.puml]</w:t>
       </w:r>
     </w:p>
     <w:p>
@@ -13661,7 +14698,7 @@
         <w:rPr>
           <w:rStyle w:val="VerbatimChar"/>
         </w:rPr>
-        <w:t xml:space="preserve">Modelos/Seguridad/EncriptadorContrasena.cs</w:t>
+        <w:t xml:space="preserve">Modelos/EncriptadorContrasena.cs</w:t>
       </w:r>
       <w:r>
         <w:t xml:space="preserve"> </w:t>
@@ -13882,7 +14919,127 @@
         <w:t xml:space="preserve"> </w:t>
       </w:r>
       <w:r>
-        <w:t xml:space="preserve">cada acción de la Vista está protegida con</w:t>
+        <w:t xml:space="preserve">cada método de las clases</w:t>
+      </w:r>
+      <w:r>
+        <w:t xml:space="preserve"> </w:t>
+      </w:r>
+      <w:r>
+        <w:rPr>
+          <w:rStyle w:val="VerbatimChar"/>
+        </w:rPr>
+        <w:t xml:space="preserve">*DAL</w:t>
+      </w:r>
+      <w:r>
+        <w:t xml:space="preserve"> </w:t>
+      </w:r>
+      <w:r>
+        <w:t xml:space="preserve">captura</w:t>
+      </w:r>
+      <w:r>
+        <w:t xml:space="preserve"> </w:t>
+      </w:r>
+      <w:r>
+        <w:rPr>
+          <w:rStyle w:val="VerbatimChar"/>
+        </w:rPr>
+        <w:t xml:space="preserve">SqlException</w:t>
+      </w:r>
+      <w:r>
+        <w:t xml:space="preserve"> </w:t>
+      </w:r>
+      <w:r>
+        <w:t xml:space="preserve">y la convierte en una</w:t>
+      </w:r>
+      <w:r>
+        <w:t xml:space="preserve"> </w:t>
+      </w:r>
+      <w:r>
+        <w:rPr>
+          <w:rStyle w:val="VerbatimChar"/>
+        </w:rPr>
+        <w:t xml:space="preserve">AppException</w:t>
+      </w:r>
+      <w:r>
+        <w:t xml:space="preserve"> </w:t>
+      </w:r>
+      <w:r>
+        <w:t xml:space="preserve">con un código del</w:t>
+      </w:r>
+      <w:r>
+        <w:t xml:space="preserve"> </w:t>
+      </w:r>
+      <w:r>
+        <w:rPr>
+          <w:rStyle w:val="VerbatimChar"/>
+        </w:rPr>
+        <w:t xml:space="preserve">CatalogoErrores</w:t>
+      </w:r>
+      <w:r>
+        <w:t xml:space="preserve"> </w:t>
+      </w:r>
+      <w:r>
+        <w:t xml:space="preserve">(duplicados 2627/2601 →</w:t>
+      </w:r>
+      <w:r>
+        <w:t xml:space="preserve"> </w:t>
+      </w:r>
+      <w:r>
+        <w:rPr>
+          <w:rStyle w:val="VerbatimChar"/>
+        </w:rPr>
+        <w:t xml:space="preserve">ERR-SQL-002</w:t>
+      </w:r>
+      <w:r>
+        <w:t xml:space="preserve">, integridad referencial 547 →</w:t>
+      </w:r>
+      <w:r>
+        <w:t xml:space="preserve"> </w:t>
+      </w:r>
+      <w:r>
+        <w:rPr>
+          <w:rStyle w:val="VerbatimChar"/>
+        </w:rPr>
+        <w:t xml:space="preserve">ERR-SQL-003</w:t>
+      </w:r>
+      <w:r>
+        <w:t xml:space="preserve">, servidor inaccesible →</w:t>
+      </w:r>
+      <w:r>
+        <w:t xml:space="preserve"> </w:t>
+      </w:r>
+      <w:r>
+        <w:rPr>
+          <w:rStyle w:val="VerbatimChar"/>
+        </w:rPr>
+        <w:t xml:space="preserve">ERR-SQL-001</w:t>
+      </w:r>
+      <w:r>
+        <w:t xml:space="preserve">, BD inexistente 4060 →</w:t>
+      </w:r>
+      <w:r>
+        <w:t xml:space="preserve"> </w:t>
+      </w:r>
+      <w:r>
+        <w:rPr>
+          <w:rStyle w:val="VerbatimChar"/>
+        </w:rPr>
+        <w:t xml:space="preserve">ERR-SQL-006</w:t>
+      </w:r>
+      <w:r>
+        <w:t xml:space="preserve">); las reglas del negocio usan</w:t>
+      </w:r>
+      <w:r>
+        <w:t xml:space="preserve"> </w:t>
+      </w:r>
+      <w:r>
+        <w:rPr>
+          <w:rStyle w:val="VerbatimChar"/>
+        </w:rPr>
+        <w:t xml:space="preserve">ERR-NEG-001</w:t>
+      </w:r>
+      <w:r>
+        <w:t xml:space="preserve">. Cada acción de la Vista está protegida con</w:t>
       </w:r>
       <w:r>
         <w:t xml:space="preserve"> </w:t>
@@ -13894,7 +15051,10 @@
         <w:t xml:space="preserve">try/catch</w:t>
       </w:r>
       <w:r>
-        <w:t xml:space="preserve">.</w:t>
+        <w:t xml:space="preserve"> </w:t>
+      </w:r>
+      <w:r>
+        <w:t xml:space="preserve">y llama a</w:t>
       </w:r>
       <w:r>
         <w:t xml:space="preserve"> </w:t>
@@ -13903,34 +15063,10 @@
         <w:rPr>
           <w:rStyle w:val="VerbatimChar"/>
         </w:rPr>
-        <w:t xml:space="preserve">Mensajes.Error</w:t>
-      </w:r>
-      <w:r>
-        <w:t xml:space="preserve"> </w:t>
-      </w:r>
-      <w:r>
-        <w:t xml:space="preserve">traduce los códigos de</w:t>
-      </w:r>
-      <w:r>
-        <w:t xml:space="preserve"> </w:t>
-      </w:r>
-      <w:r>
-        <w:rPr>
-          <w:rStyle w:val="VerbatimChar"/>
-        </w:rPr>
-        <w:t xml:space="preserve">SqlException</w:t>
-      </w:r>
-      <w:r>
-        <w:t xml:space="preserve"> </w:t>
-      </w:r>
-      <w:r>
-        <w:t xml:space="preserve">(duplicados 2627/2601, integridad referencial 547, servidor inaccesible 53, BD inexistente 4060,</w:t>
-      </w:r>
-      <w:r>
-        <w:t xml:space="preserve"> </w:t>
-      </w:r>
-      <w:r>
-        <w:t xml:space="preserve">login 18456) a mensajes comprensibles en un</w:t>
+        <w:t xml:space="preserve">ManejadorUIErrores.MostrarError</w:t>
+      </w:r>
+      <w:r>
+        <w:t xml:space="preserve">, que muestra un</w:t>
       </w:r>
       <w:r>
         <w:t xml:space="preserve"> </w:t>
@@ -13942,7 +15078,10 @@
         <w:t xml:space="preserve">MessageBox</w:t>
       </w:r>
       <w:r>
-        <w:t xml:space="preserve">, y</w:t>
+        <w:t xml:space="preserve"> </w:t>
+      </w:r>
+      <w:r>
+        <w:t xml:space="preserve">con el mensaje y el código, y</w:t>
       </w:r>
       <w:r>
         <w:t xml:space="preserve"> </w:t>
@@ -13999,7 +15138,16 @@
         <w:t xml:space="preserve"> </w:t>
       </w:r>
       <w:r>
-        <w:t xml:space="preserve">captura excepciones no controladas.</w:t>
+        <w:t xml:space="preserve">(</w:t>
+      </w:r>
+      <w:r>
+        <w:rPr>
+          <w:rStyle w:val="VerbatimChar"/>
+        </w:rPr>
+        <w:t xml:space="preserve">Application.ThreadException</w:t>
+      </w:r>
+      <w:r>
+        <w:t xml:space="preserve">) captura las excepciones no controladas.</w:t>
       </w:r>
     </w:p>
     <w:p>
@@ -14142,18 +15290,18 @@
           <wp:inline>
             <wp:extent cx="5334000" cy="3619767"/>
             <wp:effectExtent b="0" l="0" r="0" t="0"/>
-            <wp:docPr descr="" title="" id="19" name="Picture"/>
+            <wp:docPr descr="" title="" id="10" name="Picture"/>
             <a:graphic>
               <a:graphicData uri="http://schemas.openxmlformats.org/drawingml/2006/picture">
                 <pic:pic>
                   <pic:nvPicPr>
-                    <pic:cNvPr descr="capturas/roles_y_permisos.png" id="20" name="Picture"/>
+                    <pic:cNvPr descr="capturas/roles_y_permisos.png" id="11" name="Picture"/>
                     <pic:cNvPicPr>
                       <a:picLocks noChangeArrowheads="1" noChangeAspect="1"/>
                     </pic:cNvPicPr>
                   </pic:nvPicPr>
                   <pic:blipFill>
-                    <a:blip r:embed="rId18"/>
+                    <a:blip r:embed="rId9"/>
                     <a:stretch>
                       <a:fillRect/>
                     </a:stretch>
@@ -14250,18 +15398,18 @@
           <wp:inline>
             <wp:extent cx="5334000" cy="1479550"/>
             <wp:effectExtent b="0" l="0" r="0" t="0"/>
-            <wp:docPr descr="" title="" id="22" name="Picture"/>
+            <wp:docPr descr="" title="" id="13" name="Picture"/>
             <a:graphic>
               <a:graphicData uri="http://schemas.openxmlformats.org/drawingml/2006/picture">
                 <pic:pic>
                   <pic:nvPicPr>
-                    <pic:cNvPr descr="capturas/mascotas_veterinario.png" id="23" name="Picture"/>
+                    <pic:cNvPr descr="capturas/mascotas_veterinario.png" id="14" name="Picture"/>
                     <pic:cNvPicPr>
                       <a:picLocks noChangeArrowheads="1" noChangeAspect="1"/>
                     </pic:cNvPicPr>
                   </pic:nvPicPr>
                   <pic:blipFill>
-                    <a:blip r:embed="rId21"/>
+                    <a:blip r:embed="rId12"/>
                     <a:stretch>
                       <a:fillRect/>
                     </a:stretch>
@@ -14564,15 +15712,15 @@
                 <w:color w:val="000000"/>
                 <w:sz w:val="18"/>
               </w:rPr>
-              <w:t xml:space="preserve">Vista</w:t>
-            </w:r>
-            <w:r>
-              <w:rPr>
-                <w:rFonts w:ascii="Arial" w:hAnsi="Arial" w:cs="Arial" w:eastAsia="Arial"/>
-                <w:color w:val="000000"/>
-                <w:sz w:val="18"/>
-              </w:rPr>
-              <w:t xml:space="preserve">; la Vista solo invoca clases de</w:t>
+              <w:t xml:space="preserve">dashboardVet</w:t>
+            </w:r>
+            <w:r>
+              <w:rPr>
+                <w:rFonts w:ascii="Arial" w:hAnsi="Arial" w:cs="Arial" w:eastAsia="Arial"/>
+                <w:color w:val="000000"/>
+                <w:sz w:val="18"/>
+              </w:rPr>
+              <w:t xml:space="preserve">; la Vista solo invoca las clases</w:t>
             </w:r>
             <w:r>
               <w:rPr>
@@ -14589,7 +15737,40 @@
                 <w:color w:val="000000"/>
                 <w:sz w:val="18"/>
               </w:rPr>
-              <w:t xml:space="preserve">Modelos.Datos</w:t>
+              <w:t xml:space="preserve">*DAL</w:t>
+            </w:r>
+            <w:r>
+              <w:rPr>
+                <w:rFonts w:ascii="Arial" w:hAnsi="Arial" w:cs="Arial" w:eastAsia="Arial"/>
+                <w:color w:val="000000"/>
+                <w:sz w:val="18"/>
+              </w:rPr>
+              <w:t xml:space="preserve"> </w:t>
+            </w:r>
+            <w:r>
+              <w:rPr>
+                <w:rFonts w:ascii="Arial" w:hAnsi="Arial" w:cs="Arial" w:eastAsia="Arial"/>
+                <w:color w:val="000000"/>
+                <w:sz w:val="18"/>
+              </w:rPr>
+              <w:t xml:space="preserve">de</w:t>
+            </w:r>
+            <w:r>
+              <w:rPr>
+                <w:rFonts w:ascii="Arial" w:hAnsi="Arial" w:cs="Arial" w:eastAsia="Arial"/>
+                <w:color w:val="000000"/>
+                <w:sz w:val="18"/>
+              </w:rPr>
+              <w:t xml:space="preserve"> </w:t>
+            </w:r>
+            <w:r>
+              <w:rPr>
+                <w:rStyle w:val="VerbatimChar"/>
+                <w:rFonts w:ascii="Arial" w:hAnsi="Arial" w:cs="Arial" w:eastAsia="Arial"/>
+                <w:color w:val="000000"/>
+                <w:sz w:val="18"/>
+              </w:rPr>
+              <w:t xml:space="preserve">Modelos</w:t>
             </w:r>
           </w:p>
         </w:tc>
@@ -14720,7 +15901,7 @@
                 <w:color w:val="000000"/>
                 <w:sz w:val="18"/>
               </w:rPr>
-              <w:t xml:space="preserve">Vista/Login/frmLogin.cs</w:t>
+              <w:t xml:space="preserve">dashboardVet/Login/LoginVet.cs</w:t>
             </w:r>
             <w:r>
               <w:rPr>
@@ -14745,7 +15926,7 @@
                 <w:color w:val="000000"/>
                 <w:sz w:val="18"/>
               </w:rPr>
-              <w:t xml:space="preserve">UsuarioDatos.Autenticar</w:t>
+              <w:t xml:space="preserve">LoginDAL.Autenticar</w:t>
             </w:r>
             <w:r>
               <w:rPr>
@@ -14836,7 +16017,7 @@
                 <w:color w:val="000000"/>
                 <w:sz w:val="18"/>
               </w:rPr>
-              <w:t xml:space="preserve">Vista/Usuarios/frmUsuarios.cs</w:t>
+              <w:t xml:space="preserve">dashboardVet/Usuarios/Usuarios.cs</w:t>
             </w:r>
             <w:r>
               <w:rPr>
@@ -15018,7 +16199,32 @@
                 <w:color w:val="000000"/>
                 <w:sz w:val="18"/>
               </w:rPr>
-              <w:t xml:space="preserve">frmRoles</w:t>
+              <w:t xml:space="preserve">dashboardVet/Roles/Roles.cs</w:t>
+            </w:r>
+            <w:r>
+              <w:rPr>
+                <w:rFonts w:ascii="Arial" w:hAnsi="Arial" w:cs="Arial" w:eastAsia="Arial"/>
+                <w:color w:val="000000"/>
+                <w:sz w:val="18"/>
+              </w:rPr>
+              <w:t xml:space="preserve">,</w:t>
+            </w:r>
+            <w:r>
+              <w:rPr>
+                <w:rFonts w:ascii="Arial" w:hAnsi="Arial" w:cs="Arial" w:eastAsia="Arial"/>
+                <w:color w:val="000000"/>
+                <w:sz w:val="18"/>
+              </w:rPr>
+              <w:t xml:space="preserve"> </w:t>
+            </w:r>
+            <w:r>
+              <w:rPr>
+                <w:rStyle w:val="VerbatimChar"/>
+                <w:rFonts w:ascii="Arial" w:hAnsi="Arial" w:cs="Arial" w:eastAsia="Arial"/>
+                <w:color w:val="000000"/>
+                <w:sz w:val="18"/>
+              </w:rPr>
+              <w:t xml:space="preserve">PermisosDAL</w:t>
             </w:r>
           </w:p>
         </w:tc>
@@ -15165,7 +16371,7 @@
                 <w:color w:val="000000"/>
                 <w:sz w:val="18"/>
               </w:rPr>
-              <w:t xml:space="preserve">(comentado, con usuarios, roles y permisos)</w:t>
+              <w:t xml:space="preserve">(con usuarios, roles y permisos)</w:t>
             </w:r>
           </w:p>
         </w:tc>
@@ -15329,6 +16535,64 @@
                 <w:color w:val="000000"/>
                 <w:sz w:val="18"/>
               </w:rPr>
+              <w:t xml:space="preserve">AppException</w:t>
+            </w:r>
+            <w:r>
+              <w:rPr>
+                <w:rFonts w:ascii="Arial" w:hAnsi="Arial" w:cs="Arial" w:eastAsia="Arial"/>
+                <w:color w:val="000000"/>
+                <w:sz w:val="18"/>
+              </w:rPr>
+              <w:t xml:space="preserve"> </w:t>
+            </w:r>
+            <w:r>
+              <w:rPr>
+                <w:rFonts w:ascii="Arial" w:hAnsi="Arial" w:cs="Arial" w:eastAsia="Arial"/>
+                <w:color w:val="000000"/>
+                <w:sz w:val="18"/>
+              </w:rPr>
+              <w:t xml:space="preserve">+</w:t>
+            </w:r>
+            <w:r>
+              <w:rPr>
+                <w:rFonts w:ascii="Arial" w:hAnsi="Arial" w:cs="Arial" w:eastAsia="Arial"/>
+                <w:color w:val="000000"/>
+                <w:sz w:val="18"/>
+              </w:rPr>
+              <w:t xml:space="preserve"> </w:t>
+            </w:r>
+            <w:r>
+              <w:rPr>
+                <w:rStyle w:val="VerbatimChar"/>
+                <w:rFonts w:ascii="Arial" w:hAnsi="Arial" w:cs="Arial" w:eastAsia="Arial"/>
+                <w:color w:val="000000"/>
+                <w:sz w:val="18"/>
+              </w:rPr>
+              <w:t xml:space="preserve">ManejadorUIErrores</w:t>
+            </w:r>
+            <w:r>
+              <w:rPr>
+                <w:rFonts w:ascii="Arial" w:hAnsi="Arial" w:cs="Arial" w:eastAsia="Arial"/>
+                <w:color w:val="000000"/>
+                <w:sz w:val="18"/>
+              </w:rPr>
+              <w:t xml:space="preserve"> </w:t>
+            </w:r>
+            <w:r>
+              <w:rPr>
+                <w:rFonts w:ascii="Arial" w:hAnsi="Arial" w:cs="Arial" w:eastAsia="Arial"/>
+                <w:color w:val="000000"/>
+                <w:sz w:val="18"/>
+              </w:rPr>
+              <w:t xml:space="preserve">(</w:t>
+            </w:r>
+            <w:r>
+              <w:rPr>
+                <w:rStyle w:val="VerbatimChar"/>
+                <w:rFonts w:ascii="Arial" w:hAnsi="Arial" w:cs="Arial" w:eastAsia="Arial"/>
+                <w:color w:val="000000"/>
+                <w:sz w:val="18"/>
+              </w:rPr>
               <w:t xml:space="preserve">MessageBox</w:t>
             </w:r>
             <w:r>
@@ -15337,15 +16601,7 @@
                 <w:color w:val="000000"/>
                 <w:sz w:val="18"/>
               </w:rPr>
-              <w:t xml:space="preserve"> </w:t>
-            </w:r>
-            <w:r>
-              <w:rPr>
-                <w:rFonts w:ascii="Arial" w:hAnsi="Arial" w:cs="Arial" w:eastAsia="Arial"/>
-                <w:color w:val="000000"/>
-                <w:sz w:val="18"/>
-              </w:rPr>
-              <w:t xml:space="preserve">+</w:t>
+              <w:t xml:space="preserve">) +</w:t>
             </w:r>
             <w:r>
               <w:rPr>
@@ -15493,7 +16749,7 @@
                 <w:color w:val="000000"/>
                 <w:sz w:val="18"/>
               </w:rPr>
-              <w:t xml:space="preserve">Conexion_DB/Conexion.cs</w:t>
+              <w:t xml:space="preserve">Modelos/Conexion.cs</w:t>
             </w:r>
             <w:r>
               <w:rPr>
@@ -15708,13 +16964,13 @@
         <w:rPr>
           <w:rStyle w:val="VerbatimChar"/>
         </w:rPr>
-        <w:t xml:space="preserve">Modelos/Conexion_DB/Conexion.cs</w:t>
+        <w:t xml:space="preserve">Modelos/Conexion.cs</w:t>
       </w:r>
       <w:r>
         <w:t xml:space="preserve"> </w:t>
       </w:r>
       <w:r>
-        <w:t xml:space="preserve">(variable</w:t>
+        <w:t xml:space="preserve">(constante</w:t>
       </w:r>
       <w:r>
         <w:t xml:space="preserve"> </w:t>
@@ -15723,7 +16979,7 @@
         <w:rPr>
           <w:rStyle w:val="VerbatimChar"/>
         </w:rPr>
-        <w:t xml:space="preserve">servidor</w:t>
+        <w:t xml:space="preserve">Servidor</w:t>
       </w:r>
       <w:r>
         <w:t xml:space="preserve">).</w:t>
@@ -15748,7 +17004,7 @@
           <w:b/>
           <w:bCs/>
         </w:rPr>
-        <w:t xml:space="preserve">Vista</w:t>
+        <w:t xml:space="preserve">dashboardVet</w:t>
       </w:r>
       <w:r>
         <w:t xml:space="preserve"> </w:t>
@@ -15856,18 +17112,18 @@
           <wp:inline>
             <wp:extent cx="4389120" cy="3068583"/>
             <wp:effectExtent b="0" l="0" r="0" t="0"/>
-            <wp:docPr descr="" title="" id="25" name="Picture"/>
+            <wp:docPr descr="" title="" id="16" name="Picture"/>
             <a:graphic>
               <a:graphicData uri="http://schemas.openxmlformats.org/drawingml/2006/picture">
                 <pic:pic>
                   <pic:nvPicPr>
-                    <pic:cNvPr descr="capturas/login.png" id="26" name="Picture"/>
+                    <pic:cNvPr descr="capturas/login.png" id="17" name="Picture"/>
                     <pic:cNvPicPr>
                       <a:picLocks noChangeArrowheads="1" noChangeAspect="1"/>
                     </pic:cNvPicPr>
                   </pic:nvPicPr>
                   <pic:blipFill>
-                    <a:blip r:embed="rId24"/>
+                    <a:blip r:embed="rId15"/>
                     <a:stretch>
                       <a:fillRect/>
                     </a:stretch>
@@ -15972,18 +17228,18 @@
           <wp:inline>
             <wp:extent cx="5334000" cy="3626821"/>
             <wp:effectExtent b="0" l="0" r="0" t="0"/>
-            <wp:docPr descr="" title="" id="28" name="Picture"/>
+            <wp:docPr descr="" title="" id="19" name="Picture"/>
             <a:graphic>
               <a:graphicData uri="http://schemas.openxmlformats.org/drawingml/2006/picture">
                 <pic:pic>
                   <pic:nvPicPr>
-                    <pic:cNvPr descr="capturas/inicio.png" id="29" name="Picture"/>
+                    <pic:cNvPr descr="capturas/inicio.png" id="20" name="Picture"/>
                     <pic:cNvPicPr>
                       <a:picLocks noChangeArrowheads="1" noChangeAspect="1"/>
                     </pic:cNvPicPr>
                   </pic:nvPicPr>
                   <pic:blipFill>
-                    <a:blip r:embed="rId27"/>
+                    <a:blip r:embed="rId18"/>
                     <a:stretch>
                       <a:fillRect/>
                     </a:stretch>
@@ -16098,18 +17354,18 @@
           <wp:inline>
             <wp:extent cx="5334000" cy="3143249"/>
             <wp:effectExtent b="0" l="0" r="0" t="0"/>
-            <wp:docPr descr="" title="" id="31" name="Picture"/>
+            <wp:docPr descr="" title="" id="22" name="Picture"/>
             <a:graphic>
               <a:graphicData uri="http://schemas.openxmlformats.org/drawingml/2006/picture">
                 <pic:pic>
                   <pic:nvPicPr>
-                    <pic:cNvPr descr="capturas/propietarios.png" id="32" name="Picture"/>
+                    <pic:cNvPr descr="capturas/propietarios.png" id="23" name="Picture"/>
                     <pic:cNvPicPr>
                       <a:picLocks noChangeArrowheads="1" noChangeAspect="1"/>
                     </pic:cNvPicPr>
                   </pic:nvPicPr>
                   <pic:blipFill>
-                    <a:blip r:embed="rId30"/>
+                    <a:blip r:embed="rId21"/>
                     <a:stretch>
                       <a:fillRect/>
                     </a:stretch>
@@ -16216,18 +17472,18 @@
           <wp:inline>
             <wp:extent cx="5334000" cy="3133724"/>
             <wp:effectExtent b="0" l="0" r="0" t="0"/>
-            <wp:docPr descr="" title="" id="34" name="Picture"/>
+            <wp:docPr descr="" title="" id="25" name="Picture"/>
             <a:graphic>
               <a:graphicData uri="http://schemas.openxmlformats.org/drawingml/2006/picture">
                 <pic:pic>
                   <pic:nvPicPr>
-                    <pic:cNvPr descr="capturas/mascotas_admin.png" id="35" name="Picture"/>
+                    <pic:cNvPr descr="capturas/mascotas_admin.png" id="26" name="Picture"/>
                     <pic:cNvPicPr>
                       <a:picLocks noChangeArrowheads="1" noChangeAspect="1"/>
                     </pic:cNvPicPr>
                   </pic:nvPicPr>
                   <pic:blipFill>
-                    <a:blip r:embed="rId33"/>
+                    <a:blip r:embed="rId24"/>
                     <a:stretch>
                       <a:fillRect/>
                     </a:stretch>
@@ -16334,18 +17590,18 @@
           <wp:inline>
             <wp:extent cx="5334000" cy="3126608"/>
             <wp:effectExtent b="0" l="0" r="0" t="0"/>
-            <wp:docPr descr="" title="" id="37" name="Picture"/>
+            <wp:docPr descr="" title="" id="28" name="Picture"/>
             <a:graphic>
               <a:graphicData uri="http://schemas.openxmlformats.org/drawingml/2006/picture">
                 <pic:pic>
                   <pic:nvPicPr>
-                    <pic:cNvPr descr="capturas/citas.png" id="38" name="Picture"/>
+                    <pic:cNvPr descr="capturas/citas.png" id="29" name="Picture"/>
                     <pic:cNvPicPr>
                       <a:picLocks noChangeArrowheads="1" noChangeAspect="1"/>
                     </pic:cNvPicPr>
                   </pic:nvPicPr>
                   <pic:blipFill>
-                    <a:blip r:embed="rId36"/>
+                    <a:blip r:embed="rId27"/>
                     <a:stretch>
                       <a:fillRect/>
                     </a:stretch>
@@ -17728,6 +18984,23 @@
       <w:b w:val="0"/>
       <w:bCs w:val="0"/>
       <w:color w:themeColor="accent1" w:themeShade="BF" w:val="365F91"/>
+    </w:rPr>
+  </w:style>
+  <w:style w:type="paragraph" w:customStyle="1" w:styleId="FiguraEspacio">
+    <w:name w:val="FiguraEspacio"/>
+    <w:basedOn w:val="BodyText"/>
+    <w:qFormat/>
+    <w:pPr>
+      <w:spacing w:line="240" w:lineRule="auto" w:before="1200" w:after="1200"/>
+      <w:ind w:firstLine="0"/>
+      <w:jc w:val="center"/>
+    </w:pPr>
+    <w:rPr>
+      <w:rFonts w:ascii="Arial" w:hAnsi="Arial" w:cs="Arial" w:eastAsia="Arial"/>
+      <w:b w:val="0"/>
+      <w:i/>
+      <w:color w:val="000000"/>
+      <w:sz w:val="22"/>
     </w:rPr>
   </w:style>
   <w:style w:type="paragraph" w:customStyle="1" w:styleId="FiguraNota">

</xml_diff>